<commit_message>
Documentazione su ristrutturazione e modello relazionale
</commit_message>
<xml_diff>
--- a/documentazione progetto.docx
+++ b/documentazione progetto.docx
@@ -581,9 +581,6 @@
             <w:r>
               <w:t>Cliente</w:t>
             </w:r>
-            <w:r>
-              <w:t>, prodotto</w:t>
-            </w:r>
           </w:p>
         </w:tc>
       </w:tr>
@@ -901,7 +898,6 @@
                 <w:szCs w:val="28"/>
               </w:rPr>
             </w:pPr>
-            <w:proofErr w:type="spellStart"/>
             <w:r>
               <w:rPr>
                 <w:sz w:val="28"/>
@@ -909,7 +905,6 @@
               </w:rPr>
               <w:t>Entita</w:t>
             </w:r>
-            <w:proofErr w:type="spellEnd"/>
           </w:p>
         </w:tc>
         <w:tc>
@@ -1269,27 +1264,7 @@
           <w:szCs w:val="36"/>
         </w:rPr>
         <w:lastRenderedPageBreak/>
-        <w:t>Dizionario dei dati(</w:t>
-      </w:r>
-      <w:proofErr w:type="spellStart"/>
-      <w:r>
-        <w:rPr>
-          <w:b/>
-          <w:bCs/>
-          <w:sz w:val="36"/>
-          <w:szCs w:val="36"/>
-        </w:rPr>
-        <w:t>relationship</w:t>
-      </w:r>
-      <w:proofErr w:type="spellEnd"/>
-      <w:r>
-        <w:rPr>
-          <w:b/>
-          <w:bCs/>
-          <w:sz w:val="36"/>
-          <w:szCs w:val="36"/>
-        </w:rPr>
-        <w:t>)</w:t>
+        <w:t>Dizionario dei dati(relationship)</w:t>
       </w:r>
     </w:p>
     <w:tbl>
@@ -1642,15 +1617,7 @@
               </w:tabs>
             </w:pPr>
             <w:r>
-              <w:t xml:space="preserve">Un ordine può contenere </w:t>
-            </w:r>
-            <w:proofErr w:type="spellStart"/>
-            <w:r>
-              <w:t>piu</w:t>
-            </w:r>
-            <w:proofErr w:type="spellEnd"/>
-            <w:r>
-              <w:t xml:space="preserve"> prodotti</w:t>
+              <w:t>Un ordine può contenere piu prodotti</w:t>
             </w:r>
           </w:p>
         </w:tc>
@@ -1745,6 +1712,95 @@
         </w:tc>
       </w:tr>
     </w:tbl>
+    <w:p>
+      <w:pPr>
+        <w:tabs>
+          <w:tab w:val="left" w:pos="1404"/>
+        </w:tabs>
+      </w:pPr>
+    </w:p>
+    <w:p>
+      <w:pPr>
+        <w:tabs>
+          <w:tab w:val="left" w:pos="1404"/>
+        </w:tabs>
+        <w:rPr>
+          <w:b/>
+          <w:bCs/>
+          <w:sz w:val="32"/>
+          <w:szCs w:val="32"/>
+        </w:rPr>
+      </w:pPr>
+      <w:r>
+        <w:rPr>
+          <w:b/>
+          <w:bCs/>
+          <w:sz w:val="32"/>
+          <w:szCs w:val="32"/>
+        </w:rPr>
+        <w:t>Diagramma Entità-Relazione non ristrutturato</w:t>
+      </w:r>
+    </w:p>
+    <w:p>
+      <w:pPr>
+        <w:tabs>
+          <w:tab w:val="left" w:pos="1404"/>
+        </w:tabs>
+      </w:pPr>
+    </w:p>
+    <w:p>
+      <w:pPr>
+        <w:tabs>
+          <w:tab w:val="left" w:pos="1404"/>
+        </w:tabs>
+      </w:pPr>
+      <w:r>
+        <w:rPr>
+          <w:noProof/>
+        </w:rPr>
+        <w:drawing>
+          <wp:inline distT="0" distB="0" distL="0" distR="0" wp14:anchorId="1CDD3EF5" wp14:editId="584E2C05">
+            <wp:extent cx="6120130" cy="4883785"/>
+            <wp:effectExtent l="0" t="0" r="0" b="0"/>
+            <wp:docPr id="1461173429" name="Immagine 1" descr="Immagine che contiene diagramma, disegno, schizzo, Disegno tecnico"/>
+            <wp:cNvGraphicFramePr>
+              <a:graphicFrameLocks xmlns:a="http://schemas.openxmlformats.org/drawingml/2006/main" noChangeAspect="1"/>
+            </wp:cNvGraphicFramePr>
+            <a:graphic xmlns:a="http://schemas.openxmlformats.org/drawingml/2006/main">
+              <a:graphicData uri="http://schemas.openxmlformats.org/drawingml/2006/picture">
+                <pic:pic xmlns:pic="http://schemas.openxmlformats.org/drawingml/2006/picture">
+                  <pic:nvPicPr>
+                    <pic:cNvPr id="1461173429" name="Immagine 1" descr="Immagine che contiene diagramma, disegno, schizzo, Disegno tecnico"/>
+                    <pic:cNvPicPr/>
+                  </pic:nvPicPr>
+                  <pic:blipFill>
+                    <a:blip r:embed="rId4">
+                      <a:extLst>
+                        <a:ext uri="{28A0092B-C50C-407E-A947-70E740481C1C}">
+                          <a14:useLocalDpi xmlns:a14="http://schemas.microsoft.com/office/drawing/2010/main" val="0"/>
+                        </a:ext>
+                      </a:extLst>
+                    </a:blip>
+                    <a:stretch>
+                      <a:fillRect/>
+                    </a:stretch>
+                  </pic:blipFill>
+                  <pic:spPr>
+                    <a:xfrm>
+                      <a:off x="0" y="0"/>
+                      <a:ext cx="6120130" cy="4883785"/>
+                    </a:xfrm>
+                    <a:prstGeom prst="rect">
+                      <a:avLst/>
+                    </a:prstGeom>
+                  </pic:spPr>
+                </pic:pic>
+              </a:graphicData>
+            </a:graphic>
+          </wp:inline>
+        </w:drawing>
+      </w:r>
+    </w:p>
     <w:p>
       <w:pPr>
         <w:tabs>
@@ -1778,7 +1834,8 @@
           <w:sz w:val="36"/>
           <w:szCs w:val="36"/>
         </w:rPr>
-        <w:t>Operazioni</w:t>
+        <w:lastRenderedPageBreak/>
+        <w:t>Ristrutturazione del Diagramma E-R</w:t>
       </w:r>
     </w:p>
     <w:p>
@@ -1787,8 +1844,2789 @@
           <w:tab w:val="left" w:pos="1404"/>
         </w:tabs>
         <w:rPr>
+          <w:sz w:val="24"/>
+          <w:szCs w:val="24"/>
+        </w:rPr>
+      </w:pPr>
+      <w:r>
+        <w:rPr>
+          <w:sz w:val="24"/>
+          <w:szCs w:val="24"/>
+        </w:rPr>
+        <w:t>Di seguito sono illustrati tutti i cambiamenti effettuati al diagramma E-R per renderlo idoneo:</w:t>
+      </w:r>
+    </w:p>
+    <w:p>
+      <w:pPr>
+        <w:tabs>
+          <w:tab w:val="left" w:pos="1404"/>
+        </w:tabs>
+        <w:rPr>
+          <w:sz w:val="24"/>
+          <w:szCs w:val="24"/>
+        </w:rPr>
+      </w:pPr>
+      <w:r>
+        <w:rPr>
+          <w:sz w:val="24"/>
+          <w:szCs w:val="24"/>
+        </w:rPr>
+        <w:t>Analisi delle ridondanze:</w:t>
+      </w:r>
+    </w:p>
+    <w:p>
+      <w:pPr>
+        <w:tabs>
+          <w:tab w:val="left" w:pos="1404"/>
+        </w:tabs>
+        <w:rPr>
+          <w:sz w:val="24"/>
+          <w:szCs w:val="24"/>
+        </w:rPr>
+      </w:pPr>
+      <w:r>
+        <w:rPr>
+          <w:sz w:val="24"/>
+          <w:szCs w:val="24"/>
+        </w:rPr>
+        <w:t>-Rimosso attributo data_fine da Abbonamento perché derivabile da data_inizio e durata</w:t>
+      </w:r>
+    </w:p>
+    <w:p>
+      <w:pPr>
+        <w:tabs>
+          <w:tab w:val="left" w:pos="1404"/>
+        </w:tabs>
+        <w:rPr>
+          <w:sz w:val="24"/>
+          <w:szCs w:val="24"/>
+        </w:rPr>
+      </w:pPr>
+      <w:r>
+        <w:rPr>
+          <w:sz w:val="24"/>
+          <w:szCs w:val="24"/>
+        </w:rPr>
+        <w:t>-rimozione attributo multivalore  e-mail, sostituito da relazione possedere e entità casella postale</w:t>
+      </w:r>
+    </w:p>
+    <w:p>
+      <w:pPr>
+        <w:tabs>
+          <w:tab w:val="left" w:pos="1404"/>
+        </w:tabs>
+        <w:rPr>
+          <w:sz w:val="24"/>
+          <w:szCs w:val="24"/>
+        </w:rPr>
+      </w:pPr>
+      <w:r>
+        <w:rPr>
+          <w:sz w:val="24"/>
+          <w:szCs w:val="24"/>
+        </w:rPr>
+        <w:t>-Scomposizione attributo composto indirizzo su cliente</w:t>
+      </w:r>
+    </w:p>
+    <w:p>
+      <w:pPr>
+        <w:tabs>
+          <w:tab w:val="left" w:pos="1404"/>
+        </w:tabs>
+        <w:rPr>
+          <w:sz w:val="24"/>
+          <w:szCs w:val="24"/>
+        </w:rPr>
+      </w:pPr>
+      <w:r>
+        <w:rPr>
+          <w:sz w:val="24"/>
+          <w:szCs w:val="24"/>
+        </w:rPr>
+        <w:t>Eliminazione delle generalizzazioni:</w:t>
+      </w:r>
+    </w:p>
+    <w:p>
+      <w:pPr>
+        <w:tabs>
+          <w:tab w:val="left" w:pos="1404"/>
+        </w:tabs>
+        <w:rPr>
+          <w:sz w:val="24"/>
+          <w:szCs w:val="24"/>
+        </w:rPr>
+      </w:pPr>
+      <w:r>
+        <w:rPr>
+          <w:sz w:val="24"/>
+          <w:szCs w:val="24"/>
+        </w:rPr>
+        <w:t>-Accorpamento dell’entità padre nelle entità figlie, tutti gli attributi di prodotto sono stati spostati su videogiochi e merchandise, e le relazioni contenere e valutare sono state duplicate e modificate per tenere conto delle nuove entità.</w:t>
+      </w:r>
+    </w:p>
+    <w:p>
+      <w:pPr>
+        <w:tabs>
+          <w:tab w:val="left" w:pos="1404"/>
+        </w:tabs>
+        <w:rPr>
+          <w:sz w:val="24"/>
+          <w:szCs w:val="24"/>
+        </w:rPr>
+      </w:pPr>
+    </w:p>
+    <w:p>
+      <w:pPr>
+        <w:rPr>
+          <w:b/>
+          <w:bCs/>
+          <w:sz w:val="40"/>
+          <w:szCs w:val="40"/>
+        </w:rPr>
+      </w:pPr>
+      <w:r>
+        <w:rPr>
+          <w:b/>
+          <w:bCs/>
+          <w:sz w:val="40"/>
+          <w:szCs w:val="40"/>
+        </w:rPr>
+        <w:t>Glossario dei termini</w:t>
+      </w:r>
+      <w:r>
+        <w:rPr>
+          <w:b/>
+          <w:bCs/>
+          <w:sz w:val="40"/>
+          <w:szCs w:val="40"/>
+        </w:rPr>
+        <w:t xml:space="preserve"> Ristrutturato</w:t>
+      </w:r>
+    </w:p>
+    <w:tbl>
+      <w:tblPr>
+        <w:tblStyle w:val="Grigliatabella"/>
+        <w:tblW w:w="9209" w:type="dxa"/>
+        <w:tblLook w:val="04A0" w:firstRow="1" w:lastRow="0" w:firstColumn="1" w:lastColumn="0" w:noHBand="0" w:noVBand="1"/>
+      </w:tblPr>
+      <w:tblGrid>
+        <w:gridCol w:w="2438"/>
+        <w:gridCol w:w="2449"/>
+        <w:gridCol w:w="2445"/>
+        <w:gridCol w:w="1877"/>
+      </w:tblGrid>
+      <w:tr>
+        <w:trPr>
+          <w:trHeight w:val="325"/>
+        </w:trPr>
+        <w:tc>
+          <w:tcPr>
+            <w:tcW w:w="2438" w:type="dxa"/>
+            <w:shd w:val="clear" w:color="auto" w:fill="00B0F0"/>
+          </w:tcPr>
+          <w:p>
+            <w:pPr>
+              <w:rPr>
+                <w:sz w:val="28"/>
+                <w:szCs w:val="28"/>
+              </w:rPr>
+            </w:pPr>
+            <w:r>
+              <w:rPr>
+                <w:sz w:val="28"/>
+                <w:szCs w:val="28"/>
+              </w:rPr>
+              <w:t>Termine</w:t>
+            </w:r>
+          </w:p>
+        </w:tc>
+        <w:tc>
+          <w:tcPr>
+            <w:tcW w:w="2449" w:type="dxa"/>
+            <w:shd w:val="clear" w:color="auto" w:fill="00B0F0"/>
+          </w:tcPr>
+          <w:p>
+            <w:pPr>
+              <w:rPr>
+                <w:sz w:val="28"/>
+                <w:szCs w:val="28"/>
+              </w:rPr>
+            </w:pPr>
+            <w:r>
+              <w:rPr>
+                <w:sz w:val="28"/>
+                <w:szCs w:val="28"/>
+              </w:rPr>
+              <w:t>Descrizione</w:t>
+            </w:r>
+          </w:p>
+        </w:tc>
+        <w:tc>
+          <w:tcPr>
+            <w:tcW w:w="2445" w:type="dxa"/>
+            <w:shd w:val="clear" w:color="auto" w:fill="00B0F0"/>
+          </w:tcPr>
+          <w:p>
+            <w:pPr>
+              <w:rPr>
+                <w:sz w:val="28"/>
+                <w:szCs w:val="28"/>
+              </w:rPr>
+            </w:pPr>
+            <w:r>
+              <w:rPr>
+                <w:sz w:val="28"/>
+                <w:szCs w:val="28"/>
+              </w:rPr>
+              <w:t>Sinonimi</w:t>
+            </w:r>
+          </w:p>
+        </w:tc>
+        <w:tc>
+          <w:tcPr>
+            <w:tcW w:w="1877" w:type="dxa"/>
+            <w:shd w:val="clear" w:color="auto" w:fill="00B0F0"/>
+          </w:tcPr>
+          <w:p>
+            <w:pPr>
+              <w:rPr>
+                <w:sz w:val="28"/>
+                <w:szCs w:val="28"/>
+              </w:rPr>
+            </w:pPr>
+            <w:r>
+              <w:rPr>
+                <w:sz w:val="28"/>
+                <w:szCs w:val="28"/>
+              </w:rPr>
+              <w:t>Collegamenti</w:t>
+            </w:r>
+          </w:p>
+        </w:tc>
+      </w:tr>
+      <w:tr>
+        <w:trPr>
+          <w:trHeight w:val="523"/>
+        </w:trPr>
+        <w:tc>
+          <w:tcPr>
+            <w:tcW w:w="2438" w:type="dxa"/>
+          </w:tcPr>
+          <w:p>
+            <w:pPr>
+              <w:rPr>
+                <w:sz w:val="28"/>
+                <w:szCs w:val="28"/>
+              </w:rPr>
+            </w:pPr>
+            <w:r>
+              <w:t>Cliente</w:t>
+            </w:r>
+          </w:p>
+        </w:tc>
+        <w:tc>
+          <w:tcPr>
+            <w:tcW w:w="2449" w:type="dxa"/>
+          </w:tcPr>
+          <w:p>
+            <w:pPr>
+              <w:rPr>
+                <w:sz w:val="28"/>
+                <w:szCs w:val="28"/>
+              </w:rPr>
+            </w:pPr>
+            <w:r>
+              <w:t>Persona che utilizza la piattaforma</w:t>
+            </w:r>
+            <w:r>
+              <w:t>.</w:t>
+            </w:r>
+          </w:p>
+        </w:tc>
+        <w:tc>
+          <w:tcPr>
+            <w:tcW w:w="2445" w:type="dxa"/>
+          </w:tcPr>
+          <w:p/>
+        </w:tc>
+        <w:tc>
+          <w:tcPr>
+            <w:tcW w:w="1877" w:type="dxa"/>
+          </w:tcPr>
+          <w:p>
+            <w:r>
+              <w:t>Abbonamento</w:t>
+            </w:r>
+            <w:r>
+              <w:t>, recensione,</w:t>
+            </w:r>
+          </w:p>
+          <w:p>
+            <w:r>
+              <w:t>ordine</w:t>
+            </w:r>
+          </w:p>
+        </w:tc>
+      </w:tr>
+      <w:tr>
+        <w:trPr>
+          <w:trHeight w:val="1038"/>
+        </w:trPr>
+        <w:tc>
+          <w:tcPr>
+            <w:tcW w:w="2438" w:type="dxa"/>
+          </w:tcPr>
+          <w:p>
+            <w:r>
+              <w:t>Recensione</w:t>
+            </w:r>
+          </w:p>
+        </w:tc>
+        <w:tc>
+          <w:tcPr>
+            <w:tcW w:w="2449" w:type="dxa"/>
+          </w:tcPr>
+          <w:p>
+            <w:r>
+              <w:t>Descrizione critica di un prodotto usata per assegnargli una valutazione</w:t>
+            </w:r>
+          </w:p>
+        </w:tc>
+        <w:tc>
+          <w:tcPr>
+            <w:tcW w:w="2445" w:type="dxa"/>
+          </w:tcPr>
+          <w:p>
+            <w:r>
+              <w:t>feedback</w:t>
+            </w:r>
+          </w:p>
+        </w:tc>
+        <w:tc>
+          <w:tcPr>
+            <w:tcW w:w="1877" w:type="dxa"/>
+          </w:tcPr>
+          <w:p>
+            <w:pPr>
+              <w:rPr>
+                <w:sz w:val="28"/>
+                <w:szCs w:val="28"/>
+              </w:rPr>
+            </w:pPr>
+            <w:r>
+              <w:t>Cliente</w:t>
+            </w:r>
+          </w:p>
+        </w:tc>
+      </w:tr>
+      <w:tr>
+        <w:trPr>
+          <w:trHeight w:val="728"/>
+        </w:trPr>
+        <w:tc>
+          <w:tcPr>
+            <w:tcW w:w="2438" w:type="dxa"/>
+          </w:tcPr>
+          <w:p>
+            <w:r>
+              <w:t>Videogioco</w:t>
+            </w:r>
+          </w:p>
+        </w:tc>
+        <w:tc>
+          <w:tcPr>
+            <w:tcW w:w="2449" w:type="dxa"/>
+          </w:tcPr>
+          <w:p>
+            <w:r>
+              <w:t>Prodotto di tipo videoludico</w:t>
+            </w:r>
+          </w:p>
+        </w:tc>
+        <w:tc>
+          <w:tcPr>
+            <w:tcW w:w="2445" w:type="dxa"/>
+          </w:tcPr>
+          <w:p/>
+        </w:tc>
+        <w:tc>
+          <w:tcPr>
+            <w:tcW w:w="1877" w:type="dxa"/>
+          </w:tcPr>
+          <w:p>
+            <w:r>
+              <w:t>Ordine, Recensione</w:t>
+            </w:r>
+          </w:p>
+        </w:tc>
+      </w:tr>
+      <w:tr>
+        <w:trPr>
+          <w:trHeight w:val="512"/>
+        </w:trPr>
+        <w:tc>
+          <w:tcPr>
+            <w:tcW w:w="2438" w:type="dxa"/>
+          </w:tcPr>
+          <w:p>
+            <w:r>
+              <w:t>Ordine</w:t>
+            </w:r>
+          </w:p>
+        </w:tc>
+        <w:tc>
+          <w:tcPr>
+            <w:tcW w:w="2449" w:type="dxa"/>
+          </w:tcPr>
+          <w:p>
+            <w:r>
+              <w:t>Acquisto di uno o più prodotti da un cliente</w:t>
+            </w:r>
+          </w:p>
+        </w:tc>
+        <w:tc>
+          <w:tcPr>
+            <w:tcW w:w="2445" w:type="dxa"/>
+          </w:tcPr>
+          <w:p>
+            <w:r>
+              <w:t>Acquisto</w:t>
+            </w:r>
+          </w:p>
+        </w:tc>
+        <w:tc>
+          <w:tcPr>
+            <w:tcW w:w="1877" w:type="dxa"/>
+          </w:tcPr>
+          <w:p>
+            <w:r>
+              <w:t>Cliente, prodotto</w:t>
+            </w:r>
+          </w:p>
+        </w:tc>
+      </w:tr>
+      <w:tr>
+        <w:trPr>
+          <w:trHeight w:val="1049"/>
+        </w:trPr>
+        <w:tc>
+          <w:tcPr>
+            <w:tcW w:w="2438" w:type="dxa"/>
+          </w:tcPr>
+          <w:p>
+            <w:r>
+              <w:t>Abbonamenti</w:t>
+            </w:r>
+          </w:p>
+        </w:tc>
+        <w:tc>
+          <w:tcPr>
+            <w:tcW w:w="2449" w:type="dxa"/>
+          </w:tcPr>
+          <w:p>
+            <w:r>
+              <w:t>Servizio a pagamento per agevolare la compravendita sulla piattaforma</w:t>
+            </w:r>
+          </w:p>
+        </w:tc>
+        <w:tc>
+          <w:tcPr>
+            <w:tcW w:w="2445" w:type="dxa"/>
+          </w:tcPr>
+          <w:p>
+            <w:r>
+              <w:t>Servizio, sottoscrizione, iscrizione</w:t>
+            </w:r>
+          </w:p>
+        </w:tc>
+        <w:tc>
+          <w:tcPr>
+            <w:tcW w:w="1877" w:type="dxa"/>
+          </w:tcPr>
+          <w:p>
+            <w:r>
+              <w:t>cliente</w:t>
+            </w:r>
+          </w:p>
+        </w:tc>
+      </w:tr>
+      <w:tr>
+        <w:trPr>
+          <w:trHeight w:val="325"/>
+        </w:trPr>
+        <w:tc>
+          <w:tcPr>
+            <w:tcW w:w="2438" w:type="dxa"/>
+          </w:tcPr>
+          <w:p>
+            <w:r>
+              <w:t>Genere</w:t>
+            </w:r>
+          </w:p>
+        </w:tc>
+        <w:tc>
+          <w:tcPr>
+            <w:tcW w:w="2449" w:type="dxa"/>
+          </w:tcPr>
+          <w:p>
+            <w:r>
+              <w:t>Descrizione per differenziare tra stili diversi</w:t>
+            </w:r>
+          </w:p>
+        </w:tc>
+        <w:tc>
+          <w:tcPr>
+            <w:tcW w:w="2445" w:type="dxa"/>
+          </w:tcPr>
+          <w:p>
+            <w:r>
+              <w:t>stile</w:t>
+            </w:r>
+          </w:p>
+        </w:tc>
+        <w:tc>
+          <w:tcPr>
+            <w:tcW w:w="1877" w:type="dxa"/>
+          </w:tcPr>
+          <w:p>
+            <w:r>
+              <w:t>videogioco</w:t>
+            </w:r>
+          </w:p>
+        </w:tc>
+      </w:tr>
+      <w:tr>
+        <w:trPr>
+          <w:trHeight w:val="325"/>
+        </w:trPr>
+        <w:tc>
+          <w:tcPr>
+            <w:tcW w:w="2438" w:type="dxa"/>
+          </w:tcPr>
+          <w:p>
+            <w:r>
+              <w:t>Casella postale</w:t>
+            </w:r>
+          </w:p>
+        </w:tc>
+        <w:tc>
+          <w:tcPr>
+            <w:tcW w:w="2449" w:type="dxa"/>
+          </w:tcPr>
+          <w:p>
+            <w:r>
+              <w:t>Recapiti e</w:t>
+            </w:r>
+            <w:r>
+              <w:t>-</w:t>
+            </w:r>
+            <w:r>
+              <w:t>mail del cliente</w:t>
+            </w:r>
+          </w:p>
+        </w:tc>
+        <w:tc>
+          <w:tcPr>
+            <w:tcW w:w="2445" w:type="dxa"/>
+          </w:tcPr>
+          <w:p/>
+        </w:tc>
+        <w:tc>
+          <w:tcPr>
+            <w:tcW w:w="1877" w:type="dxa"/>
+          </w:tcPr>
+          <w:p>
+            <w:r>
+              <w:t>cliente</w:t>
+            </w:r>
+          </w:p>
+        </w:tc>
+      </w:tr>
+      <w:tr>
+        <w:trPr>
+          <w:trHeight w:val="325"/>
+        </w:trPr>
+        <w:tc>
+          <w:tcPr>
+            <w:tcW w:w="2438" w:type="dxa"/>
+          </w:tcPr>
+          <w:p>
+            <w:r>
+              <w:t>Merchandise</w:t>
+            </w:r>
+          </w:p>
+        </w:tc>
+        <w:tc>
+          <w:tcPr>
+            <w:tcW w:w="2449" w:type="dxa"/>
+          </w:tcPr>
+          <w:p>
+            <w:r>
+              <w:t>Prodotto di tipo gadgettistica</w:t>
+            </w:r>
+          </w:p>
+        </w:tc>
+        <w:tc>
+          <w:tcPr>
+            <w:tcW w:w="2445" w:type="dxa"/>
+          </w:tcPr>
+          <w:p/>
+        </w:tc>
+        <w:tc>
+          <w:tcPr>
+            <w:tcW w:w="1877" w:type="dxa"/>
+          </w:tcPr>
+          <w:p>
+            <w:r>
+              <w:t>Ordine, Recensione</w:t>
+            </w:r>
+          </w:p>
+        </w:tc>
+      </w:tr>
+    </w:tbl>
+    <w:p>
+      <w:pPr>
+        <w:rPr>
+          <w:sz w:val="28"/>
+          <w:szCs w:val="28"/>
+        </w:rPr>
+      </w:pPr>
+    </w:p>
+    <w:p>
+      <w:pPr>
+        <w:rPr>
+          <w:sz w:val="28"/>
+          <w:szCs w:val="28"/>
+        </w:rPr>
+      </w:pPr>
+    </w:p>
+    <w:p>
+      <w:pPr>
+        <w:rPr>
+          <w:sz w:val="28"/>
+          <w:szCs w:val="28"/>
+        </w:rPr>
+      </w:pPr>
+    </w:p>
+    <w:p>
+      <w:pPr>
+        <w:rPr>
+          <w:b/>
+          <w:bCs/>
+          <w:sz w:val="36"/>
+          <w:szCs w:val="36"/>
+        </w:rPr>
+      </w:pPr>
+      <w:r>
+        <w:rPr>
+          <w:b/>
+          <w:bCs/>
+          <w:sz w:val="36"/>
+          <w:szCs w:val="36"/>
+        </w:rPr>
+        <w:lastRenderedPageBreak/>
+        <w:t>Dizionario dei dati(entità)</w:t>
+      </w:r>
+      <w:r>
+        <w:rPr>
+          <w:b/>
+          <w:bCs/>
+          <w:sz w:val="36"/>
+          <w:szCs w:val="36"/>
+        </w:rPr>
+        <w:t xml:space="preserve"> Ristrutturato</w:t>
+      </w:r>
+    </w:p>
+    <w:tbl>
+      <w:tblPr>
+        <w:tblStyle w:val="Grigliatabella"/>
+        <w:tblW w:w="0" w:type="auto"/>
+        <w:tblLook w:val="04A0" w:firstRow="1" w:lastRow="0" w:firstColumn="1" w:lastColumn="0" w:noHBand="0" w:noVBand="1"/>
+      </w:tblPr>
+      <w:tblGrid>
+        <w:gridCol w:w="3209"/>
+        <w:gridCol w:w="3209"/>
+        <w:gridCol w:w="3210"/>
+      </w:tblGrid>
+      <w:tr>
+        <w:tc>
+          <w:tcPr>
+            <w:tcW w:w="3209" w:type="dxa"/>
+            <w:shd w:val="clear" w:color="auto" w:fill="00B0F0"/>
+          </w:tcPr>
+          <w:p>
+            <w:pPr>
+              <w:rPr>
+                <w:sz w:val="28"/>
+                <w:szCs w:val="28"/>
+              </w:rPr>
+            </w:pPr>
+            <w:r>
+              <w:rPr>
+                <w:sz w:val="28"/>
+                <w:szCs w:val="28"/>
+              </w:rPr>
+              <w:t>Entita</w:t>
+            </w:r>
+          </w:p>
+        </w:tc>
+        <w:tc>
+          <w:tcPr>
+            <w:tcW w:w="3209" w:type="dxa"/>
+            <w:shd w:val="clear" w:color="auto" w:fill="00B0F0"/>
+          </w:tcPr>
+          <w:p>
+            <w:pPr>
+              <w:rPr>
+                <w:sz w:val="28"/>
+                <w:szCs w:val="28"/>
+              </w:rPr>
+            </w:pPr>
+            <w:r>
+              <w:rPr>
+                <w:sz w:val="28"/>
+                <w:szCs w:val="28"/>
+              </w:rPr>
+              <w:t>Attributi</w:t>
+            </w:r>
+          </w:p>
+        </w:tc>
+        <w:tc>
+          <w:tcPr>
+            <w:tcW w:w="3210" w:type="dxa"/>
+            <w:shd w:val="clear" w:color="auto" w:fill="00B0F0"/>
+          </w:tcPr>
+          <w:p>
+            <w:pPr>
+              <w:rPr>
+                <w:sz w:val="28"/>
+                <w:szCs w:val="28"/>
+              </w:rPr>
+            </w:pPr>
+            <w:r>
+              <w:rPr>
+                <w:sz w:val="28"/>
+                <w:szCs w:val="28"/>
+              </w:rPr>
+              <w:t>Identificatore</w:t>
+            </w:r>
+          </w:p>
+        </w:tc>
+      </w:tr>
+      <w:tr>
+        <w:tc>
+          <w:tcPr>
+            <w:tcW w:w="3209" w:type="dxa"/>
+          </w:tcPr>
+          <w:p>
+            <w:r>
+              <w:t>Cliente</w:t>
+            </w:r>
+          </w:p>
+        </w:tc>
+        <w:tc>
+          <w:tcPr>
+            <w:tcW w:w="3209" w:type="dxa"/>
+          </w:tcPr>
+          <w:p>
+            <w:r>
+              <w:t>Codice fiscale, nome, cognome, e-mail, data di nascita, telefono,</w:t>
+            </w:r>
+            <w:r>
+              <w:t xml:space="preserve"> </w:t>
+            </w:r>
+            <w:r>
+              <w:t>via, civico, Cap, città, stato</w:t>
+            </w:r>
+          </w:p>
+        </w:tc>
+        <w:tc>
+          <w:tcPr>
+            <w:tcW w:w="3210" w:type="dxa"/>
+          </w:tcPr>
+          <w:p>
+            <w:r>
+              <w:t>Codice fiscale</w:t>
+            </w:r>
+          </w:p>
+        </w:tc>
+      </w:tr>
+      <w:tr>
+        <w:tc>
+          <w:tcPr>
+            <w:tcW w:w="3209" w:type="dxa"/>
+          </w:tcPr>
+          <w:p>
+            <w:r>
+              <w:t>Casella postale</w:t>
+            </w:r>
+          </w:p>
+        </w:tc>
+        <w:tc>
+          <w:tcPr>
+            <w:tcW w:w="3209" w:type="dxa"/>
+          </w:tcPr>
+          <w:p>
+            <w:r>
+              <w:t>E-mail</w:t>
+            </w:r>
+          </w:p>
+        </w:tc>
+        <w:tc>
+          <w:tcPr>
+            <w:tcW w:w="3210" w:type="dxa"/>
+          </w:tcPr>
+          <w:p>
+            <w:r>
+              <w:t>E-mail</w:t>
+            </w:r>
+          </w:p>
+        </w:tc>
+      </w:tr>
+      <w:tr>
+        <w:tc>
+          <w:tcPr>
+            <w:tcW w:w="3209" w:type="dxa"/>
+          </w:tcPr>
+          <w:p>
+            <w:r>
+              <w:t>Videogioco</w:t>
+            </w:r>
+          </w:p>
+        </w:tc>
+        <w:tc>
+          <w:tcPr>
+            <w:tcW w:w="3209" w:type="dxa"/>
+          </w:tcPr>
+          <w:p>
+            <w:r>
+              <w:t>Studio, data uscita, piattaforme, PEGI</w:t>
+            </w:r>
+            <w:r>
+              <w:t>, nome, prezzo, ID_Prodotto</w:t>
+            </w:r>
+          </w:p>
+        </w:tc>
+        <w:tc>
+          <w:tcPr>
+            <w:tcW w:w="3210" w:type="dxa"/>
+          </w:tcPr>
+          <w:p>
+            <w:r>
+              <w:t>ID prodotto</w:t>
+            </w:r>
+          </w:p>
+        </w:tc>
+      </w:tr>
+      <w:tr>
+        <w:tc>
+          <w:tcPr>
+            <w:tcW w:w="3209" w:type="dxa"/>
+          </w:tcPr>
+          <w:p>
+            <w:r>
+              <w:t>Merchandise</w:t>
+            </w:r>
+          </w:p>
+        </w:tc>
+        <w:tc>
+          <w:tcPr>
+            <w:tcW w:w="3209" w:type="dxa"/>
+          </w:tcPr>
+          <w:p>
+            <w:r>
+              <w:t>Tipo, peso, dimensione</w:t>
+            </w:r>
+            <w:r>
+              <w:t>, nome, prezzo, ID_Prodotto</w:t>
+            </w:r>
+          </w:p>
+        </w:tc>
+        <w:tc>
+          <w:tcPr>
+            <w:tcW w:w="3210" w:type="dxa"/>
+          </w:tcPr>
+          <w:p>
+            <w:r>
+              <w:t>ID prodotto</w:t>
+            </w:r>
+          </w:p>
+        </w:tc>
+      </w:tr>
+      <w:tr>
+        <w:tc>
+          <w:tcPr>
+            <w:tcW w:w="3209" w:type="dxa"/>
+          </w:tcPr>
+          <w:p>
+            <w:r>
+              <w:t>Recensione</w:t>
+            </w:r>
+          </w:p>
+        </w:tc>
+        <w:tc>
+          <w:tcPr>
+            <w:tcW w:w="3209" w:type="dxa"/>
+          </w:tcPr>
+          <w:p>
+            <w:r>
+              <w:t>Voto, descrizione, ID recensione</w:t>
+            </w:r>
+          </w:p>
+        </w:tc>
+        <w:tc>
+          <w:tcPr>
+            <w:tcW w:w="3210" w:type="dxa"/>
+          </w:tcPr>
+          <w:p>
+            <w:r>
+              <w:t>ID recensione</w:t>
+            </w:r>
+          </w:p>
+        </w:tc>
+      </w:tr>
+      <w:tr>
+        <w:tc>
+          <w:tcPr>
+            <w:tcW w:w="3209" w:type="dxa"/>
+          </w:tcPr>
+          <w:p>
+            <w:r>
+              <w:t>Ordine</w:t>
+            </w:r>
+          </w:p>
+        </w:tc>
+        <w:tc>
+          <w:tcPr>
+            <w:tcW w:w="3209" w:type="dxa"/>
+          </w:tcPr>
+          <w:p>
+            <w:r>
+              <w:t>Codice ordine, prezzo totale</w:t>
+            </w:r>
+          </w:p>
+        </w:tc>
+        <w:tc>
+          <w:tcPr>
+            <w:tcW w:w="3210" w:type="dxa"/>
+          </w:tcPr>
+          <w:p>
+            <w:r>
+              <w:t>Codice ordine</w:t>
+            </w:r>
+          </w:p>
+        </w:tc>
+      </w:tr>
+      <w:tr>
+        <w:tc>
+          <w:tcPr>
+            <w:tcW w:w="3209" w:type="dxa"/>
+          </w:tcPr>
+          <w:p>
+            <w:r>
+              <w:t>Genere</w:t>
+            </w:r>
+          </w:p>
+        </w:tc>
+        <w:tc>
+          <w:tcPr>
+            <w:tcW w:w="3209" w:type="dxa"/>
+          </w:tcPr>
+          <w:p>
+            <w:r>
+              <w:t>tipo</w:t>
+            </w:r>
+          </w:p>
+        </w:tc>
+        <w:tc>
+          <w:tcPr>
+            <w:tcW w:w="3210" w:type="dxa"/>
+          </w:tcPr>
+          <w:p>
+            <w:r>
+              <w:t>Tipo</w:t>
+            </w:r>
+          </w:p>
+        </w:tc>
+      </w:tr>
+      <w:tr>
+        <w:tc>
+          <w:tcPr>
+            <w:tcW w:w="3209" w:type="dxa"/>
+          </w:tcPr>
+          <w:p>
+            <w:r>
+              <w:t>abbonamento</w:t>
+            </w:r>
+          </w:p>
+        </w:tc>
+        <w:tc>
+          <w:tcPr>
+            <w:tcW w:w="3209" w:type="dxa"/>
+          </w:tcPr>
+          <w:p>
+            <w:r>
+              <w:t>Durata, data inizio, codice abbonamento</w:t>
+            </w:r>
+          </w:p>
+        </w:tc>
+        <w:tc>
+          <w:tcPr>
+            <w:tcW w:w="3210" w:type="dxa"/>
+          </w:tcPr>
+          <w:p>
+            <w:r>
+              <w:t>Codice abbonamento,</w:t>
+            </w:r>
+          </w:p>
+          <w:p>
+            <w:r>
+              <w:t>poss</w:t>
+            </w:r>
+            <w:r>
+              <w:t>iede</w:t>
+            </w:r>
+          </w:p>
+        </w:tc>
+      </w:tr>
+    </w:tbl>
+    <w:p>
+      <w:pPr>
+        <w:rPr>
+          <w:b/>
+          <w:bCs/>
+          <w:sz w:val="36"/>
+          <w:szCs w:val="36"/>
+        </w:rPr>
+      </w:pPr>
+    </w:p>
+    <w:p>
+      <w:pPr>
+        <w:tabs>
+          <w:tab w:val="left" w:pos="1404"/>
+        </w:tabs>
+        <w:rPr>
+          <w:sz w:val="36"/>
+          <w:szCs w:val="36"/>
           <w:u w:val="single"/>
         </w:rPr>
+      </w:pPr>
+      <w:r>
+        <w:rPr>
+          <w:sz w:val="36"/>
+          <w:szCs w:val="36"/>
+        </w:rPr>
+        <w:tab/>
+      </w:r>
+    </w:p>
+    <w:p>
+      <w:pPr>
+        <w:tabs>
+          <w:tab w:val="left" w:pos="1404"/>
+        </w:tabs>
+        <w:rPr>
+          <w:b/>
+          <w:bCs/>
+          <w:sz w:val="36"/>
+          <w:szCs w:val="36"/>
+        </w:rPr>
+      </w:pPr>
+      <w:r>
+        <w:rPr>
+          <w:b/>
+          <w:bCs/>
+          <w:sz w:val="36"/>
+          <w:szCs w:val="36"/>
+        </w:rPr>
+        <w:t>Dizionario dei dati(relationship)</w:t>
+      </w:r>
+      <w:r>
+        <w:rPr>
+          <w:b/>
+          <w:bCs/>
+          <w:sz w:val="36"/>
+          <w:szCs w:val="36"/>
+        </w:rPr>
+        <w:t xml:space="preserve"> Ristrutturato</w:t>
+      </w:r>
+    </w:p>
+    <w:tbl>
+      <w:tblPr>
+        <w:tblStyle w:val="Grigliatabella"/>
+        <w:tblW w:w="9672" w:type="dxa"/>
+        <w:tblLook w:val="04A0" w:firstRow="1" w:lastRow="0" w:firstColumn="1" w:lastColumn="0" w:noHBand="0" w:noVBand="1"/>
+      </w:tblPr>
+      <w:tblGrid>
+        <w:gridCol w:w="2418"/>
+        <w:gridCol w:w="2418"/>
+        <w:gridCol w:w="2418"/>
+        <w:gridCol w:w="2418"/>
+      </w:tblGrid>
+      <w:tr>
+        <w:trPr>
+          <w:trHeight w:val="267"/>
+        </w:trPr>
+        <w:tc>
+          <w:tcPr>
+            <w:tcW w:w="2418" w:type="dxa"/>
+            <w:shd w:val="clear" w:color="auto" w:fill="00B0F0"/>
+          </w:tcPr>
+          <w:p>
+            <w:pPr>
+              <w:tabs>
+                <w:tab w:val="left" w:pos="1404"/>
+              </w:tabs>
+            </w:pPr>
+            <w:r>
+              <w:t>Relazione</w:t>
+            </w:r>
+          </w:p>
+        </w:tc>
+        <w:tc>
+          <w:tcPr>
+            <w:tcW w:w="2418" w:type="dxa"/>
+            <w:shd w:val="clear" w:color="auto" w:fill="00B0F0"/>
+          </w:tcPr>
+          <w:p>
+            <w:pPr>
+              <w:tabs>
+                <w:tab w:val="left" w:pos="1404"/>
+              </w:tabs>
+            </w:pPr>
+            <w:r>
+              <w:t>descrizione</w:t>
+            </w:r>
+          </w:p>
+        </w:tc>
+        <w:tc>
+          <w:tcPr>
+            <w:tcW w:w="2418" w:type="dxa"/>
+            <w:shd w:val="clear" w:color="auto" w:fill="00B0F0"/>
+          </w:tcPr>
+          <w:p>
+            <w:pPr>
+              <w:tabs>
+                <w:tab w:val="left" w:pos="1404"/>
+              </w:tabs>
+            </w:pPr>
+            <w:r>
+              <w:t>componenti</w:t>
+            </w:r>
+          </w:p>
+        </w:tc>
+        <w:tc>
+          <w:tcPr>
+            <w:tcW w:w="2418" w:type="dxa"/>
+            <w:shd w:val="clear" w:color="auto" w:fill="00B0F0"/>
+          </w:tcPr>
+          <w:p>
+            <w:pPr>
+              <w:tabs>
+                <w:tab w:val="left" w:pos="1404"/>
+              </w:tabs>
+            </w:pPr>
+            <w:r>
+              <w:t>attributi</w:t>
+            </w:r>
+          </w:p>
+        </w:tc>
+      </w:tr>
+      <w:tr>
+        <w:trPr>
+          <w:trHeight w:val="547"/>
+        </w:trPr>
+        <w:tc>
+          <w:tcPr>
+            <w:tcW w:w="2418" w:type="dxa"/>
+          </w:tcPr>
+          <w:p>
+            <w:pPr>
+              <w:tabs>
+                <w:tab w:val="left" w:pos="1404"/>
+              </w:tabs>
+            </w:pPr>
+            <w:r>
+              <w:t>Poss</w:t>
+            </w:r>
+            <w:r>
+              <w:t>edere</w:t>
+            </w:r>
+          </w:p>
+        </w:tc>
+        <w:tc>
+          <w:tcPr>
+            <w:tcW w:w="2418" w:type="dxa"/>
+          </w:tcPr>
+          <w:p>
+            <w:pPr>
+              <w:tabs>
+                <w:tab w:val="left" w:pos="1404"/>
+              </w:tabs>
+            </w:pPr>
+            <w:r>
+              <w:t>Possesso di un</w:t>
+            </w:r>
+            <w:r>
+              <w:t>a casella postale</w:t>
+            </w:r>
+          </w:p>
+        </w:tc>
+        <w:tc>
+          <w:tcPr>
+            <w:tcW w:w="2418" w:type="dxa"/>
+          </w:tcPr>
+          <w:p>
+            <w:pPr>
+              <w:tabs>
+                <w:tab w:val="left" w:pos="1404"/>
+              </w:tabs>
+            </w:pPr>
+            <w:r>
+              <w:t xml:space="preserve">Cliente, </w:t>
+            </w:r>
+            <w:r>
+              <w:t>casella postale</w:t>
+            </w:r>
+          </w:p>
+        </w:tc>
+        <w:tc>
+          <w:tcPr>
+            <w:tcW w:w="2418" w:type="dxa"/>
+          </w:tcPr>
+          <w:p>
+            <w:pPr>
+              <w:tabs>
+                <w:tab w:val="left" w:pos="1404"/>
+              </w:tabs>
+            </w:pPr>
+          </w:p>
+        </w:tc>
+      </w:tr>
+      <w:tr>
+        <w:trPr>
+          <w:trHeight w:val="267"/>
+        </w:trPr>
+        <w:tc>
+          <w:tcPr>
+            <w:tcW w:w="2418" w:type="dxa"/>
+          </w:tcPr>
+          <w:p>
+            <w:pPr>
+              <w:tabs>
+                <w:tab w:val="left" w:pos="1404"/>
+              </w:tabs>
+            </w:pPr>
+            <w:r>
+              <w:t>Effettua</w:t>
+            </w:r>
+            <w:r>
+              <w:t>re</w:t>
+            </w:r>
+          </w:p>
+        </w:tc>
+        <w:tc>
+          <w:tcPr>
+            <w:tcW w:w="2418" w:type="dxa"/>
+          </w:tcPr>
+          <w:p>
+            <w:pPr>
+              <w:tabs>
+                <w:tab w:val="left" w:pos="1404"/>
+              </w:tabs>
+            </w:pPr>
+            <w:r>
+              <w:t>Acquisto di un ordine</w:t>
+            </w:r>
+          </w:p>
+        </w:tc>
+        <w:tc>
+          <w:tcPr>
+            <w:tcW w:w="2418" w:type="dxa"/>
+          </w:tcPr>
+          <w:p>
+            <w:pPr>
+              <w:tabs>
+                <w:tab w:val="left" w:pos="1404"/>
+              </w:tabs>
+            </w:pPr>
+            <w:r>
+              <w:t>Cliente, ordine</w:t>
+            </w:r>
+          </w:p>
+        </w:tc>
+        <w:tc>
+          <w:tcPr>
+            <w:tcW w:w="2418" w:type="dxa"/>
+          </w:tcPr>
+          <w:p>
+            <w:pPr>
+              <w:tabs>
+                <w:tab w:val="left" w:pos="1404"/>
+              </w:tabs>
+            </w:pPr>
+            <w:r>
+              <w:t>Data</w:t>
+            </w:r>
+          </w:p>
+        </w:tc>
+      </w:tr>
+      <w:tr>
+        <w:trPr>
+          <w:trHeight w:val="547"/>
+        </w:trPr>
+        <w:tc>
+          <w:tcPr>
+            <w:tcW w:w="2418" w:type="dxa"/>
+          </w:tcPr>
+          <w:p>
+            <w:pPr>
+              <w:tabs>
+                <w:tab w:val="left" w:pos="1404"/>
+              </w:tabs>
+            </w:pPr>
+            <w:r>
+              <w:t>scrivere</w:t>
+            </w:r>
+          </w:p>
+        </w:tc>
+        <w:tc>
+          <w:tcPr>
+            <w:tcW w:w="2418" w:type="dxa"/>
+          </w:tcPr>
+          <w:p>
+            <w:pPr>
+              <w:tabs>
+                <w:tab w:val="left" w:pos="1404"/>
+              </w:tabs>
+            </w:pPr>
+            <w:r>
+              <w:t>Scrivere una recensione</w:t>
+            </w:r>
+          </w:p>
+        </w:tc>
+        <w:tc>
+          <w:tcPr>
+            <w:tcW w:w="2418" w:type="dxa"/>
+          </w:tcPr>
+          <w:p>
+            <w:pPr>
+              <w:tabs>
+                <w:tab w:val="left" w:pos="1404"/>
+              </w:tabs>
+            </w:pPr>
+            <w:r>
+              <w:t>Cliente, recensione</w:t>
+            </w:r>
+          </w:p>
+        </w:tc>
+        <w:tc>
+          <w:tcPr>
+            <w:tcW w:w="2418" w:type="dxa"/>
+          </w:tcPr>
+          <w:p>
+            <w:pPr>
+              <w:tabs>
+                <w:tab w:val="left" w:pos="1404"/>
+              </w:tabs>
+            </w:pPr>
+          </w:p>
+        </w:tc>
+      </w:tr>
+      <w:tr>
+        <w:trPr>
+          <w:trHeight w:val="535"/>
+        </w:trPr>
+        <w:tc>
+          <w:tcPr>
+            <w:tcW w:w="2418" w:type="dxa"/>
+          </w:tcPr>
+          <w:p>
+            <w:pPr>
+              <w:tabs>
+                <w:tab w:val="left" w:pos="1404"/>
+              </w:tabs>
+            </w:pPr>
+            <w:r>
+              <w:t>Valuta</w:t>
+            </w:r>
+            <w:r>
+              <w:t>re videogioco</w:t>
+            </w:r>
+          </w:p>
+        </w:tc>
+        <w:tc>
+          <w:tcPr>
+            <w:tcW w:w="2418" w:type="dxa"/>
+          </w:tcPr>
+          <w:p>
+            <w:pPr>
+              <w:tabs>
+                <w:tab w:val="left" w:pos="1404"/>
+              </w:tabs>
+            </w:pPr>
+            <w:r>
+              <w:t xml:space="preserve">Valutare un determinato </w:t>
+            </w:r>
+            <w:r>
+              <w:t>videogioco</w:t>
+            </w:r>
+          </w:p>
+        </w:tc>
+        <w:tc>
+          <w:tcPr>
+            <w:tcW w:w="2418" w:type="dxa"/>
+          </w:tcPr>
+          <w:p>
+            <w:pPr>
+              <w:tabs>
+                <w:tab w:val="left" w:pos="1404"/>
+              </w:tabs>
+            </w:pPr>
+            <w:r>
+              <w:t xml:space="preserve">Recensione, </w:t>
+            </w:r>
+            <w:r>
+              <w:t>videogioco</w:t>
+            </w:r>
+          </w:p>
+        </w:tc>
+        <w:tc>
+          <w:tcPr>
+            <w:tcW w:w="2418" w:type="dxa"/>
+          </w:tcPr>
+          <w:p>
+            <w:pPr>
+              <w:tabs>
+                <w:tab w:val="left" w:pos="1404"/>
+              </w:tabs>
+            </w:pPr>
+          </w:p>
+        </w:tc>
+      </w:tr>
+      <w:tr>
+        <w:trPr>
+          <w:trHeight w:val="547"/>
+        </w:trPr>
+        <w:tc>
+          <w:tcPr>
+            <w:tcW w:w="2418" w:type="dxa"/>
+          </w:tcPr>
+          <w:p>
+            <w:pPr>
+              <w:tabs>
+                <w:tab w:val="left" w:pos="1404"/>
+              </w:tabs>
+            </w:pPr>
+            <w:r>
+              <w:t>Contene</w:t>
+            </w:r>
+            <w:r>
+              <w:t>re videogioco</w:t>
+            </w:r>
+          </w:p>
+        </w:tc>
+        <w:tc>
+          <w:tcPr>
+            <w:tcW w:w="2418" w:type="dxa"/>
+          </w:tcPr>
+          <w:p>
+            <w:pPr>
+              <w:tabs>
+                <w:tab w:val="left" w:pos="1404"/>
+              </w:tabs>
+            </w:pPr>
+            <w:r>
+              <w:t xml:space="preserve">Un ordine può contenere </w:t>
+            </w:r>
+            <w:r>
+              <w:t>videogiochi</w:t>
+            </w:r>
+          </w:p>
+        </w:tc>
+        <w:tc>
+          <w:tcPr>
+            <w:tcW w:w="2418" w:type="dxa"/>
+          </w:tcPr>
+          <w:p>
+            <w:pPr>
+              <w:tabs>
+                <w:tab w:val="left" w:pos="1404"/>
+              </w:tabs>
+            </w:pPr>
+            <w:r>
+              <w:t>videogioco</w:t>
+            </w:r>
+            <w:r>
+              <w:t>, ordine</w:t>
+            </w:r>
+          </w:p>
+        </w:tc>
+        <w:tc>
+          <w:tcPr>
+            <w:tcW w:w="2418" w:type="dxa"/>
+          </w:tcPr>
+          <w:p>
+            <w:pPr>
+              <w:tabs>
+                <w:tab w:val="left" w:pos="1404"/>
+              </w:tabs>
+            </w:pPr>
+            <w:r>
+              <w:t>quantità</w:t>
+            </w:r>
+          </w:p>
+        </w:tc>
+      </w:tr>
+      <w:tr>
+        <w:trPr>
+          <w:trHeight w:val="535"/>
+        </w:trPr>
+        <w:tc>
+          <w:tcPr>
+            <w:tcW w:w="2418" w:type="dxa"/>
+          </w:tcPr>
+          <w:p>
+            <w:pPr>
+              <w:tabs>
+                <w:tab w:val="left" w:pos="1404"/>
+              </w:tabs>
+            </w:pPr>
+            <w:r>
+              <w:t>appart</w:t>
+            </w:r>
+            <w:r>
+              <w:t>enere</w:t>
+            </w:r>
+          </w:p>
+        </w:tc>
+        <w:tc>
+          <w:tcPr>
+            <w:tcW w:w="2418" w:type="dxa"/>
+          </w:tcPr>
+          <w:p>
+            <w:pPr>
+              <w:tabs>
+                <w:tab w:val="left" w:pos="1404"/>
+              </w:tabs>
+            </w:pPr>
+            <w:r>
+              <w:t>Appartenenza a un genere</w:t>
+            </w:r>
+          </w:p>
+        </w:tc>
+        <w:tc>
+          <w:tcPr>
+            <w:tcW w:w="2418" w:type="dxa"/>
+          </w:tcPr>
+          <w:p>
+            <w:pPr>
+              <w:tabs>
+                <w:tab w:val="left" w:pos="1404"/>
+              </w:tabs>
+            </w:pPr>
+            <w:r>
+              <w:t>Videogioco, genere</w:t>
+            </w:r>
+          </w:p>
+        </w:tc>
+        <w:tc>
+          <w:tcPr>
+            <w:tcW w:w="2418" w:type="dxa"/>
+          </w:tcPr>
+          <w:p>
+            <w:pPr>
+              <w:tabs>
+                <w:tab w:val="left" w:pos="1404"/>
+              </w:tabs>
+            </w:pPr>
+          </w:p>
+        </w:tc>
+      </w:tr>
+      <w:tr>
+        <w:trPr>
+          <w:trHeight w:val="535"/>
+        </w:trPr>
+        <w:tc>
+          <w:tcPr>
+            <w:tcW w:w="2418" w:type="dxa"/>
+          </w:tcPr>
+          <w:p>
+            <w:pPr>
+              <w:tabs>
+                <w:tab w:val="left" w:pos="1404"/>
+              </w:tabs>
+            </w:pPr>
+            <w:r>
+              <w:t xml:space="preserve">Valutare </w:t>
+            </w:r>
+            <w:r>
+              <w:t>merchandise</w:t>
+            </w:r>
+          </w:p>
+        </w:tc>
+        <w:tc>
+          <w:tcPr>
+            <w:tcW w:w="2418" w:type="dxa"/>
+          </w:tcPr>
+          <w:p>
+            <w:pPr>
+              <w:tabs>
+                <w:tab w:val="left" w:pos="1404"/>
+              </w:tabs>
+            </w:pPr>
+            <w:r>
+              <w:t>Valutare un determinato</w:t>
+            </w:r>
+            <w:r>
+              <w:t xml:space="preserve"> tipo di merchandise</w:t>
+            </w:r>
+          </w:p>
+        </w:tc>
+        <w:tc>
+          <w:tcPr>
+            <w:tcW w:w="2418" w:type="dxa"/>
+          </w:tcPr>
+          <w:p>
+            <w:pPr>
+              <w:tabs>
+                <w:tab w:val="left" w:pos="1404"/>
+              </w:tabs>
+            </w:pPr>
+            <w:r>
+              <w:t>Merchandise, recensione</w:t>
+            </w:r>
+          </w:p>
+        </w:tc>
+        <w:tc>
+          <w:tcPr>
+            <w:tcW w:w="2418" w:type="dxa"/>
+          </w:tcPr>
+          <w:p>
+            <w:pPr>
+              <w:tabs>
+                <w:tab w:val="left" w:pos="1404"/>
+              </w:tabs>
+            </w:pPr>
+          </w:p>
+        </w:tc>
+      </w:tr>
+      <w:tr>
+        <w:trPr>
+          <w:trHeight w:val="535"/>
+        </w:trPr>
+        <w:tc>
+          <w:tcPr>
+            <w:tcW w:w="2418" w:type="dxa"/>
+          </w:tcPr>
+          <w:p>
+            <w:pPr>
+              <w:tabs>
+                <w:tab w:val="left" w:pos="1404"/>
+              </w:tabs>
+            </w:pPr>
+            <w:r>
+              <w:t xml:space="preserve">Contenere </w:t>
+            </w:r>
+            <w:r>
+              <w:t>merchandise</w:t>
+            </w:r>
+          </w:p>
+        </w:tc>
+        <w:tc>
+          <w:tcPr>
+            <w:tcW w:w="2418" w:type="dxa"/>
+          </w:tcPr>
+          <w:p>
+            <w:pPr>
+              <w:tabs>
+                <w:tab w:val="left" w:pos="1404"/>
+              </w:tabs>
+            </w:pPr>
+            <w:r>
+              <w:t xml:space="preserve">Un ordine può contenere </w:t>
+            </w:r>
+            <w:r>
+              <w:t>merchandise</w:t>
+            </w:r>
+          </w:p>
+        </w:tc>
+        <w:tc>
+          <w:tcPr>
+            <w:tcW w:w="2418" w:type="dxa"/>
+          </w:tcPr>
+          <w:p>
+            <w:pPr>
+              <w:tabs>
+                <w:tab w:val="left" w:pos="1404"/>
+              </w:tabs>
+            </w:pPr>
+            <w:r>
+              <w:t>Merchandise, ordine</w:t>
+            </w:r>
+          </w:p>
+        </w:tc>
+        <w:tc>
+          <w:tcPr>
+            <w:tcW w:w="2418" w:type="dxa"/>
+          </w:tcPr>
+          <w:p>
+            <w:pPr>
+              <w:tabs>
+                <w:tab w:val="left" w:pos="1404"/>
+              </w:tabs>
+            </w:pPr>
+            <w:r>
+              <w:t>quantità</w:t>
+            </w:r>
+          </w:p>
+        </w:tc>
+      </w:tr>
+      <w:tr>
+        <w:trPr>
+          <w:trHeight w:val="535"/>
+        </w:trPr>
+        <w:tc>
+          <w:tcPr>
+            <w:tcW w:w="2418" w:type="dxa"/>
+          </w:tcPr>
+          <w:p>
+            <w:pPr>
+              <w:tabs>
+                <w:tab w:val="left" w:pos="1404"/>
+              </w:tabs>
+            </w:pPr>
+            <w:r>
+              <w:t>Iscrizione</w:t>
+            </w:r>
+          </w:p>
+        </w:tc>
+        <w:tc>
+          <w:tcPr>
+            <w:tcW w:w="2418" w:type="dxa"/>
+          </w:tcPr>
+          <w:p>
+            <w:pPr>
+              <w:tabs>
+                <w:tab w:val="left" w:pos="1404"/>
+              </w:tabs>
+            </w:pPr>
+            <w:r>
+              <w:t>Un cliente può iscriversi ad un abbonamento</w:t>
+            </w:r>
+          </w:p>
+        </w:tc>
+        <w:tc>
+          <w:tcPr>
+            <w:tcW w:w="2418" w:type="dxa"/>
+          </w:tcPr>
+          <w:p>
+            <w:pPr>
+              <w:tabs>
+                <w:tab w:val="left" w:pos="1404"/>
+              </w:tabs>
+            </w:pPr>
+            <w:r>
+              <w:t xml:space="preserve">Cliente, abbonamento </w:t>
+            </w:r>
+          </w:p>
+        </w:tc>
+        <w:tc>
+          <w:tcPr>
+            <w:tcW w:w="2418" w:type="dxa"/>
+          </w:tcPr>
+          <w:p>
+            <w:pPr>
+              <w:tabs>
+                <w:tab w:val="left" w:pos="1404"/>
+              </w:tabs>
+            </w:pPr>
+          </w:p>
+        </w:tc>
+      </w:tr>
+    </w:tbl>
+    <w:p>
+      <w:pPr>
+        <w:tabs>
+          <w:tab w:val="left" w:pos="1404"/>
+        </w:tabs>
+        <w:rPr>
+          <w:sz w:val="24"/>
+          <w:szCs w:val="24"/>
+        </w:rPr>
+      </w:pPr>
+    </w:p>
+    <w:p>
+      <w:pPr>
+        <w:tabs>
+          <w:tab w:val="left" w:pos="1404"/>
+        </w:tabs>
+        <w:rPr>
+          <w:b/>
+          <w:bCs/>
+          <w:sz w:val="36"/>
+          <w:szCs w:val="36"/>
+        </w:rPr>
+      </w:pPr>
+    </w:p>
+    <w:p>
+      <w:pPr>
+        <w:tabs>
+          <w:tab w:val="left" w:pos="1404"/>
+        </w:tabs>
+        <w:rPr>
+          <w:b/>
+          <w:bCs/>
+          <w:sz w:val="36"/>
+          <w:szCs w:val="36"/>
+        </w:rPr>
+      </w:pPr>
+      <w:r>
+        <w:rPr>
+          <w:b/>
+          <w:bCs/>
+          <w:sz w:val="36"/>
+          <w:szCs w:val="36"/>
+        </w:rPr>
+        <w:lastRenderedPageBreak/>
+        <w:t>Schema relazionale</w:t>
+      </w:r>
+    </w:p>
+    <w:p>
+      <w:pPr>
+        <w:tabs>
+          <w:tab w:val="left" w:pos="1404"/>
+        </w:tabs>
+        <w:rPr>
+          <w:b/>
+          <w:bCs/>
+          <w:sz w:val="32"/>
+          <w:szCs w:val="32"/>
+        </w:rPr>
+      </w:pPr>
+      <w:r>
+        <w:rPr>
+          <w:b/>
+          <w:bCs/>
+          <w:sz w:val="32"/>
+          <w:szCs w:val="32"/>
+        </w:rPr>
+        <w:t>Traduzione</w:t>
+      </w:r>
+    </w:p>
+    <w:p>
+      <w:pPr>
+        <w:tabs>
+          <w:tab w:val="left" w:pos="1404"/>
+        </w:tabs>
+        <w:rPr>
+          <w:sz w:val="24"/>
+          <w:szCs w:val="24"/>
+          <w:u w:val="single"/>
+        </w:rPr>
+      </w:pPr>
+      <w:r>
+        <w:rPr>
+          <w:sz w:val="24"/>
+          <w:szCs w:val="24"/>
+        </w:rPr>
+        <w:t>Genere (</w:t>
+      </w:r>
+      <w:r>
+        <w:rPr>
+          <w:sz w:val="24"/>
+          <w:szCs w:val="24"/>
+          <w:u w:val="single"/>
+        </w:rPr>
+        <w:t>tipo)</w:t>
+      </w:r>
+    </w:p>
+    <w:p>
+      <w:pPr>
+        <w:tabs>
+          <w:tab w:val="left" w:pos="1404"/>
+        </w:tabs>
+        <w:rPr>
+          <w:sz w:val="24"/>
+          <w:szCs w:val="24"/>
+          <w:u w:val="single"/>
+        </w:rPr>
+      </w:pPr>
+      <w:r>
+        <w:rPr>
+          <w:sz w:val="24"/>
+          <w:szCs w:val="24"/>
+        </w:rPr>
+        <w:t>Appartenere</w:t>
+      </w:r>
+      <w:r>
+        <w:rPr>
+          <w:sz w:val="24"/>
+          <w:szCs w:val="24"/>
+        </w:rPr>
+        <w:t xml:space="preserve"> </w:t>
+      </w:r>
+      <w:r>
+        <w:rPr>
+          <w:sz w:val="24"/>
+          <w:szCs w:val="24"/>
+        </w:rPr>
+        <w:t>(</w:t>
+      </w:r>
+      <w:r>
+        <w:rPr>
+          <w:sz w:val="24"/>
+          <w:szCs w:val="24"/>
+          <w:u w:val="single"/>
+        </w:rPr>
+        <w:t>Genere, Videogioco)</w:t>
+      </w:r>
+    </w:p>
+    <w:p>
+      <w:pPr>
+        <w:tabs>
+          <w:tab w:val="left" w:pos="1404"/>
+        </w:tabs>
+        <w:rPr>
+          <w:sz w:val="24"/>
+          <w:szCs w:val="24"/>
+        </w:rPr>
+      </w:pPr>
+      <w:r>
+        <w:rPr>
+          <w:sz w:val="24"/>
+          <w:szCs w:val="24"/>
+        </w:rPr>
+        <w:t>Videogioco (</w:t>
+      </w:r>
+      <w:r>
+        <w:rPr>
+          <w:sz w:val="24"/>
+          <w:szCs w:val="24"/>
+          <w:u w:val="single"/>
+        </w:rPr>
+        <w:t>ID_Prodotto,</w:t>
+      </w:r>
+      <w:r>
+        <w:rPr>
+          <w:sz w:val="24"/>
+          <w:szCs w:val="24"/>
+        </w:rPr>
+        <w:t xml:space="preserve"> nome, Prezzo, Studio, Data_Uscita, Piattaforme, PEGI)</w:t>
+      </w:r>
+    </w:p>
+    <w:p>
+      <w:pPr>
+        <w:tabs>
+          <w:tab w:val="left" w:pos="1404"/>
+        </w:tabs>
+        <w:rPr>
+          <w:sz w:val="24"/>
+          <w:szCs w:val="24"/>
+        </w:rPr>
+      </w:pPr>
+      <w:r>
+        <w:rPr>
+          <w:sz w:val="24"/>
+          <w:szCs w:val="24"/>
+        </w:rPr>
+        <w:t>Valutare Videogioco (</w:t>
+      </w:r>
+      <w:r>
+        <w:rPr>
+          <w:sz w:val="24"/>
+          <w:szCs w:val="24"/>
+          <w:u w:val="single"/>
+        </w:rPr>
+        <w:t>Videogioco</w:t>
+      </w:r>
+      <w:r>
+        <w:rPr>
+          <w:sz w:val="24"/>
+          <w:szCs w:val="24"/>
+        </w:rPr>
+        <w:t xml:space="preserve">, </w:t>
+      </w:r>
+      <w:r>
+        <w:rPr>
+          <w:sz w:val="24"/>
+          <w:szCs w:val="24"/>
+          <w:u w:val="single"/>
+        </w:rPr>
+        <w:t>Recensione</w:t>
+      </w:r>
+      <w:r>
+        <w:rPr>
+          <w:sz w:val="24"/>
+          <w:szCs w:val="24"/>
+        </w:rPr>
+        <w:t xml:space="preserve">, </w:t>
+      </w:r>
+      <w:r>
+        <w:rPr>
+          <w:sz w:val="24"/>
+          <w:szCs w:val="24"/>
+          <w:u w:val="single"/>
+        </w:rPr>
+        <w:t>Cliente</w:t>
+      </w:r>
+      <w:r>
+        <w:rPr>
+          <w:sz w:val="24"/>
+          <w:szCs w:val="24"/>
+        </w:rPr>
+        <w:t>)</w:t>
+      </w:r>
+    </w:p>
+    <w:p>
+      <w:pPr>
+        <w:tabs>
+          <w:tab w:val="left" w:pos="1404"/>
+        </w:tabs>
+        <w:rPr>
+          <w:sz w:val="24"/>
+          <w:szCs w:val="24"/>
+        </w:rPr>
+      </w:pPr>
+      <w:r>
+        <w:rPr>
+          <w:sz w:val="24"/>
+          <w:szCs w:val="24"/>
+        </w:rPr>
+        <w:t>Recensione (</w:t>
+      </w:r>
+      <w:r>
+        <w:rPr>
+          <w:sz w:val="24"/>
+          <w:szCs w:val="24"/>
+          <w:u w:val="single"/>
+        </w:rPr>
+        <w:t>ID_Recensione</w:t>
+      </w:r>
+      <w:r>
+        <w:rPr>
+          <w:sz w:val="24"/>
+          <w:szCs w:val="24"/>
+        </w:rPr>
+        <w:t xml:space="preserve">, </w:t>
+      </w:r>
+      <w:r>
+        <w:rPr>
+          <w:sz w:val="24"/>
+          <w:szCs w:val="24"/>
+          <w:u w:val="single"/>
+        </w:rPr>
+        <w:t>Cliente</w:t>
+      </w:r>
+      <w:r>
+        <w:rPr>
+          <w:sz w:val="24"/>
+          <w:szCs w:val="24"/>
+        </w:rPr>
+        <w:t>, Voto, Descrizione)</w:t>
+      </w:r>
+    </w:p>
+    <w:p>
+      <w:pPr>
+        <w:tabs>
+          <w:tab w:val="left" w:pos="1404"/>
+        </w:tabs>
+        <w:rPr>
+          <w:sz w:val="24"/>
+          <w:szCs w:val="24"/>
+        </w:rPr>
+      </w:pPr>
+      <w:r>
+        <w:rPr>
+          <w:sz w:val="24"/>
+          <w:szCs w:val="24"/>
+        </w:rPr>
+        <w:t xml:space="preserve"> Merchandise (</w:t>
+      </w:r>
+      <w:r>
+        <w:rPr>
+          <w:sz w:val="24"/>
+          <w:szCs w:val="24"/>
+          <w:u w:val="single"/>
+        </w:rPr>
+        <w:t>ID_Prodotto</w:t>
+      </w:r>
+      <w:r>
+        <w:rPr>
+          <w:sz w:val="24"/>
+          <w:szCs w:val="24"/>
+        </w:rPr>
+        <w:t>, Nome, Dimensione, Tipo, Prezzo, Peso)</w:t>
+      </w:r>
+    </w:p>
+    <w:p>
+      <w:pPr>
+        <w:tabs>
+          <w:tab w:val="left" w:pos="1404"/>
+        </w:tabs>
+        <w:rPr>
+          <w:sz w:val="24"/>
+          <w:szCs w:val="24"/>
+        </w:rPr>
+      </w:pPr>
+      <w:r>
+        <w:rPr>
+          <w:sz w:val="24"/>
+          <w:szCs w:val="24"/>
+        </w:rPr>
+        <w:t>Valutare merchandise (</w:t>
+      </w:r>
+      <w:r>
+        <w:rPr>
+          <w:sz w:val="24"/>
+          <w:szCs w:val="24"/>
+          <w:u w:val="single"/>
+        </w:rPr>
+        <w:t>Merchandise</w:t>
+      </w:r>
+      <w:r>
+        <w:rPr>
+          <w:sz w:val="24"/>
+          <w:szCs w:val="24"/>
+        </w:rPr>
+        <w:t xml:space="preserve">, </w:t>
+      </w:r>
+      <w:r>
+        <w:rPr>
+          <w:sz w:val="24"/>
+          <w:szCs w:val="24"/>
+          <w:u w:val="single"/>
+        </w:rPr>
+        <w:t>Recensione</w:t>
+      </w:r>
+      <w:r>
+        <w:rPr>
+          <w:sz w:val="24"/>
+          <w:szCs w:val="24"/>
+        </w:rPr>
+        <w:t xml:space="preserve">, </w:t>
+      </w:r>
+      <w:r>
+        <w:rPr>
+          <w:sz w:val="24"/>
+          <w:szCs w:val="24"/>
+          <w:u w:val="single"/>
+        </w:rPr>
+        <w:t>Cliente</w:t>
+      </w:r>
+      <w:r>
+        <w:rPr>
+          <w:sz w:val="24"/>
+          <w:szCs w:val="24"/>
+        </w:rPr>
+        <w:t>)</w:t>
+      </w:r>
+    </w:p>
+    <w:p>
+      <w:pPr>
+        <w:tabs>
+          <w:tab w:val="left" w:pos="1404"/>
+        </w:tabs>
+        <w:rPr>
+          <w:sz w:val="24"/>
+          <w:szCs w:val="24"/>
+        </w:rPr>
+      </w:pPr>
+      <w:r>
+        <w:rPr>
+          <w:sz w:val="24"/>
+          <w:szCs w:val="24"/>
+        </w:rPr>
+        <w:t>Cliente (</w:t>
+      </w:r>
+      <w:r>
+        <w:rPr>
+          <w:sz w:val="24"/>
+          <w:szCs w:val="24"/>
+          <w:u w:val="single"/>
+        </w:rPr>
+        <w:t>Codice</w:t>
+      </w:r>
+      <w:r>
+        <w:rPr>
+          <w:sz w:val="24"/>
+          <w:szCs w:val="24"/>
+        </w:rPr>
+        <w:t>_</w:t>
+      </w:r>
+      <w:r>
+        <w:rPr>
+          <w:sz w:val="24"/>
+          <w:szCs w:val="24"/>
+          <w:u w:val="single"/>
+        </w:rPr>
+        <w:t>Fiscale</w:t>
+      </w:r>
+      <w:r>
+        <w:rPr>
+          <w:sz w:val="24"/>
+          <w:szCs w:val="24"/>
+        </w:rPr>
+        <w:t>, Nome, Cognome, Telefono, Data_ nascita, Via, Civico, Cap, Città, Stato)</w:t>
+      </w:r>
+    </w:p>
+    <w:p>
+      <w:pPr>
+        <w:tabs>
+          <w:tab w:val="left" w:pos="1404"/>
+        </w:tabs>
+        <w:rPr>
+          <w:sz w:val="24"/>
+          <w:szCs w:val="24"/>
+          <w:u w:val="single"/>
+        </w:rPr>
+      </w:pPr>
+      <w:r>
+        <w:rPr>
+          <w:sz w:val="24"/>
+          <w:szCs w:val="24"/>
+        </w:rPr>
+        <w:t>Casella Postale (</w:t>
+      </w:r>
+      <w:r>
+        <w:rPr>
+          <w:sz w:val="24"/>
+          <w:szCs w:val="24"/>
+          <w:u w:val="single"/>
+        </w:rPr>
+        <w:t>E-mail,</w:t>
+      </w:r>
+      <w:r>
+        <w:rPr>
+          <w:sz w:val="24"/>
+          <w:szCs w:val="24"/>
+          <w:u w:val="single"/>
+        </w:rPr>
+        <w:t xml:space="preserve"> Codice Fiscale)</w:t>
+      </w:r>
+    </w:p>
+    <w:p>
+      <w:pPr>
+        <w:tabs>
+          <w:tab w:val="left" w:pos="1404"/>
+        </w:tabs>
+        <w:rPr>
+          <w:sz w:val="24"/>
+          <w:szCs w:val="24"/>
+        </w:rPr>
+      </w:pPr>
+      <w:r>
+        <w:rPr>
+          <w:sz w:val="24"/>
+          <w:szCs w:val="24"/>
+        </w:rPr>
+        <w:t>Abbonamento (</w:t>
+      </w:r>
+      <w:r>
+        <w:rPr>
+          <w:sz w:val="24"/>
+          <w:szCs w:val="24"/>
+          <w:u w:val="single"/>
+        </w:rPr>
+        <w:t xml:space="preserve">Codice_abbonamento, Codice_ Fiscale, </w:t>
+      </w:r>
+      <w:r>
+        <w:rPr>
+          <w:sz w:val="24"/>
+          <w:szCs w:val="24"/>
+        </w:rPr>
+        <w:t>Durata, Data_Inizio)</w:t>
+      </w:r>
+    </w:p>
+    <w:p>
+      <w:pPr>
+        <w:tabs>
+          <w:tab w:val="left" w:pos="1404"/>
+        </w:tabs>
+        <w:rPr>
+          <w:sz w:val="24"/>
+          <w:szCs w:val="24"/>
+          <w:u w:val="single"/>
+        </w:rPr>
+      </w:pPr>
+      <w:r>
+        <w:rPr>
+          <w:sz w:val="24"/>
+          <w:szCs w:val="24"/>
+        </w:rPr>
+        <w:t>Contenere Merchandise (</w:t>
+      </w:r>
+      <w:r>
+        <w:rPr>
+          <w:sz w:val="24"/>
+          <w:szCs w:val="24"/>
+          <w:u w:val="single"/>
+        </w:rPr>
+        <w:t>ID_Prodotto, Codice_Ordine, quantità)</w:t>
+      </w:r>
+    </w:p>
+    <w:p>
+      <w:pPr>
+        <w:tabs>
+          <w:tab w:val="left" w:pos="1404"/>
+        </w:tabs>
+        <w:rPr>
+          <w:sz w:val="24"/>
+          <w:szCs w:val="24"/>
+          <w:u w:val="single"/>
+        </w:rPr>
+      </w:pPr>
+      <w:r>
+        <w:rPr>
+          <w:sz w:val="24"/>
+          <w:szCs w:val="24"/>
+        </w:rPr>
+        <w:t>Contenere Videogioco (</w:t>
+      </w:r>
+      <w:r>
+        <w:rPr>
+          <w:sz w:val="24"/>
+          <w:szCs w:val="24"/>
+          <w:u w:val="single"/>
+        </w:rPr>
+        <w:t>ID_Prodotto, Codice_Ordine, quantità)</w:t>
+      </w:r>
+    </w:p>
+    <w:p>
+      <w:pPr>
+        <w:tabs>
+          <w:tab w:val="left" w:pos="1404"/>
+        </w:tabs>
+        <w:rPr>
+          <w:sz w:val="24"/>
+          <w:szCs w:val="24"/>
+        </w:rPr>
+      </w:pPr>
+      <w:r>
+        <w:rPr>
+          <w:sz w:val="24"/>
+          <w:szCs w:val="24"/>
+        </w:rPr>
+        <w:t>Ordine (</w:t>
+      </w:r>
+      <w:r>
+        <w:rPr>
+          <w:sz w:val="24"/>
+          <w:szCs w:val="24"/>
+          <w:u w:val="single"/>
+        </w:rPr>
+        <w:t>Codice_Ordine, Codice_Fiscale,</w:t>
+      </w:r>
+      <w:r>
+        <w:rPr>
+          <w:sz w:val="24"/>
+          <w:szCs w:val="24"/>
+        </w:rPr>
+        <w:t xml:space="preserve"> Prezzo totale)</w:t>
+      </w:r>
+    </w:p>
+    <w:p>
+      <w:pPr>
+        <w:tabs>
+          <w:tab w:val="left" w:pos="1404"/>
+        </w:tabs>
+        <w:rPr>
+          <w:b/>
+          <w:bCs/>
+          <w:sz w:val="32"/>
+          <w:szCs w:val="32"/>
+        </w:rPr>
+      </w:pPr>
+    </w:p>
+    <w:p>
+      <w:pPr>
+        <w:tabs>
+          <w:tab w:val="left" w:pos="1404"/>
+        </w:tabs>
+        <w:rPr>
+          <w:b/>
+          <w:bCs/>
+          <w:sz w:val="32"/>
+          <w:szCs w:val="32"/>
+        </w:rPr>
+      </w:pPr>
+      <w:r>
+        <w:rPr>
+          <w:b/>
+          <w:bCs/>
+          <w:sz w:val="32"/>
+          <w:szCs w:val="32"/>
+        </w:rPr>
+        <w:t xml:space="preserve">Vincoli di integrità </w:t>
+      </w:r>
+      <w:r>
+        <w:rPr>
+          <w:b/>
+          <w:bCs/>
+          <w:sz w:val="32"/>
+          <w:szCs w:val="32"/>
+        </w:rPr>
+        <w:t>inter</w:t>
+      </w:r>
+      <w:r>
+        <w:rPr>
+          <w:b/>
+          <w:bCs/>
+          <w:sz w:val="32"/>
+          <w:szCs w:val="32"/>
+        </w:rPr>
+        <w:t>refenziale</w:t>
+      </w:r>
+    </w:p>
+    <w:p>
+      <w:pPr>
+        <w:tabs>
+          <w:tab w:val="left" w:pos="1404"/>
+        </w:tabs>
+        <w:rPr>
+          <w:sz w:val="24"/>
+          <w:szCs w:val="24"/>
+        </w:rPr>
+      </w:pPr>
+      <w:r>
+        <w:rPr>
+          <w:sz w:val="24"/>
+          <w:szCs w:val="24"/>
+        </w:rPr>
+        <w:t>Genere</w:t>
+      </w:r>
+      <w:r>
+        <w:rPr>
+          <w:sz w:val="24"/>
+          <w:szCs w:val="24"/>
+        </w:rPr>
+        <w:t xml:space="preserve"> </w:t>
+      </w:r>
+      <w:r>
+        <w:rPr>
+          <w:sz w:val="24"/>
+          <w:szCs w:val="24"/>
+        </w:rPr>
+        <w:t xml:space="preserve">(Appartenere) </w:t>
+      </w:r>
+      <w:r>
+        <w:rPr>
+          <w:sz w:val="24"/>
+          <w:szCs w:val="24"/>
+        </w:rPr>
+        <w:t>si riferisce a</w:t>
+      </w:r>
+      <w:r>
+        <w:rPr>
+          <w:sz w:val="24"/>
+          <w:szCs w:val="24"/>
+        </w:rPr>
+        <w:t xml:space="preserve"> tipo (Genere)</w:t>
+      </w:r>
+    </w:p>
+    <w:p>
+      <w:pPr>
+        <w:tabs>
+          <w:tab w:val="left" w:pos="1404"/>
+        </w:tabs>
+        <w:rPr>
+          <w:sz w:val="24"/>
+          <w:szCs w:val="24"/>
+        </w:rPr>
+      </w:pPr>
+      <w:r>
+        <w:rPr>
+          <w:sz w:val="24"/>
+          <w:szCs w:val="24"/>
+        </w:rPr>
+        <w:t>Videogioco (Appartenere) si riferisce a ID_Prodotto (Videogioco)</w:t>
+      </w:r>
+    </w:p>
+    <w:p>
+      <w:pPr>
+        <w:tabs>
+          <w:tab w:val="left" w:pos="1404"/>
+        </w:tabs>
+        <w:rPr>
+          <w:sz w:val="24"/>
+          <w:szCs w:val="24"/>
+        </w:rPr>
+      </w:pPr>
+      <w:r>
+        <w:rPr>
+          <w:sz w:val="24"/>
+          <w:szCs w:val="24"/>
+        </w:rPr>
+        <w:t xml:space="preserve">Videogioco (Valutare Videogioco) </w:t>
+      </w:r>
+      <w:r>
+        <w:rPr>
+          <w:sz w:val="24"/>
+          <w:szCs w:val="24"/>
+        </w:rPr>
+        <w:t>si riferisce a ID_Prodotto(Videogioco)</w:t>
+      </w:r>
+    </w:p>
+    <w:p>
+      <w:pPr>
+        <w:tabs>
+          <w:tab w:val="left" w:pos="1404"/>
+        </w:tabs>
+        <w:rPr>
+          <w:sz w:val="24"/>
+          <w:szCs w:val="24"/>
+        </w:rPr>
+      </w:pPr>
+      <w:r>
+        <w:rPr>
+          <w:sz w:val="24"/>
+          <w:szCs w:val="24"/>
+        </w:rPr>
+        <w:t>Recensione (Valutare Videogioco) si riferisce a ID_Recensione(Recensione)</w:t>
+      </w:r>
+    </w:p>
+    <w:p>
+      <w:pPr>
+        <w:tabs>
+          <w:tab w:val="left" w:pos="1404"/>
+        </w:tabs>
+        <w:rPr>
+          <w:sz w:val="24"/>
+          <w:szCs w:val="24"/>
+        </w:rPr>
+      </w:pPr>
+      <w:r>
+        <w:rPr>
+          <w:sz w:val="24"/>
+          <w:szCs w:val="24"/>
+        </w:rPr>
+        <w:t>Cliente (Valutare Videogioco) si riferisce a Codice Fiscale (Cliente)</w:t>
+      </w:r>
+    </w:p>
+    <w:p>
+      <w:pPr>
+        <w:tabs>
+          <w:tab w:val="left" w:pos="1404"/>
+        </w:tabs>
+        <w:rPr>
+          <w:sz w:val="24"/>
+          <w:szCs w:val="24"/>
+        </w:rPr>
+      </w:pPr>
+      <w:r>
+        <w:rPr>
+          <w:sz w:val="24"/>
+          <w:szCs w:val="24"/>
+        </w:rPr>
+        <w:t>Cliente (Recensione) si riferisce a Codice Fiscale (Cliente)</w:t>
+      </w:r>
+    </w:p>
+    <w:p>
+      <w:pPr>
+        <w:tabs>
+          <w:tab w:val="left" w:pos="1404"/>
+        </w:tabs>
+        <w:rPr>
+          <w:sz w:val="24"/>
+          <w:szCs w:val="24"/>
+        </w:rPr>
+      </w:pPr>
+      <w:r>
+        <w:rPr>
+          <w:sz w:val="24"/>
+          <w:szCs w:val="24"/>
+        </w:rPr>
+        <w:t>Merchandise (Valutare Merchandise) si riferisce a ID_Prodotto (Merchandise)</w:t>
+      </w:r>
+    </w:p>
+    <w:p>
+      <w:pPr>
+        <w:tabs>
+          <w:tab w:val="left" w:pos="1404"/>
+        </w:tabs>
+        <w:rPr>
+          <w:sz w:val="24"/>
+          <w:szCs w:val="24"/>
+        </w:rPr>
+      </w:pPr>
+      <w:r>
+        <w:rPr>
+          <w:sz w:val="24"/>
+          <w:szCs w:val="24"/>
+        </w:rPr>
+        <w:t>Recensione (Valutare merchandise) si riferisce a ID_Recensione (Recensione)</w:t>
+      </w:r>
+    </w:p>
+    <w:p>
+      <w:pPr>
+        <w:tabs>
+          <w:tab w:val="left" w:pos="1404"/>
+        </w:tabs>
+        <w:rPr>
+          <w:sz w:val="24"/>
+          <w:szCs w:val="24"/>
+        </w:rPr>
+      </w:pPr>
+      <w:r>
+        <w:rPr>
+          <w:sz w:val="24"/>
+          <w:szCs w:val="24"/>
+        </w:rPr>
+        <w:t>Cliente (Valutare Merchandise) si riferisce a Codice Fiscale (Cliente)</w:t>
+      </w:r>
+    </w:p>
+    <w:p>
+      <w:pPr>
+        <w:tabs>
+          <w:tab w:val="left" w:pos="1404"/>
+        </w:tabs>
+        <w:rPr>
+          <w:sz w:val="24"/>
+          <w:szCs w:val="24"/>
+        </w:rPr>
+      </w:pPr>
+      <w:r>
+        <w:rPr>
+          <w:sz w:val="24"/>
+          <w:szCs w:val="24"/>
+        </w:rPr>
+        <w:t>Cliente (casella postale) si riferisce a Codice fiscale (cliente)</w:t>
+      </w:r>
+    </w:p>
+    <w:p>
+      <w:pPr>
+        <w:tabs>
+          <w:tab w:val="left" w:pos="1404"/>
+        </w:tabs>
+        <w:rPr>
+          <w:sz w:val="24"/>
+          <w:szCs w:val="24"/>
+        </w:rPr>
+      </w:pPr>
+      <w:r>
+        <w:rPr>
+          <w:sz w:val="24"/>
+          <w:szCs w:val="24"/>
+        </w:rPr>
+        <w:t>Ordine (Contenere Merchandise) si riferisce a Codice Ordine (Ordine)</w:t>
+      </w:r>
+    </w:p>
+    <w:p>
+      <w:pPr>
+        <w:tabs>
+          <w:tab w:val="left" w:pos="1404"/>
+        </w:tabs>
+        <w:rPr>
+          <w:sz w:val="24"/>
+          <w:szCs w:val="24"/>
+        </w:rPr>
+      </w:pPr>
+      <w:r>
+        <w:rPr>
+          <w:sz w:val="24"/>
+          <w:szCs w:val="24"/>
+        </w:rPr>
+        <w:lastRenderedPageBreak/>
+        <w:t>Ordine (Contenere Merchandise) si riferisce a Codice Ordine (Ordine)</w:t>
+      </w:r>
+    </w:p>
+    <w:p>
+      <w:pPr>
+        <w:tabs>
+          <w:tab w:val="left" w:pos="1404"/>
+        </w:tabs>
+        <w:rPr>
+          <w:sz w:val="24"/>
+          <w:szCs w:val="24"/>
+        </w:rPr>
+      </w:pPr>
+      <w:r>
+        <w:rPr>
+          <w:sz w:val="24"/>
+          <w:szCs w:val="24"/>
+        </w:rPr>
+        <w:t>Cliente (Ordine) si riferisce a Codice Fiscale (Cliente)</w:t>
+      </w:r>
+    </w:p>
+    <w:p>
+      <w:pPr>
+        <w:tabs>
+          <w:tab w:val="left" w:pos="1404"/>
+        </w:tabs>
+        <w:rPr>
+          <w:b/>
+          <w:bCs/>
+          <w:sz w:val="36"/>
+          <w:szCs w:val="36"/>
+        </w:rPr>
+      </w:pPr>
+    </w:p>
+    <w:p>
+      <w:pPr>
+        <w:tabs>
+          <w:tab w:val="left" w:pos="1404"/>
+        </w:tabs>
+        <w:rPr>
+          <w:b/>
+          <w:bCs/>
+          <w:sz w:val="36"/>
+          <w:szCs w:val="36"/>
+        </w:rPr>
+      </w:pPr>
+    </w:p>
+    <w:p>
+      <w:pPr>
+        <w:tabs>
+          <w:tab w:val="left" w:pos="1404"/>
+        </w:tabs>
+        <w:rPr>
+          <w:b/>
+          <w:bCs/>
+          <w:sz w:val="36"/>
+          <w:szCs w:val="36"/>
+        </w:rPr>
+      </w:pPr>
+    </w:p>
+    <w:p>
+      <w:pPr>
+        <w:tabs>
+          <w:tab w:val="left" w:pos="1404"/>
+        </w:tabs>
+        <w:rPr>
+          <w:b/>
+          <w:bCs/>
+          <w:sz w:val="36"/>
+          <w:szCs w:val="36"/>
+        </w:rPr>
+      </w:pPr>
+      <w:r>
+        <w:rPr>
+          <w:b/>
+          <w:bCs/>
+          <w:sz w:val="36"/>
+          <w:szCs w:val="36"/>
+        </w:rPr>
+        <w:t>Operazioni</w:t>
+      </w:r>
+    </w:p>
+    <w:p>
+      <w:pPr>
+        <w:tabs>
+          <w:tab w:val="left" w:pos="1404"/>
+        </w:tabs>
+        <w:rPr>
+          <w:b/>
+          <w:bCs/>
+          <w:sz w:val="36"/>
+          <w:szCs w:val="36"/>
+          <w:u w:val="single"/>
+        </w:rPr>
+      </w:pPr>
+    </w:p>
+    <w:p>
+      <w:pPr>
+        <w:tabs>
+          <w:tab w:val="left" w:pos="1404"/>
+        </w:tabs>
       </w:pPr>
     </w:p>
     <w:sectPr>
@@ -2201,6 +5039,7 @@
   <w:style w:type="paragraph" w:default="1" w:styleId="Normale">
     <w:name w:val="Normal"/>
     <w:qFormat/>
+    <w:rsid w:val="00B15879"/>
   </w:style>
   <w:style w:type="paragraph" w:styleId="Titolo1">
     <w:name w:val="heading 1"/>

</xml_diff>

<commit_message>
Creazione tabelle sql mancano le ultime 4 schema relazionale
</commit_message>
<xml_diff>
--- a/documentazione progetto.docx
+++ b/documentazione progetto.docx
@@ -1,6 +1,6 @@
 
 <file path=word/document.xml><?xml version="1.0" encoding="utf-8"?>
-<w:document xmlns:wpc="http://schemas.microsoft.com/office/word/2010/wordprocessingCanvas" xmlns:cx="http://schemas.microsoft.com/office/drawing/2014/chartex" xmlns:cx1="http://schemas.microsoft.com/office/drawing/2015/9/8/chartex" xmlns:cx2="http://schemas.microsoft.com/office/drawing/2015/10/21/chartex" xmlns:cx3="http://schemas.microsoft.com/office/drawing/2016/5/9/chartex" xmlns:cx4="http://schemas.microsoft.com/office/drawing/2016/5/10/chartex" xmlns:cx5="http://schemas.microsoft.com/office/drawing/2016/5/11/chartex" xmlns:cx6="http://schemas.microsoft.com/office/drawing/2016/5/12/chartex" xmlns:cx7="http://schemas.microsoft.com/office/drawing/2016/5/13/chartex" xmlns:cx8="http://schemas.microsoft.com/office/drawing/2016/5/14/chartex" xmlns:mc="http://schemas.openxmlformats.org/markup-compatibility/2006" xmlns:aink="http://schemas.microsoft.com/office/drawing/2016/ink" xmlns:am3d="http://schemas.microsoft.com/office/drawing/2017/model3d" xmlns:o="urn:schemas-microsoft-com:office:office" xmlns:r="http://schemas.openxmlformats.org/officeDocument/2006/relationships" xmlns:m="http://schemas.openxmlformats.org/officeDocument/2006/math" xmlns:v="urn:schemas-microsoft-com:vml" xmlns:wp14="http://schemas.microsoft.com/office/word/2010/wordprocessingDrawing" xmlns:wp="http://schemas.openxmlformats.org/drawingml/2006/wordprocessingDrawing" xmlns:w10="urn:schemas-microsoft-com:office:word" xmlns:w="http://schemas.openxmlformats.org/wordprocessingml/2006/main" xmlns:w14="http://schemas.microsoft.com/office/word/2010/wordml" xmlns:w15="http://schemas.microsoft.com/office/word/2012/wordml" xmlns:w16cex="http://schemas.microsoft.com/office/word/2018/wordml/cex" xmlns:w16cid="http://schemas.microsoft.com/office/word/2016/wordml/cid" xmlns:w16="http://schemas.microsoft.com/office/word/2018/wordml" xmlns:w16sdtdh="http://schemas.microsoft.com/office/word/2020/wordml/sdtdatahash" xmlns:w16se="http://schemas.microsoft.com/office/word/2015/wordml/symex" xmlns:wpg="http://schemas.microsoft.com/office/word/2010/wordprocessingGroup" xmlns:wpi="http://schemas.microsoft.com/office/word/2010/wordprocessingInk" xmlns:wne="http://schemas.microsoft.com/office/word/2006/wordml" xmlns:wps="http://schemas.microsoft.com/office/word/2010/wordprocessingShape" mc:Ignorable="w14 w15 w16se w16cid w16 w16cex w16sdtdh wp14">
+<w:document xmlns:wpc="http://schemas.microsoft.com/office/word/2010/wordprocessingCanvas" xmlns:cx="http://schemas.microsoft.com/office/drawing/2014/chartex" xmlns:cx1="http://schemas.microsoft.com/office/drawing/2015/9/8/chartex" xmlns:cx2="http://schemas.microsoft.com/office/drawing/2015/10/21/chartex" xmlns:cx3="http://schemas.microsoft.com/office/drawing/2016/5/9/chartex" xmlns:cx4="http://schemas.microsoft.com/office/drawing/2016/5/10/chartex" xmlns:cx5="http://schemas.microsoft.com/office/drawing/2016/5/11/chartex" xmlns:cx6="http://schemas.microsoft.com/office/drawing/2016/5/12/chartex" xmlns:cx7="http://schemas.microsoft.com/office/drawing/2016/5/13/chartex" xmlns:cx8="http://schemas.microsoft.com/office/drawing/2016/5/14/chartex" xmlns:mc="http://schemas.openxmlformats.org/markup-compatibility/2006" xmlns:aink="http://schemas.microsoft.com/office/drawing/2016/ink" xmlns:am3d="http://schemas.microsoft.com/office/drawing/2017/model3d" xmlns:o="urn:schemas-microsoft-com:office:office" xmlns:oel="http://schemas.microsoft.com/office/2019/extlst" xmlns:r="http://schemas.openxmlformats.org/officeDocument/2006/relationships" xmlns:m="http://schemas.openxmlformats.org/officeDocument/2006/math" xmlns:v="urn:schemas-microsoft-com:vml" xmlns:wp14="http://schemas.microsoft.com/office/word/2010/wordprocessingDrawing" xmlns:wp="http://schemas.openxmlformats.org/drawingml/2006/wordprocessingDrawing" xmlns:w10="urn:schemas-microsoft-com:office:word" xmlns:w="http://schemas.openxmlformats.org/wordprocessingml/2006/main" xmlns:w14="http://schemas.microsoft.com/office/word/2010/wordml" xmlns:w15="http://schemas.microsoft.com/office/word/2012/wordml" xmlns:w16cex="http://schemas.microsoft.com/office/word/2018/wordml/cex" xmlns:w16cid="http://schemas.microsoft.com/office/word/2016/wordml/cid" xmlns:w16="http://schemas.microsoft.com/office/word/2018/wordml" xmlns:w16du="http://schemas.microsoft.com/office/word/2023/wordml/word16du" xmlns:w16sdtdh="http://schemas.microsoft.com/office/word/2020/wordml/sdtdatahash" xmlns:w16sdtfl="http://schemas.microsoft.com/office/word/2024/wordml/sdtformatlock" xmlns:w16se="http://schemas.microsoft.com/office/word/2015/wordml/symex" xmlns:wpg="http://schemas.microsoft.com/office/word/2010/wordprocessingGroup" xmlns:wpi="http://schemas.microsoft.com/office/word/2010/wordprocessingInk" xmlns:wne="http://schemas.microsoft.com/office/word/2006/wordml" xmlns:wps="http://schemas.microsoft.com/office/word/2010/wordprocessingShape" mc:Ignorable="w14 w15 w16se w16cid w16 w16cex w16sdtdh w16sdtfl w16du wp14">
   <w:body>
     <w:p>
       <w:pPr>
@@ -3779,6 +3779,7 @@
           <w:sz w:val="36"/>
           <w:szCs w:val="36"/>
         </w:rPr>
+        <w:lastRenderedPageBreak/>
         <w:t>Schema relazionale</w:t>
       </w:r>
     </w:p>
@@ -3847,7 +3848,6 @@
           <w:sz w:val="24"/>
           <w:szCs w:val="24"/>
         </w:rPr>
-        <w:lastRenderedPageBreak/>
         <w:t>Appartenere</w:t>
       </w:r>
       <w:r>
@@ -4577,7 +4577,28 @@
           <w:sz w:val="24"/>
           <w:szCs w:val="24"/>
         </w:rPr>
-        <w:t>Genere</w:t>
+        <w:t xml:space="preserve">Genere </w:t>
+      </w:r>
+      <w:r>
+        <w:rPr>
+          <w:sz w:val="24"/>
+          <w:szCs w:val="24"/>
+        </w:rPr>
+        <w:t>(</w:t>
+      </w:r>
+      <w:r>
+        <w:rPr>
+          <w:sz w:val="24"/>
+          <w:szCs w:val="24"/>
+        </w:rPr>
+        <w:t>Tipo</w:t>
+      </w:r>
+      <w:r>
+        <w:rPr>
+          <w:sz w:val="24"/>
+          <w:szCs w:val="24"/>
+        </w:rPr>
+        <w:t>)</w:t>
       </w:r>
       <w:r>
         <w:rPr>
@@ -4586,6 +4607,24 @@
         </w:rPr>
         <w:t xml:space="preserve"> </w:t>
       </w:r>
+    </w:p>
+    <w:p>
+      <w:pPr>
+        <w:tabs>
+          <w:tab w:val="left" w:pos="1404"/>
+        </w:tabs>
+        <w:rPr>
+          <w:sz w:val="24"/>
+          <w:szCs w:val="24"/>
+        </w:rPr>
+      </w:pPr>
+      <w:r>
+        <w:rPr>
+          <w:sz w:val="24"/>
+          <w:szCs w:val="24"/>
+        </w:rPr>
+        <w:t xml:space="preserve">Appartenere </w:t>
+      </w:r>
       <w:r>
         <w:rPr>
           <w:sz w:val="24"/>
@@ -4598,15 +4637,38 @@
           <w:sz w:val="24"/>
           <w:szCs w:val="24"/>
         </w:rPr>
-        <w:t>T</w:t>
-      </w:r>
-      <w:r>
-        <w:rPr>
-          <w:sz w:val="24"/>
-          <w:szCs w:val="24"/>
-        </w:rPr>
-        <w:t>ipo</w:t>
-      </w:r>
+        <w:t>Videogioco</w:t>
+      </w:r>
+      <w:r>
+        <w:rPr>
+          <w:sz w:val="24"/>
+          <w:szCs w:val="24"/>
+        </w:rPr>
+        <w:t xml:space="preserve">) si riferisce a </w:t>
+      </w:r>
+      <w:r>
+        <w:rPr>
+          <w:sz w:val="24"/>
+          <w:szCs w:val="24"/>
+        </w:rPr>
+        <w:t xml:space="preserve">Videogioco </w:t>
+      </w:r>
+      <w:r>
+        <w:rPr>
+          <w:sz w:val="24"/>
+          <w:szCs w:val="24"/>
+        </w:rPr>
+        <w:t>(</w:t>
+      </w:r>
+      <w:proofErr w:type="spellStart"/>
+      <w:r>
+        <w:rPr>
+          <w:sz w:val="24"/>
+          <w:szCs w:val="24"/>
+        </w:rPr>
+        <w:t>ID_Prodotto</w:t>
+      </w:r>
+      <w:proofErr w:type="spellEnd"/>
       <w:r>
         <w:rPr>
           <w:sz w:val="24"/>
@@ -4614,6 +4676,557 @@
         </w:rPr>
         <w:t>)</w:t>
       </w:r>
+    </w:p>
+    <w:p>
+      <w:pPr>
+        <w:tabs>
+          <w:tab w:val="left" w:pos="1404"/>
+        </w:tabs>
+        <w:rPr>
+          <w:sz w:val="24"/>
+          <w:szCs w:val="24"/>
+        </w:rPr>
+      </w:pPr>
+      <w:r>
+        <w:rPr>
+          <w:sz w:val="24"/>
+          <w:szCs w:val="24"/>
+        </w:rPr>
+        <w:t xml:space="preserve">Valutare Videogioco </w:t>
+      </w:r>
+      <w:r>
+        <w:rPr>
+          <w:sz w:val="24"/>
+          <w:szCs w:val="24"/>
+        </w:rPr>
+        <w:t>(</w:t>
+      </w:r>
+      <w:r>
+        <w:rPr>
+          <w:sz w:val="24"/>
+          <w:szCs w:val="24"/>
+        </w:rPr>
+        <w:t>Videogioco</w:t>
+      </w:r>
+      <w:r>
+        <w:rPr>
+          <w:sz w:val="24"/>
+          <w:szCs w:val="24"/>
+        </w:rPr>
+        <w:t xml:space="preserve">) </w:t>
+      </w:r>
+      <w:r>
+        <w:rPr>
+          <w:sz w:val="24"/>
+          <w:szCs w:val="24"/>
+        </w:rPr>
+        <w:t xml:space="preserve">si riferisce a </w:t>
+      </w:r>
+      <w:r>
+        <w:rPr>
+          <w:sz w:val="24"/>
+          <w:szCs w:val="24"/>
+        </w:rPr>
+        <w:t xml:space="preserve">Videogioco </w:t>
+      </w:r>
+      <w:r>
+        <w:rPr>
+          <w:sz w:val="24"/>
+          <w:szCs w:val="24"/>
+        </w:rPr>
+        <w:t>(</w:t>
+      </w:r>
+      <w:proofErr w:type="spellStart"/>
+      <w:r>
+        <w:rPr>
+          <w:sz w:val="24"/>
+          <w:szCs w:val="24"/>
+        </w:rPr>
+        <w:t>ID_Prodotto</w:t>
+      </w:r>
+      <w:proofErr w:type="spellEnd"/>
+      <w:r>
+        <w:rPr>
+          <w:sz w:val="24"/>
+          <w:szCs w:val="24"/>
+        </w:rPr>
+        <w:t>)</w:t>
+      </w:r>
+    </w:p>
+    <w:p>
+      <w:pPr>
+        <w:tabs>
+          <w:tab w:val="left" w:pos="1404"/>
+        </w:tabs>
+        <w:rPr>
+          <w:sz w:val="24"/>
+          <w:szCs w:val="24"/>
+        </w:rPr>
+      </w:pPr>
+      <w:r>
+        <w:rPr>
+          <w:sz w:val="24"/>
+          <w:szCs w:val="24"/>
+        </w:rPr>
+        <w:t xml:space="preserve">Valutare Videogioco </w:t>
+      </w:r>
+      <w:r>
+        <w:rPr>
+          <w:sz w:val="24"/>
+          <w:szCs w:val="24"/>
+        </w:rPr>
+        <w:t>(</w:t>
+      </w:r>
+      <w:r>
+        <w:rPr>
+          <w:sz w:val="24"/>
+          <w:szCs w:val="24"/>
+        </w:rPr>
+        <w:t>Recensione</w:t>
+      </w:r>
+      <w:r>
+        <w:rPr>
+          <w:sz w:val="24"/>
+          <w:szCs w:val="24"/>
+        </w:rPr>
+        <w:t xml:space="preserve">) si riferisce a </w:t>
+      </w:r>
+      <w:r>
+        <w:rPr>
+          <w:sz w:val="24"/>
+          <w:szCs w:val="24"/>
+        </w:rPr>
+        <w:t xml:space="preserve">Recensione </w:t>
+      </w:r>
+      <w:r>
+        <w:rPr>
+          <w:sz w:val="24"/>
+          <w:szCs w:val="24"/>
+        </w:rPr>
+        <w:t>(</w:t>
+      </w:r>
+      <w:proofErr w:type="spellStart"/>
+      <w:r>
+        <w:rPr>
+          <w:sz w:val="24"/>
+          <w:szCs w:val="24"/>
+        </w:rPr>
+        <w:t>ID_Recensione</w:t>
+      </w:r>
+      <w:proofErr w:type="spellEnd"/>
+      <w:r>
+        <w:rPr>
+          <w:sz w:val="24"/>
+          <w:szCs w:val="24"/>
+        </w:rPr>
+        <w:t>)</w:t>
+      </w:r>
+    </w:p>
+    <w:p>
+      <w:pPr>
+        <w:tabs>
+          <w:tab w:val="left" w:pos="1404"/>
+        </w:tabs>
+        <w:rPr>
+          <w:sz w:val="24"/>
+          <w:szCs w:val="24"/>
+        </w:rPr>
+      </w:pPr>
+      <w:r>
+        <w:rPr>
+          <w:sz w:val="24"/>
+          <w:szCs w:val="24"/>
+        </w:rPr>
+        <w:t xml:space="preserve">Valutare Videogioco </w:t>
+      </w:r>
+      <w:r>
+        <w:rPr>
+          <w:sz w:val="24"/>
+          <w:szCs w:val="24"/>
+        </w:rPr>
+        <w:t>(</w:t>
+      </w:r>
+      <w:r>
+        <w:rPr>
+          <w:sz w:val="24"/>
+          <w:szCs w:val="24"/>
+        </w:rPr>
+        <w:t>Cliente</w:t>
+      </w:r>
+      <w:r>
+        <w:rPr>
+          <w:sz w:val="24"/>
+          <w:szCs w:val="24"/>
+        </w:rPr>
+        <w:t xml:space="preserve">) si riferisce a </w:t>
+      </w:r>
+      <w:r>
+        <w:rPr>
+          <w:sz w:val="24"/>
+          <w:szCs w:val="24"/>
+        </w:rPr>
+        <w:t xml:space="preserve">Cliente </w:t>
+      </w:r>
+      <w:r>
+        <w:rPr>
+          <w:sz w:val="24"/>
+          <w:szCs w:val="24"/>
+        </w:rPr>
+        <w:t>(</w:t>
+      </w:r>
+      <w:r>
+        <w:rPr>
+          <w:sz w:val="24"/>
+          <w:szCs w:val="24"/>
+        </w:rPr>
+        <w:t>Codice Fiscale</w:t>
+      </w:r>
+      <w:r>
+        <w:rPr>
+          <w:sz w:val="24"/>
+          <w:szCs w:val="24"/>
+        </w:rPr>
+        <w:t>)</w:t>
+      </w:r>
+    </w:p>
+    <w:p>
+      <w:pPr>
+        <w:tabs>
+          <w:tab w:val="left" w:pos="1404"/>
+        </w:tabs>
+        <w:rPr>
+          <w:sz w:val="24"/>
+          <w:szCs w:val="24"/>
+        </w:rPr>
+      </w:pPr>
+      <w:r>
+        <w:rPr>
+          <w:sz w:val="24"/>
+          <w:szCs w:val="24"/>
+        </w:rPr>
+        <w:t xml:space="preserve">Recensione </w:t>
+      </w:r>
+      <w:r>
+        <w:rPr>
+          <w:sz w:val="24"/>
+          <w:szCs w:val="24"/>
+        </w:rPr>
+        <w:t>(</w:t>
+      </w:r>
+      <w:r>
+        <w:rPr>
+          <w:sz w:val="24"/>
+          <w:szCs w:val="24"/>
+        </w:rPr>
+        <w:t>Cliente</w:t>
+      </w:r>
+      <w:r>
+        <w:rPr>
+          <w:sz w:val="24"/>
+          <w:szCs w:val="24"/>
+        </w:rPr>
+        <w:t xml:space="preserve">) si riferisce a </w:t>
+      </w:r>
+      <w:r>
+        <w:rPr>
+          <w:sz w:val="24"/>
+          <w:szCs w:val="24"/>
+        </w:rPr>
+        <w:t xml:space="preserve">Cliente </w:t>
+      </w:r>
+      <w:r>
+        <w:rPr>
+          <w:sz w:val="24"/>
+          <w:szCs w:val="24"/>
+        </w:rPr>
+        <w:t>(</w:t>
+      </w:r>
+      <w:r>
+        <w:rPr>
+          <w:sz w:val="24"/>
+          <w:szCs w:val="24"/>
+        </w:rPr>
+        <w:t>Codice Fiscale</w:t>
+      </w:r>
+      <w:r>
+        <w:rPr>
+          <w:sz w:val="24"/>
+          <w:szCs w:val="24"/>
+        </w:rPr>
+        <w:t>)</w:t>
+      </w:r>
+    </w:p>
+    <w:p>
+      <w:pPr>
+        <w:tabs>
+          <w:tab w:val="left" w:pos="1404"/>
+        </w:tabs>
+        <w:rPr>
+          <w:sz w:val="24"/>
+          <w:szCs w:val="24"/>
+        </w:rPr>
+      </w:pPr>
+      <w:r>
+        <w:rPr>
+          <w:sz w:val="24"/>
+          <w:szCs w:val="24"/>
+        </w:rPr>
+        <w:t xml:space="preserve">Valutare Merchandise </w:t>
+      </w:r>
+      <w:r>
+        <w:rPr>
+          <w:sz w:val="24"/>
+          <w:szCs w:val="24"/>
+        </w:rPr>
+        <w:t>(</w:t>
+      </w:r>
+      <w:r>
+        <w:rPr>
+          <w:sz w:val="24"/>
+          <w:szCs w:val="24"/>
+        </w:rPr>
+        <w:t>Merchandise</w:t>
+      </w:r>
+      <w:r>
+        <w:rPr>
+          <w:sz w:val="24"/>
+          <w:szCs w:val="24"/>
+        </w:rPr>
+        <w:t xml:space="preserve">) si riferisce a </w:t>
+      </w:r>
+      <w:r>
+        <w:rPr>
+          <w:sz w:val="24"/>
+          <w:szCs w:val="24"/>
+        </w:rPr>
+        <w:t xml:space="preserve">Merchandise </w:t>
+      </w:r>
+      <w:r>
+        <w:rPr>
+          <w:sz w:val="24"/>
+          <w:szCs w:val="24"/>
+        </w:rPr>
+        <w:t>(</w:t>
+      </w:r>
+      <w:proofErr w:type="spellStart"/>
+      <w:r>
+        <w:rPr>
+          <w:sz w:val="24"/>
+          <w:szCs w:val="24"/>
+        </w:rPr>
+        <w:t>ID_Prodotto</w:t>
+      </w:r>
+      <w:proofErr w:type="spellEnd"/>
+      <w:r>
+        <w:rPr>
+          <w:sz w:val="24"/>
+          <w:szCs w:val="24"/>
+        </w:rPr>
+        <w:t>)</w:t>
+      </w:r>
+    </w:p>
+    <w:p>
+      <w:pPr>
+        <w:tabs>
+          <w:tab w:val="left" w:pos="1404"/>
+        </w:tabs>
+        <w:rPr>
+          <w:sz w:val="24"/>
+          <w:szCs w:val="24"/>
+        </w:rPr>
+      </w:pPr>
+      <w:r>
+        <w:rPr>
+          <w:sz w:val="24"/>
+          <w:szCs w:val="24"/>
+        </w:rPr>
+        <w:t xml:space="preserve">Valutare merchandise </w:t>
+      </w:r>
+      <w:r>
+        <w:rPr>
+          <w:sz w:val="24"/>
+          <w:szCs w:val="24"/>
+        </w:rPr>
+        <w:t>(</w:t>
+      </w:r>
+      <w:r>
+        <w:rPr>
+          <w:sz w:val="24"/>
+          <w:szCs w:val="24"/>
+        </w:rPr>
+        <w:t>Recensione</w:t>
+      </w:r>
+      <w:r>
+        <w:rPr>
+          <w:sz w:val="24"/>
+          <w:szCs w:val="24"/>
+        </w:rPr>
+        <w:t xml:space="preserve">) si riferisce a </w:t>
+      </w:r>
+      <w:r>
+        <w:rPr>
+          <w:sz w:val="24"/>
+          <w:szCs w:val="24"/>
+        </w:rPr>
+        <w:t xml:space="preserve">Recensione </w:t>
+      </w:r>
+      <w:r>
+        <w:rPr>
+          <w:sz w:val="24"/>
+          <w:szCs w:val="24"/>
+        </w:rPr>
+        <w:t>(</w:t>
+      </w:r>
+      <w:proofErr w:type="spellStart"/>
+      <w:r>
+        <w:rPr>
+          <w:sz w:val="24"/>
+          <w:szCs w:val="24"/>
+        </w:rPr>
+        <w:t>ID_Recensione</w:t>
+      </w:r>
+      <w:proofErr w:type="spellEnd"/>
+      <w:r>
+        <w:rPr>
+          <w:sz w:val="24"/>
+          <w:szCs w:val="24"/>
+        </w:rPr>
+        <w:t>)</w:t>
+      </w:r>
+    </w:p>
+    <w:p>
+      <w:pPr>
+        <w:tabs>
+          <w:tab w:val="left" w:pos="1404"/>
+        </w:tabs>
+        <w:rPr>
+          <w:sz w:val="24"/>
+          <w:szCs w:val="24"/>
+        </w:rPr>
+      </w:pPr>
+      <w:r>
+        <w:rPr>
+          <w:sz w:val="24"/>
+          <w:szCs w:val="24"/>
+        </w:rPr>
+        <w:t xml:space="preserve">Valutare Merchandise </w:t>
+      </w:r>
+      <w:r>
+        <w:rPr>
+          <w:sz w:val="24"/>
+          <w:szCs w:val="24"/>
+        </w:rPr>
+        <w:t>(</w:t>
+      </w:r>
+      <w:r>
+        <w:rPr>
+          <w:sz w:val="24"/>
+          <w:szCs w:val="24"/>
+        </w:rPr>
+        <w:t>Cliente</w:t>
+      </w:r>
+      <w:r>
+        <w:rPr>
+          <w:sz w:val="24"/>
+          <w:szCs w:val="24"/>
+        </w:rPr>
+        <w:t xml:space="preserve">) si riferisce a </w:t>
+      </w:r>
+      <w:r>
+        <w:rPr>
+          <w:sz w:val="24"/>
+          <w:szCs w:val="24"/>
+        </w:rPr>
+        <w:t xml:space="preserve">Cliente </w:t>
+      </w:r>
+      <w:r>
+        <w:rPr>
+          <w:sz w:val="24"/>
+          <w:szCs w:val="24"/>
+        </w:rPr>
+        <w:t>(</w:t>
+      </w:r>
+      <w:r>
+        <w:rPr>
+          <w:sz w:val="24"/>
+          <w:szCs w:val="24"/>
+        </w:rPr>
+        <w:t>Codice Fiscale</w:t>
+      </w:r>
+      <w:r>
+        <w:rPr>
+          <w:sz w:val="24"/>
+          <w:szCs w:val="24"/>
+        </w:rPr>
+        <w:t>)</w:t>
+      </w:r>
+    </w:p>
+    <w:p>
+      <w:pPr>
+        <w:tabs>
+          <w:tab w:val="left" w:pos="1404"/>
+        </w:tabs>
+        <w:rPr>
+          <w:sz w:val="24"/>
+          <w:szCs w:val="24"/>
+        </w:rPr>
+      </w:pPr>
+      <w:r>
+        <w:rPr>
+          <w:sz w:val="24"/>
+          <w:szCs w:val="24"/>
+        </w:rPr>
+        <w:t xml:space="preserve">Casella Postale </w:t>
+      </w:r>
+      <w:r>
+        <w:rPr>
+          <w:sz w:val="24"/>
+          <w:szCs w:val="24"/>
+        </w:rPr>
+        <w:t>(</w:t>
+      </w:r>
+      <w:r>
+        <w:rPr>
+          <w:sz w:val="24"/>
+          <w:szCs w:val="24"/>
+        </w:rPr>
+        <w:t>Cliente</w:t>
+      </w:r>
+      <w:r>
+        <w:rPr>
+          <w:sz w:val="24"/>
+          <w:szCs w:val="24"/>
+        </w:rPr>
+        <w:t xml:space="preserve">) si riferisce a </w:t>
+      </w:r>
+      <w:r>
+        <w:rPr>
+          <w:sz w:val="24"/>
+          <w:szCs w:val="24"/>
+        </w:rPr>
+        <w:t xml:space="preserve">Cliente </w:t>
+      </w:r>
+      <w:r>
+        <w:rPr>
+          <w:sz w:val="24"/>
+          <w:szCs w:val="24"/>
+        </w:rPr>
+        <w:t>(</w:t>
+      </w:r>
+      <w:r>
+        <w:rPr>
+          <w:sz w:val="24"/>
+          <w:szCs w:val="24"/>
+        </w:rPr>
+        <w:t>Codice fiscale</w:t>
+      </w:r>
+      <w:r>
+        <w:rPr>
+          <w:sz w:val="24"/>
+          <w:szCs w:val="24"/>
+        </w:rPr>
+        <w:t>)</w:t>
+      </w:r>
       <w:r>
         <w:rPr>
           <w:sz w:val="24"/>
@@ -4637,14 +5250,7 @@
           <w:sz w:val="24"/>
           <w:szCs w:val="24"/>
         </w:rPr>
-        <w:t>Appartenere</w:t>
-      </w:r>
-      <w:r>
-        <w:rPr>
-          <w:sz w:val="24"/>
-          <w:szCs w:val="24"/>
-        </w:rPr>
-        <w:t xml:space="preserve"> </w:t>
+        <w:t xml:space="preserve">Contenere Merchandise </w:t>
       </w:r>
       <w:r>
         <w:rPr>
@@ -4658,7 +5264,7 @@
           <w:sz w:val="24"/>
           <w:szCs w:val="24"/>
         </w:rPr>
-        <w:t>Videogioco</w:t>
+        <w:t>Ordine</w:t>
       </w:r>
       <w:r>
         <w:rPr>
@@ -4672,14 +5278,7 @@
           <w:sz w:val="24"/>
           <w:szCs w:val="24"/>
         </w:rPr>
-        <w:t>Videogioco</w:t>
-      </w:r>
-      <w:r>
-        <w:rPr>
-          <w:sz w:val="24"/>
-          <w:szCs w:val="24"/>
-        </w:rPr>
-        <w:t xml:space="preserve"> </w:t>
+        <w:t xml:space="preserve">Ordine </w:t>
       </w:r>
       <w:r>
         <w:rPr>
@@ -4688,15 +5287,13 @@
         </w:rPr>
         <w:t>(</w:t>
       </w:r>
-      <w:proofErr w:type="spellStart"/>
-      <w:r>
-        <w:rPr>
-          <w:sz w:val="24"/>
-          <w:szCs w:val="24"/>
-        </w:rPr>
-        <w:t>ID_Prodotto</w:t>
-      </w:r>
-      <w:proofErr w:type="spellEnd"/>
+      <w:r>
+        <w:rPr>
+          <w:sz w:val="24"/>
+          <w:szCs w:val="24"/>
+        </w:rPr>
+        <w:t>Codice Ordine</w:t>
+      </w:r>
       <w:r>
         <w:rPr>
           <w:sz w:val="24"/>
@@ -4720,14 +5317,8 @@
           <w:sz w:val="24"/>
           <w:szCs w:val="24"/>
         </w:rPr>
-        <w:t>Valutare Videogioco</w:t>
-      </w:r>
-      <w:r>
-        <w:rPr>
-          <w:sz w:val="24"/>
-          <w:szCs w:val="24"/>
-        </w:rPr>
-        <w:t xml:space="preserve"> </w:t>
+        <w:lastRenderedPageBreak/>
+        <w:t xml:space="preserve">Contenere Merchandise </w:t>
       </w:r>
       <w:r>
         <w:rPr>
@@ -4741,35 +5332,21 @@
           <w:sz w:val="24"/>
           <w:szCs w:val="24"/>
         </w:rPr>
-        <w:t>Videogioco</w:t>
-      </w:r>
-      <w:r>
-        <w:rPr>
-          <w:sz w:val="24"/>
-          <w:szCs w:val="24"/>
-        </w:rPr>
-        <w:t xml:space="preserve">) </w:t>
-      </w:r>
-      <w:r>
-        <w:rPr>
-          <w:sz w:val="24"/>
-          <w:szCs w:val="24"/>
-        </w:rPr>
-        <w:t xml:space="preserve">si riferisce a </w:t>
-      </w:r>
-      <w:r>
-        <w:rPr>
-          <w:sz w:val="24"/>
-          <w:szCs w:val="24"/>
-        </w:rPr>
-        <w:t>Videogioco</w:t>
-      </w:r>
-      <w:r>
-        <w:rPr>
-          <w:sz w:val="24"/>
-          <w:szCs w:val="24"/>
-        </w:rPr>
-        <w:t xml:space="preserve"> </w:t>
+        <w:t>Ordine</w:t>
+      </w:r>
+      <w:r>
+        <w:rPr>
+          <w:sz w:val="24"/>
+          <w:szCs w:val="24"/>
+        </w:rPr>
+        <w:t xml:space="preserve">) si riferisce a </w:t>
+      </w:r>
+      <w:r>
+        <w:rPr>
+          <w:sz w:val="24"/>
+          <w:szCs w:val="24"/>
+        </w:rPr>
+        <w:t xml:space="preserve">Ordine </w:t>
       </w:r>
       <w:r>
         <w:rPr>
@@ -4778,15 +5355,13 @@
         </w:rPr>
         <w:t>(</w:t>
       </w:r>
-      <w:proofErr w:type="spellStart"/>
-      <w:r>
-        <w:rPr>
-          <w:sz w:val="24"/>
-          <w:szCs w:val="24"/>
-        </w:rPr>
-        <w:t>ID_Prodotto</w:t>
-      </w:r>
-      <w:proofErr w:type="spellEnd"/>
+      <w:r>
+        <w:rPr>
+          <w:sz w:val="24"/>
+          <w:szCs w:val="24"/>
+        </w:rPr>
+        <w:t>Codice Ordine</w:t>
+      </w:r>
       <w:r>
         <w:rPr>
           <w:sz w:val="24"/>
@@ -4810,14 +5385,7 @@
           <w:sz w:val="24"/>
           <w:szCs w:val="24"/>
         </w:rPr>
-        <w:t>Valutare Videogioco</w:t>
-      </w:r>
-      <w:r>
-        <w:rPr>
-          <w:sz w:val="24"/>
-          <w:szCs w:val="24"/>
-        </w:rPr>
-        <w:t xml:space="preserve"> </w:t>
+        <w:t xml:space="preserve">Ordine </w:t>
       </w:r>
       <w:r>
         <w:rPr>
@@ -4831,7 +5399,7 @@
           <w:sz w:val="24"/>
           <w:szCs w:val="24"/>
         </w:rPr>
-        <w:t>Recensione</w:t>
+        <w:t>Cliente</w:t>
       </w:r>
       <w:r>
         <w:rPr>
@@ -4845,777 +5413,7 @@
           <w:sz w:val="24"/>
           <w:szCs w:val="24"/>
         </w:rPr>
-        <w:t>Recensione</w:t>
-      </w:r>
-      <w:r>
-        <w:rPr>
-          <w:sz w:val="24"/>
-          <w:szCs w:val="24"/>
-        </w:rPr>
-        <w:t xml:space="preserve"> </w:t>
-      </w:r>
-      <w:r>
-        <w:rPr>
-          <w:sz w:val="24"/>
-          <w:szCs w:val="24"/>
-        </w:rPr>
-        <w:t>(</w:t>
-      </w:r>
-      <w:proofErr w:type="spellStart"/>
-      <w:r>
-        <w:rPr>
-          <w:sz w:val="24"/>
-          <w:szCs w:val="24"/>
-        </w:rPr>
-        <w:t>ID_Recensione</w:t>
-      </w:r>
-      <w:proofErr w:type="spellEnd"/>
-      <w:r>
-        <w:rPr>
-          <w:sz w:val="24"/>
-          <w:szCs w:val="24"/>
-        </w:rPr>
-        <w:t>)</w:t>
-      </w:r>
-    </w:p>
-    <w:p>
-      <w:pPr>
-        <w:tabs>
-          <w:tab w:val="left" w:pos="1404"/>
-        </w:tabs>
-        <w:rPr>
-          <w:sz w:val="24"/>
-          <w:szCs w:val="24"/>
-        </w:rPr>
-      </w:pPr>
-      <w:r>
-        <w:rPr>
-          <w:sz w:val="24"/>
-          <w:szCs w:val="24"/>
-        </w:rPr>
-        <w:t>Valutare Videogioco</w:t>
-      </w:r>
-      <w:r>
-        <w:rPr>
-          <w:sz w:val="24"/>
-          <w:szCs w:val="24"/>
-        </w:rPr>
-        <w:t xml:space="preserve"> </w:t>
-      </w:r>
-      <w:r>
-        <w:rPr>
-          <w:sz w:val="24"/>
-          <w:szCs w:val="24"/>
-        </w:rPr>
-        <w:t>(</w:t>
-      </w:r>
-      <w:r>
-        <w:rPr>
-          <w:sz w:val="24"/>
-          <w:szCs w:val="24"/>
-        </w:rPr>
-        <w:t>Cliente</w:t>
-      </w:r>
-      <w:r>
-        <w:rPr>
-          <w:sz w:val="24"/>
-          <w:szCs w:val="24"/>
-        </w:rPr>
-        <w:t xml:space="preserve">) si riferisce a </w:t>
-      </w:r>
-      <w:r>
-        <w:rPr>
-          <w:sz w:val="24"/>
-          <w:szCs w:val="24"/>
-        </w:rPr>
-        <w:t>Cliente</w:t>
-      </w:r>
-      <w:r>
-        <w:rPr>
-          <w:sz w:val="24"/>
-          <w:szCs w:val="24"/>
-        </w:rPr>
-        <w:t xml:space="preserve"> </w:t>
-      </w:r>
-      <w:r>
-        <w:rPr>
-          <w:sz w:val="24"/>
-          <w:szCs w:val="24"/>
-        </w:rPr>
-        <w:t>(</w:t>
-      </w:r>
-      <w:r>
-        <w:rPr>
-          <w:sz w:val="24"/>
-          <w:szCs w:val="24"/>
-        </w:rPr>
-        <w:t>Codice Fiscale</w:t>
-      </w:r>
-      <w:r>
-        <w:rPr>
-          <w:sz w:val="24"/>
-          <w:szCs w:val="24"/>
-        </w:rPr>
-        <w:t>)</w:t>
-      </w:r>
-    </w:p>
-    <w:p>
-      <w:pPr>
-        <w:tabs>
-          <w:tab w:val="left" w:pos="1404"/>
-        </w:tabs>
-        <w:rPr>
-          <w:sz w:val="24"/>
-          <w:szCs w:val="24"/>
-        </w:rPr>
-      </w:pPr>
-      <w:r>
-        <w:rPr>
-          <w:sz w:val="24"/>
-          <w:szCs w:val="24"/>
-        </w:rPr>
-        <w:t>Recensione</w:t>
-      </w:r>
-      <w:r>
-        <w:rPr>
-          <w:sz w:val="24"/>
-          <w:szCs w:val="24"/>
-        </w:rPr>
-        <w:t xml:space="preserve"> </w:t>
-      </w:r>
-      <w:r>
-        <w:rPr>
-          <w:sz w:val="24"/>
-          <w:szCs w:val="24"/>
-        </w:rPr>
-        <w:t>(</w:t>
-      </w:r>
-      <w:r>
-        <w:rPr>
-          <w:sz w:val="24"/>
-          <w:szCs w:val="24"/>
-        </w:rPr>
-        <w:t>Cliente</w:t>
-      </w:r>
-      <w:r>
-        <w:rPr>
-          <w:sz w:val="24"/>
-          <w:szCs w:val="24"/>
-        </w:rPr>
-        <w:t xml:space="preserve">) si riferisce a </w:t>
-      </w:r>
-      <w:r>
-        <w:rPr>
-          <w:sz w:val="24"/>
-          <w:szCs w:val="24"/>
-        </w:rPr>
-        <w:t>Cliente</w:t>
-      </w:r>
-      <w:r>
-        <w:rPr>
-          <w:sz w:val="24"/>
-          <w:szCs w:val="24"/>
-        </w:rPr>
-        <w:t xml:space="preserve"> </w:t>
-      </w:r>
-      <w:r>
-        <w:rPr>
-          <w:sz w:val="24"/>
-          <w:szCs w:val="24"/>
-        </w:rPr>
-        <w:t>(</w:t>
-      </w:r>
-      <w:r>
-        <w:rPr>
-          <w:sz w:val="24"/>
-          <w:szCs w:val="24"/>
-        </w:rPr>
-        <w:t>Codice Fiscale</w:t>
-      </w:r>
-      <w:r>
-        <w:rPr>
-          <w:sz w:val="24"/>
-          <w:szCs w:val="24"/>
-        </w:rPr>
-        <w:t>)</w:t>
-      </w:r>
-    </w:p>
-    <w:p>
-      <w:pPr>
-        <w:tabs>
-          <w:tab w:val="left" w:pos="1404"/>
-        </w:tabs>
-        <w:rPr>
-          <w:sz w:val="24"/>
-          <w:szCs w:val="24"/>
-        </w:rPr>
-      </w:pPr>
-      <w:r>
-        <w:rPr>
-          <w:sz w:val="24"/>
-          <w:szCs w:val="24"/>
-        </w:rPr>
-        <w:t>Valutare Merchandise</w:t>
-      </w:r>
-      <w:r>
-        <w:rPr>
-          <w:sz w:val="24"/>
-          <w:szCs w:val="24"/>
-        </w:rPr>
-        <w:t xml:space="preserve"> </w:t>
-      </w:r>
-      <w:r>
-        <w:rPr>
-          <w:sz w:val="24"/>
-          <w:szCs w:val="24"/>
-        </w:rPr>
-        <w:t>(</w:t>
-      </w:r>
-      <w:r>
-        <w:rPr>
-          <w:sz w:val="24"/>
-          <w:szCs w:val="24"/>
-        </w:rPr>
-        <w:t>Merchandise</w:t>
-      </w:r>
-      <w:r>
-        <w:rPr>
-          <w:sz w:val="24"/>
-          <w:szCs w:val="24"/>
-        </w:rPr>
-        <w:t xml:space="preserve">) si riferisce a </w:t>
-      </w:r>
-      <w:r>
-        <w:rPr>
-          <w:sz w:val="24"/>
-          <w:szCs w:val="24"/>
-        </w:rPr>
-        <w:t>Merchandise</w:t>
-      </w:r>
-      <w:r>
-        <w:rPr>
-          <w:sz w:val="24"/>
-          <w:szCs w:val="24"/>
-        </w:rPr>
-        <w:t xml:space="preserve"> </w:t>
-      </w:r>
-      <w:r>
-        <w:rPr>
-          <w:sz w:val="24"/>
-          <w:szCs w:val="24"/>
-        </w:rPr>
-        <w:t>(</w:t>
-      </w:r>
-      <w:proofErr w:type="spellStart"/>
-      <w:r>
-        <w:rPr>
-          <w:sz w:val="24"/>
-          <w:szCs w:val="24"/>
-        </w:rPr>
-        <w:t>ID_Prodotto</w:t>
-      </w:r>
-      <w:proofErr w:type="spellEnd"/>
-      <w:r>
-        <w:rPr>
-          <w:sz w:val="24"/>
-          <w:szCs w:val="24"/>
-        </w:rPr>
-        <w:t>)</w:t>
-      </w:r>
-    </w:p>
-    <w:p>
-      <w:pPr>
-        <w:tabs>
-          <w:tab w:val="left" w:pos="1404"/>
-        </w:tabs>
-        <w:rPr>
-          <w:sz w:val="24"/>
-          <w:szCs w:val="24"/>
-        </w:rPr>
-      </w:pPr>
-      <w:r>
-        <w:rPr>
-          <w:sz w:val="24"/>
-          <w:szCs w:val="24"/>
-        </w:rPr>
-        <w:t>Valutare merchandise</w:t>
-      </w:r>
-      <w:r>
-        <w:rPr>
-          <w:sz w:val="24"/>
-          <w:szCs w:val="24"/>
-        </w:rPr>
-        <w:t xml:space="preserve"> </w:t>
-      </w:r>
-      <w:r>
-        <w:rPr>
-          <w:sz w:val="24"/>
-          <w:szCs w:val="24"/>
-        </w:rPr>
-        <w:t>(</w:t>
-      </w:r>
-      <w:r>
-        <w:rPr>
-          <w:sz w:val="24"/>
-          <w:szCs w:val="24"/>
-        </w:rPr>
-        <w:t>Recensione</w:t>
-      </w:r>
-      <w:r>
-        <w:rPr>
-          <w:sz w:val="24"/>
-          <w:szCs w:val="24"/>
-        </w:rPr>
-        <w:t xml:space="preserve">) si riferisce a </w:t>
-      </w:r>
-      <w:r>
-        <w:rPr>
-          <w:sz w:val="24"/>
-          <w:szCs w:val="24"/>
-        </w:rPr>
-        <w:t>Recensione</w:t>
-      </w:r>
-      <w:r>
-        <w:rPr>
-          <w:sz w:val="24"/>
-          <w:szCs w:val="24"/>
-        </w:rPr>
-        <w:t xml:space="preserve"> </w:t>
-      </w:r>
-      <w:r>
-        <w:rPr>
-          <w:sz w:val="24"/>
-          <w:szCs w:val="24"/>
-        </w:rPr>
-        <w:t>(</w:t>
-      </w:r>
-      <w:proofErr w:type="spellStart"/>
-      <w:r>
-        <w:rPr>
-          <w:sz w:val="24"/>
-          <w:szCs w:val="24"/>
-        </w:rPr>
-        <w:t>ID_Recensione</w:t>
-      </w:r>
-      <w:proofErr w:type="spellEnd"/>
-      <w:r>
-        <w:rPr>
-          <w:sz w:val="24"/>
-          <w:szCs w:val="24"/>
-        </w:rPr>
-        <w:t>)</w:t>
-      </w:r>
-    </w:p>
-    <w:p>
-      <w:pPr>
-        <w:tabs>
-          <w:tab w:val="left" w:pos="1404"/>
-        </w:tabs>
-        <w:rPr>
-          <w:sz w:val="24"/>
-          <w:szCs w:val="24"/>
-        </w:rPr>
-      </w:pPr>
-      <w:r>
-        <w:rPr>
-          <w:sz w:val="24"/>
-          <w:szCs w:val="24"/>
-        </w:rPr>
-        <w:t>Valutare Merchandise</w:t>
-      </w:r>
-      <w:r>
-        <w:rPr>
-          <w:sz w:val="24"/>
-          <w:szCs w:val="24"/>
-        </w:rPr>
-        <w:t xml:space="preserve"> </w:t>
-      </w:r>
-      <w:r>
-        <w:rPr>
-          <w:sz w:val="24"/>
-          <w:szCs w:val="24"/>
-        </w:rPr>
-        <w:t>(</w:t>
-      </w:r>
-      <w:r>
-        <w:rPr>
-          <w:sz w:val="24"/>
-          <w:szCs w:val="24"/>
-        </w:rPr>
-        <w:t>Cliente</w:t>
-      </w:r>
-      <w:r>
-        <w:rPr>
-          <w:sz w:val="24"/>
-          <w:szCs w:val="24"/>
-        </w:rPr>
-        <w:t xml:space="preserve">) si riferisce a </w:t>
-      </w:r>
-      <w:r>
-        <w:rPr>
-          <w:sz w:val="24"/>
-          <w:szCs w:val="24"/>
-        </w:rPr>
-        <w:t>Cliente</w:t>
-      </w:r>
-      <w:r>
-        <w:rPr>
-          <w:sz w:val="24"/>
-          <w:szCs w:val="24"/>
-        </w:rPr>
-        <w:t xml:space="preserve"> </w:t>
-      </w:r>
-      <w:r>
-        <w:rPr>
-          <w:sz w:val="24"/>
-          <w:szCs w:val="24"/>
-        </w:rPr>
-        <w:t>(</w:t>
-      </w:r>
-      <w:r>
-        <w:rPr>
-          <w:sz w:val="24"/>
-          <w:szCs w:val="24"/>
-        </w:rPr>
-        <w:t>Codice Fiscale</w:t>
-      </w:r>
-      <w:r>
-        <w:rPr>
-          <w:sz w:val="24"/>
-          <w:szCs w:val="24"/>
-        </w:rPr>
-        <w:t>)</w:t>
-      </w:r>
-    </w:p>
-    <w:p>
-      <w:pPr>
-        <w:tabs>
-          <w:tab w:val="left" w:pos="1404"/>
-        </w:tabs>
-        <w:rPr>
-          <w:sz w:val="24"/>
-          <w:szCs w:val="24"/>
-        </w:rPr>
-      </w:pPr>
-      <w:r>
-        <w:rPr>
-          <w:sz w:val="24"/>
-          <w:szCs w:val="24"/>
-        </w:rPr>
-        <w:t>C</w:t>
-      </w:r>
-      <w:r>
-        <w:rPr>
-          <w:sz w:val="24"/>
-          <w:szCs w:val="24"/>
-        </w:rPr>
-        <w:t xml:space="preserve">asella </w:t>
-      </w:r>
-      <w:r>
-        <w:rPr>
-          <w:sz w:val="24"/>
-          <w:szCs w:val="24"/>
-        </w:rPr>
-        <w:t>P</w:t>
-      </w:r>
-      <w:r>
-        <w:rPr>
-          <w:sz w:val="24"/>
-          <w:szCs w:val="24"/>
-        </w:rPr>
-        <w:t>ostale</w:t>
-      </w:r>
-      <w:r>
-        <w:rPr>
-          <w:sz w:val="24"/>
-          <w:szCs w:val="24"/>
-        </w:rPr>
-        <w:t xml:space="preserve"> </w:t>
-      </w:r>
-      <w:r>
-        <w:rPr>
-          <w:sz w:val="24"/>
-          <w:szCs w:val="24"/>
-        </w:rPr>
-        <w:t>(</w:t>
-      </w:r>
-      <w:r>
-        <w:rPr>
-          <w:sz w:val="24"/>
-          <w:szCs w:val="24"/>
-        </w:rPr>
-        <w:t>Cliente</w:t>
-      </w:r>
-      <w:r>
-        <w:rPr>
-          <w:sz w:val="24"/>
-          <w:szCs w:val="24"/>
-        </w:rPr>
-        <w:t xml:space="preserve">) si riferisce a </w:t>
-      </w:r>
-      <w:r>
-        <w:rPr>
-          <w:sz w:val="24"/>
-          <w:szCs w:val="24"/>
-        </w:rPr>
-        <w:t>Cliente</w:t>
-      </w:r>
-      <w:r>
-        <w:rPr>
-          <w:sz w:val="24"/>
-          <w:szCs w:val="24"/>
-        </w:rPr>
-        <w:t xml:space="preserve"> </w:t>
-      </w:r>
-      <w:r>
-        <w:rPr>
-          <w:sz w:val="24"/>
-          <w:szCs w:val="24"/>
-        </w:rPr>
-        <w:t>(</w:t>
-      </w:r>
-      <w:r>
-        <w:rPr>
-          <w:sz w:val="24"/>
-          <w:szCs w:val="24"/>
-        </w:rPr>
-        <w:t>Codice fiscale</w:t>
-      </w:r>
-      <w:r>
-        <w:rPr>
-          <w:sz w:val="24"/>
-          <w:szCs w:val="24"/>
-        </w:rPr>
-        <w:t>)</w:t>
-      </w:r>
-      <w:r>
-        <w:rPr>
-          <w:sz w:val="24"/>
-          <w:szCs w:val="24"/>
-        </w:rPr>
-        <w:t xml:space="preserve"> </w:t>
-      </w:r>
-    </w:p>
-    <w:p>
-      <w:pPr>
-        <w:tabs>
-          <w:tab w:val="left" w:pos="1404"/>
-        </w:tabs>
-        <w:rPr>
-          <w:sz w:val="24"/>
-          <w:szCs w:val="24"/>
-        </w:rPr>
-      </w:pPr>
-      <w:r>
-        <w:rPr>
-          <w:sz w:val="24"/>
-          <w:szCs w:val="24"/>
-        </w:rPr>
-        <w:t>Contenere Merchandise</w:t>
-      </w:r>
-      <w:r>
-        <w:rPr>
-          <w:sz w:val="24"/>
-          <w:szCs w:val="24"/>
-        </w:rPr>
-        <w:t xml:space="preserve"> </w:t>
-      </w:r>
-      <w:r>
-        <w:rPr>
-          <w:sz w:val="24"/>
-          <w:szCs w:val="24"/>
-        </w:rPr>
-        <w:t>(</w:t>
-      </w:r>
-      <w:r>
-        <w:rPr>
-          <w:sz w:val="24"/>
-          <w:szCs w:val="24"/>
-        </w:rPr>
-        <w:t>Ordine</w:t>
-      </w:r>
-      <w:r>
-        <w:rPr>
-          <w:sz w:val="24"/>
-          <w:szCs w:val="24"/>
-        </w:rPr>
-        <w:t xml:space="preserve">) si riferisce a </w:t>
-      </w:r>
-      <w:r>
-        <w:rPr>
-          <w:sz w:val="24"/>
-          <w:szCs w:val="24"/>
-        </w:rPr>
-        <w:t>Ordine</w:t>
-      </w:r>
-      <w:r>
-        <w:rPr>
-          <w:sz w:val="24"/>
-          <w:szCs w:val="24"/>
-        </w:rPr>
-        <w:t xml:space="preserve"> </w:t>
-      </w:r>
-      <w:r>
-        <w:rPr>
-          <w:sz w:val="24"/>
-          <w:szCs w:val="24"/>
-        </w:rPr>
-        <w:t>(</w:t>
-      </w:r>
-      <w:r>
-        <w:rPr>
-          <w:sz w:val="24"/>
-          <w:szCs w:val="24"/>
-        </w:rPr>
-        <w:t>Codice Ordine</w:t>
-      </w:r>
-      <w:r>
-        <w:rPr>
-          <w:sz w:val="24"/>
-          <w:szCs w:val="24"/>
-        </w:rPr>
-        <w:t>)</w:t>
-      </w:r>
-    </w:p>
-    <w:p>
-      <w:pPr>
-        <w:tabs>
-          <w:tab w:val="left" w:pos="1404"/>
-        </w:tabs>
-        <w:rPr>
-          <w:sz w:val="24"/>
-          <w:szCs w:val="24"/>
-        </w:rPr>
-      </w:pPr>
-      <w:r>
-        <w:rPr>
-          <w:sz w:val="24"/>
-          <w:szCs w:val="24"/>
-        </w:rPr>
-        <w:t>Contenere Merchandise</w:t>
-      </w:r>
-      <w:r>
-        <w:rPr>
-          <w:sz w:val="24"/>
-          <w:szCs w:val="24"/>
-        </w:rPr>
-        <w:t xml:space="preserve"> </w:t>
-      </w:r>
-      <w:r>
-        <w:rPr>
-          <w:sz w:val="24"/>
-          <w:szCs w:val="24"/>
-        </w:rPr>
-        <w:t>(</w:t>
-      </w:r>
-      <w:r>
-        <w:rPr>
-          <w:sz w:val="24"/>
-          <w:szCs w:val="24"/>
-        </w:rPr>
-        <w:t>Ordine</w:t>
-      </w:r>
-      <w:r>
-        <w:rPr>
-          <w:sz w:val="24"/>
-          <w:szCs w:val="24"/>
-        </w:rPr>
-        <w:t xml:space="preserve">) si riferisce a </w:t>
-      </w:r>
-      <w:r>
-        <w:rPr>
-          <w:sz w:val="24"/>
-          <w:szCs w:val="24"/>
-        </w:rPr>
-        <w:t>Ordine</w:t>
-      </w:r>
-      <w:r>
-        <w:rPr>
-          <w:sz w:val="24"/>
-          <w:szCs w:val="24"/>
-        </w:rPr>
-        <w:t xml:space="preserve"> </w:t>
-      </w:r>
-      <w:r>
-        <w:rPr>
-          <w:sz w:val="24"/>
-          <w:szCs w:val="24"/>
-        </w:rPr>
-        <w:t>(</w:t>
-      </w:r>
-      <w:r>
-        <w:rPr>
-          <w:sz w:val="24"/>
-          <w:szCs w:val="24"/>
-        </w:rPr>
-        <w:t>Codice Ordine</w:t>
-      </w:r>
-      <w:r>
-        <w:rPr>
-          <w:sz w:val="24"/>
-          <w:szCs w:val="24"/>
-        </w:rPr>
-        <w:t>)</w:t>
-      </w:r>
-    </w:p>
-    <w:p>
-      <w:pPr>
-        <w:tabs>
-          <w:tab w:val="left" w:pos="1404"/>
-        </w:tabs>
-        <w:rPr>
-          <w:sz w:val="24"/>
-          <w:szCs w:val="24"/>
-        </w:rPr>
-      </w:pPr>
-      <w:r>
-        <w:rPr>
-          <w:sz w:val="24"/>
-          <w:szCs w:val="24"/>
-        </w:rPr>
-        <w:t>Ordine</w:t>
-      </w:r>
-      <w:r>
-        <w:rPr>
-          <w:sz w:val="24"/>
-          <w:szCs w:val="24"/>
-        </w:rPr>
-        <w:t xml:space="preserve"> </w:t>
-      </w:r>
-      <w:r>
-        <w:rPr>
-          <w:sz w:val="24"/>
-          <w:szCs w:val="24"/>
-        </w:rPr>
-        <w:t>(</w:t>
-      </w:r>
-      <w:r>
-        <w:rPr>
-          <w:sz w:val="24"/>
-          <w:szCs w:val="24"/>
-        </w:rPr>
-        <w:t>Cliente</w:t>
-      </w:r>
-      <w:r>
-        <w:rPr>
-          <w:sz w:val="24"/>
-          <w:szCs w:val="24"/>
-        </w:rPr>
-        <w:t xml:space="preserve">) si riferisce a </w:t>
-      </w:r>
-      <w:r>
-        <w:rPr>
-          <w:sz w:val="24"/>
-          <w:szCs w:val="24"/>
-        </w:rPr>
-        <w:t>Cliente</w:t>
-      </w:r>
-      <w:r>
-        <w:rPr>
-          <w:sz w:val="24"/>
-          <w:szCs w:val="24"/>
-        </w:rPr>
-        <w:t xml:space="preserve"> </w:t>
+        <w:t xml:space="preserve">Cliente </w:t>
       </w:r>
       <w:r>
         <w:rPr>
@@ -5681,7 +5479,6 @@
           <w:sz w:val="36"/>
           <w:szCs w:val="36"/>
         </w:rPr>
-        <w:lastRenderedPageBreak/>
         <w:t>Operazioni</w:t>
       </w:r>
     </w:p>
@@ -5697,6 +5494,1971 @@
           <w:szCs w:val="36"/>
           <w:u w:val="single"/>
         </w:rPr>
+      </w:pPr>
+      <w:r>
+        <w:rPr>
+          <w:b/>
+          <w:bCs/>
+          <w:sz w:val="36"/>
+          <w:szCs w:val="36"/>
+          <w:u w:val="single"/>
+        </w:rPr>
+        <w:t>Creazioni tabelle</w:t>
+      </w:r>
+    </w:p>
+    <w:p>
+      <w:pPr>
+        <w:tabs>
+          <w:tab w:val="left" w:pos="1404"/>
+        </w:tabs>
+      </w:pPr>
+      <w:r>
+        <w:t xml:space="preserve">Create </w:t>
+      </w:r>
+      <w:proofErr w:type="spellStart"/>
+      <w:r>
+        <w:t>table</w:t>
+      </w:r>
+      <w:proofErr w:type="spellEnd"/>
+      <w:r>
+        <w:t xml:space="preserve"> </w:t>
+      </w:r>
+      <w:proofErr w:type="spellStart"/>
+      <w:r>
+        <w:t>if</w:t>
+      </w:r>
+      <w:proofErr w:type="spellEnd"/>
+      <w:r>
+        <w:t xml:space="preserve"> </w:t>
+      </w:r>
+      <w:proofErr w:type="spellStart"/>
+      <w:r>
+        <w:t>not</w:t>
+      </w:r>
+      <w:proofErr w:type="spellEnd"/>
+      <w:r>
+        <w:t xml:space="preserve"> </w:t>
+      </w:r>
+      <w:proofErr w:type="spellStart"/>
+      <w:r>
+        <w:t>exists</w:t>
+      </w:r>
+      <w:proofErr w:type="spellEnd"/>
+      <w:r>
+        <w:t xml:space="preserve"> </w:t>
+      </w:r>
+      <w:proofErr w:type="gramStart"/>
+      <w:r>
+        <w:t>Appartenere(</w:t>
+      </w:r>
+      <w:proofErr w:type="gramEnd"/>
+    </w:p>
+    <w:p>
+      <w:pPr>
+        <w:tabs>
+          <w:tab w:val="left" w:pos="1404"/>
+        </w:tabs>
+      </w:pPr>
+      <w:r>
+        <w:tab/>
+        <w:t xml:space="preserve">Genere </w:t>
+      </w:r>
+      <w:proofErr w:type="spellStart"/>
+      <w:proofErr w:type="gramStart"/>
+      <w:r>
+        <w:t>varchar</w:t>
+      </w:r>
+      <w:proofErr w:type="spellEnd"/>
+      <w:r>
+        <w:t>(</w:t>
+      </w:r>
+      <w:proofErr w:type="gramEnd"/>
+      <w:r>
+        <w:t>50),</w:t>
+      </w:r>
+    </w:p>
+    <w:p>
+      <w:pPr>
+        <w:tabs>
+          <w:tab w:val="left" w:pos="1404"/>
+        </w:tabs>
+      </w:pPr>
+      <w:r>
+        <w:tab/>
+        <w:t xml:space="preserve">Videogioco </w:t>
+      </w:r>
+      <w:proofErr w:type="spellStart"/>
+      <w:r>
+        <w:t>int</w:t>
+      </w:r>
+      <w:proofErr w:type="spellEnd"/>
+      <w:r>
+        <w:t>,</w:t>
+      </w:r>
+    </w:p>
+    <w:p>
+      <w:pPr>
+        <w:tabs>
+          <w:tab w:val="left" w:pos="1404"/>
+        </w:tabs>
+      </w:pPr>
+      <w:r>
+        <w:t xml:space="preserve">    </w:t>
+      </w:r>
+      <w:proofErr w:type="spellStart"/>
+      <w:r>
+        <w:t>Primary</w:t>
+      </w:r>
+      <w:proofErr w:type="spellEnd"/>
+      <w:r>
+        <w:t xml:space="preserve"> </w:t>
+      </w:r>
+      <w:proofErr w:type="gramStart"/>
+      <w:r>
+        <w:t>key(</w:t>
+      </w:r>
+      <w:proofErr w:type="gramEnd"/>
+      <w:r>
+        <w:t>Genere, Videogioco),</w:t>
+      </w:r>
+    </w:p>
+    <w:p>
+      <w:pPr>
+        <w:tabs>
+          <w:tab w:val="left" w:pos="1404"/>
+        </w:tabs>
+      </w:pPr>
+      <w:r>
+        <w:t xml:space="preserve">    Foreign key </w:t>
+      </w:r>
+      <w:proofErr w:type="gramStart"/>
+      <w:r>
+        <w:t>Appartenere(</w:t>
+      </w:r>
+      <w:proofErr w:type="gramEnd"/>
+      <w:r>
+        <w:t xml:space="preserve">Genere) </w:t>
+      </w:r>
+      <w:proofErr w:type="spellStart"/>
+      <w:r>
+        <w:t>references</w:t>
+      </w:r>
+      <w:proofErr w:type="spellEnd"/>
+      <w:r>
+        <w:t xml:space="preserve"> Genere(Tipo),</w:t>
+      </w:r>
+    </w:p>
+    <w:p>
+      <w:pPr>
+        <w:tabs>
+          <w:tab w:val="left" w:pos="1404"/>
+        </w:tabs>
+      </w:pPr>
+      <w:r>
+        <w:t xml:space="preserve">    Foreign key </w:t>
+      </w:r>
+      <w:proofErr w:type="gramStart"/>
+      <w:r>
+        <w:t>Appartenere(</w:t>
+      </w:r>
+      <w:proofErr w:type="gramEnd"/>
+      <w:r>
+        <w:t xml:space="preserve">Videogioco) </w:t>
+      </w:r>
+      <w:proofErr w:type="spellStart"/>
+      <w:r>
+        <w:t>references</w:t>
+      </w:r>
+      <w:proofErr w:type="spellEnd"/>
+      <w:r>
+        <w:t xml:space="preserve"> Videogioco(</w:t>
+      </w:r>
+      <w:proofErr w:type="spellStart"/>
+      <w:r>
+        <w:t>ID_Prodotto</w:t>
+      </w:r>
+      <w:proofErr w:type="spellEnd"/>
+      <w:r>
+        <w:t>)</w:t>
+      </w:r>
+    </w:p>
+    <w:p>
+      <w:pPr>
+        <w:tabs>
+          <w:tab w:val="left" w:pos="1404"/>
+        </w:tabs>
+      </w:pPr>
+      <w:r>
+        <w:t xml:space="preserve">    );</w:t>
+      </w:r>
+    </w:p>
+    <w:p>
+      <w:pPr>
+        <w:tabs>
+          <w:tab w:val="left" w:pos="1404"/>
+        </w:tabs>
+      </w:pPr>
+    </w:p>
+    <w:p>
+      <w:pPr>
+        <w:tabs>
+          <w:tab w:val="left" w:pos="1404"/>
+        </w:tabs>
+      </w:pPr>
+      <w:r>
+        <w:t xml:space="preserve">Create </w:t>
+      </w:r>
+      <w:proofErr w:type="spellStart"/>
+      <w:r>
+        <w:t>table</w:t>
+      </w:r>
+      <w:proofErr w:type="spellEnd"/>
+      <w:r>
+        <w:t xml:space="preserve"> </w:t>
+      </w:r>
+      <w:proofErr w:type="spellStart"/>
+      <w:r>
+        <w:t>if</w:t>
+      </w:r>
+      <w:proofErr w:type="spellEnd"/>
+      <w:r>
+        <w:t xml:space="preserve"> </w:t>
+      </w:r>
+      <w:proofErr w:type="spellStart"/>
+      <w:r>
+        <w:t>not</w:t>
+      </w:r>
+      <w:proofErr w:type="spellEnd"/>
+      <w:r>
+        <w:t xml:space="preserve"> </w:t>
+      </w:r>
+      <w:proofErr w:type="spellStart"/>
+      <w:r>
+        <w:t>exists</w:t>
+      </w:r>
+      <w:proofErr w:type="spellEnd"/>
+      <w:r>
+        <w:t xml:space="preserve"> </w:t>
+      </w:r>
+      <w:proofErr w:type="gramStart"/>
+      <w:r>
+        <w:t>genere(</w:t>
+      </w:r>
+      <w:proofErr w:type="gramEnd"/>
+    </w:p>
+    <w:p>
+      <w:pPr>
+        <w:tabs>
+          <w:tab w:val="left" w:pos="1404"/>
+        </w:tabs>
+      </w:pPr>
+      <w:r>
+        <w:tab/>
+        <w:t xml:space="preserve">tipo </w:t>
+      </w:r>
+      <w:proofErr w:type="spellStart"/>
+      <w:proofErr w:type="gramStart"/>
+      <w:r>
+        <w:t>varchar</w:t>
+      </w:r>
+      <w:proofErr w:type="spellEnd"/>
+      <w:r>
+        <w:t>(</w:t>
+      </w:r>
+      <w:proofErr w:type="gramEnd"/>
+      <w:r>
+        <w:t xml:space="preserve">50) </w:t>
+      </w:r>
+      <w:proofErr w:type="spellStart"/>
+      <w:r>
+        <w:t>Primary</w:t>
+      </w:r>
+      <w:proofErr w:type="spellEnd"/>
+      <w:r>
+        <w:t xml:space="preserve"> key</w:t>
+      </w:r>
+    </w:p>
+    <w:p>
+      <w:pPr>
+        <w:tabs>
+          <w:tab w:val="left" w:pos="1404"/>
+        </w:tabs>
+      </w:pPr>
+      <w:r>
+        <w:t xml:space="preserve">    )</w:t>
+      </w:r>
+    </w:p>
+    <w:p>
+      <w:pPr>
+        <w:tabs>
+          <w:tab w:val="left" w:pos="1404"/>
+        </w:tabs>
+      </w:pPr>
+    </w:p>
+    <w:p>
+      <w:pPr>
+        <w:tabs>
+          <w:tab w:val="left" w:pos="1404"/>
+        </w:tabs>
+      </w:pPr>
+      <w:r>
+        <w:t xml:space="preserve">create </w:t>
+      </w:r>
+      <w:proofErr w:type="spellStart"/>
+      <w:r>
+        <w:t>table</w:t>
+      </w:r>
+      <w:proofErr w:type="spellEnd"/>
+      <w:r>
+        <w:t xml:space="preserve"> </w:t>
+      </w:r>
+      <w:proofErr w:type="spellStart"/>
+      <w:r>
+        <w:t>if</w:t>
+      </w:r>
+      <w:proofErr w:type="spellEnd"/>
+      <w:r>
+        <w:t xml:space="preserve"> </w:t>
+      </w:r>
+      <w:proofErr w:type="spellStart"/>
+      <w:r>
+        <w:t>not</w:t>
+      </w:r>
+      <w:proofErr w:type="spellEnd"/>
+      <w:r>
+        <w:t xml:space="preserve"> </w:t>
+      </w:r>
+      <w:proofErr w:type="spellStart"/>
+      <w:r>
+        <w:t>exists</w:t>
+      </w:r>
+      <w:proofErr w:type="spellEnd"/>
+      <w:r>
+        <w:t xml:space="preserve"> </w:t>
+      </w:r>
+      <w:proofErr w:type="gramStart"/>
+      <w:r>
+        <w:t>videogioco(</w:t>
+      </w:r>
+      <w:proofErr w:type="gramEnd"/>
+    </w:p>
+    <w:p>
+      <w:pPr>
+        <w:tabs>
+          <w:tab w:val="left" w:pos="1404"/>
+        </w:tabs>
+      </w:pPr>
+      <w:r>
+        <w:tab/>
+      </w:r>
+      <w:proofErr w:type="spellStart"/>
+      <w:r>
+        <w:t>ID_Prodotto</w:t>
+      </w:r>
+      <w:proofErr w:type="spellEnd"/>
+      <w:r>
+        <w:t xml:space="preserve"> </w:t>
+      </w:r>
+      <w:proofErr w:type="spellStart"/>
+      <w:r>
+        <w:t>int</w:t>
+      </w:r>
+      <w:proofErr w:type="spellEnd"/>
+      <w:r>
+        <w:t>,</w:t>
+      </w:r>
+    </w:p>
+    <w:p>
+      <w:pPr>
+        <w:tabs>
+          <w:tab w:val="left" w:pos="1404"/>
+        </w:tabs>
+      </w:pPr>
+      <w:r>
+        <w:t xml:space="preserve">    nome </w:t>
+      </w:r>
+      <w:proofErr w:type="spellStart"/>
+      <w:proofErr w:type="gramStart"/>
+      <w:r>
+        <w:t>varchar</w:t>
+      </w:r>
+      <w:proofErr w:type="spellEnd"/>
+      <w:r>
+        <w:t>(</w:t>
+      </w:r>
+      <w:proofErr w:type="gramEnd"/>
+      <w:r>
+        <w:t>40),</w:t>
+      </w:r>
+    </w:p>
+    <w:p>
+      <w:pPr>
+        <w:tabs>
+          <w:tab w:val="left" w:pos="1404"/>
+        </w:tabs>
+      </w:pPr>
+      <w:r>
+        <w:t xml:space="preserve">    Prezzo </w:t>
+      </w:r>
+      <w:proofErr w:type="spellStart"/>
+      <w:proofErr w:type="gramStart"/>
+      <w:r>
+        <w:t>decimal</w:t>
+      </w:r>
+      <w:proofErr w:type="spellEnd"/>
+      <w:r>
+        <w:t>(</w:t>
+      </w:r>
+      <w:proofErr w:type="gramEnd"/>
+      <w:r>
+        <w:t>5,2),</w:t>
+      </w:r>
+    </w:p>
+    <w:p>
+      <w:pPr>
+        <w:tabs>
+          <w:tab w:val="left" w:pos="1404"/>
+        </w:tabs>
+      </w:pPr>
+      <w:r>
+        <w:t xml:space="preserve">    Studio </w:t>
+      </w:r>
+      <w:proofErr w:type="spellStart"/>
+      <w:proofErr w:type="gramStart"/>
+      <w:r>
+        <w:t>varchar</w:t>
+      </w:r>
+      <w:proofErr w:type="spellEnd"/>
+      <w:r>
+        <w:t>(</w:t>
+      </w:r>
+      <w:proofErr w:type="gramEnd"/>
+      <w:r>
+        <w:t>30),</w:t>
+      </w:r>
+    </w:p>
+    <w:p>
+      <w:pPr>
+        <w:tabs>
+          <w:tab w:val="left" w:pos="1404"/>
+        </w:tabs>
+      </w:pPr>
+      <w:r>
+        <w:t xml:space="preserve">    </w:t>
+      </w:r>
+      <w:proofErr w:type="spellStart"/>
+      <w:r>
+        <w:t>Data_uscita</w:t>
+      </w:r>
+      <w:proofErr w:type="spellEnd"/>
+      <w:r>
+        <w:t xml:space="preserve"> date,</w:t>
+      </w:r>
+    </w:p>
+    <w:p>
+      <w:pPr>
+        <w:tabs>
+          <w:tab w:val="left" w:pos="1404"/>
+        </w:tabs>
+      </w:pPr>
+      <w:r>
+        <w:t xml:space="preserve">    Piattaforme </w:t>
+      </w:r>
+      <w:proofErr w:type="spellStart"/>
+      <w:proofErr w:type="gramStart"/>
+      <w:r>
+        <w:t>varchar</w:t>
+      </w:r>
+      <w:proofErr w:type="spellEnd"/>
+      <w:r>
+        <w:t>(</w:t>
+      </w:r>
+      <w:proofErr w:type="gramEnd"/>
+      <w:r>
+        <w:t>30),</w:t>
+      </w:r>
+    </w:p>
+    <w:p>
+      <w:pPr>
+        <w:tabs>
+          <w:tab w:val="left" w:pos="1404"/>
+        </w:tabs>
+      </w:pPr>
+      <w:r>
+        <w:t xml:space="preserve">    PEGI </w:t>
+      </w:r>
+      <w:proofErr w:type="spellStart"/>
+      <w:proofErr w:type="gramStart"/>
+      <w:r>
+        <w:t>varchar</w:t>
+      </w:r>
+      <w:proofErr w:type="spellEnd"/>
+      <w:r>
+        <w:t>(</w:t>
+      </w:r>
+      <w:proofErr w:type="gramEnd"/>
+      <w:r>
+        <w:t>20),</w:t>
+      </w:r>
+    </w:p>
+    <w:p>
+      <w:pPr>
+        <w:tabs>
+          <w:tab w:val="left" w:pos="1404"/>
+        </w:tabs>
+      </w:pPr>
+      <w:r>
+        <w:t xml:space="preserve">    </w:t>
+      </w:r>
+      <w:proofErr w:type="spellStart"/>
+      <w:r>
+        <w:t>primary</w:t>
+      </w:r>
+      <w:proofErr w:type="spellEnd"/>
+      <w:r>
+        <w:t xml:space="preserve"> </w:t>
+      </w:r>
+      <w:proofErr w:type="gramStart"/>
+      <w:r>
+        <w:t>key(</w:t>
+      </w:r>
+      <w:proofErr w:type="spellStart"/>
+      <w:proofErr w:type="gramEnd"/>
+      <w:r>
+        <w:t>ID_Prodotto</w:t>
+      </w:r>
+      <w:proofErr w:type="spellEnd"/>
+      <w:r>
+        <w:t>)</w:t>
+      </w:r>
+    </w:p>
+    <w:p>
+      <w:pPr>
+        <w:tabs>
+          <w:tab w:val="left" w:pos="1404"/>
+        </w:tabs>
+      </w:pPr>
+      <w:r>
+        <w:t xml:space="preserve">    )</w:t>
+      </w:r>
+    </w:p>
+    <w:p>
+      <w:pPr>
+        <w:tabs>
+          <w:tab w:val="left" w:pos="1404"/>
+        </w:tabs>
+      </w:pPr>
+    </w:p>
+    <w:p>
+      <w:pPr>
+        <w:tabs>
+          <w:tab w:val="left" w:pos="1404"/>
+        </w:tabs>
+      </w:pPr>
+    </w:p>
+    <w:p>
+      <w:pPr>
+        <w:tabs>
+          <w:tab w:val="left" w:pos="1404"/>
+        </w:tabs>
+      </w:pPr>
+    </w:p>
+    <w:p>
+      <w:pPr>
+        <w:tabs>
+          <w:tab w:val="left" w:pos="1404"/>
+        </w:tabs>
+      </w:pPr>
+      <w:r>
+        <w:lastRenderedPageBreak/>
+        <w:t xml:space="preserve">create </w:t>
+      </w:r>
+      <w:proofErr w:type="spellStart"/>
+      <w:r>
+        <w:t>table</w:t>
+      </w:r>
+      <w:proofErr w:type="spellEnd"/>
+      <w:r>
+        <w:t xml:space="preserve"> </w:t>
+      </w:r>
+      <w:proofErr w:type="spellStart"/>
+      <w:r>
+        <w:t>if</w:t>
+      </w:r>
+      <w:proofErr w:type="spellEnd"/>
+      <w:r>
+        <w:t xml:space="preserve"> </w:t>
+      </w:r>
+      <w:proofErr w:type="spellStart"/>
+      <w:r>
+        <w:t>not</w:t>
+      </w:r>
+      <w:proofErr w:type="spellEnd"/>
+      <w:r>
+        <w:t xml:space="preserve"> </w:t>
+      </w:r>
+      <w:proofErr w:type="spellStart"/>
+      <w:r>
+        <w:t>exists</w:t>
+      </w:r>
+      <w:proofErr w:type="spellEnd"/>
+      <w:r>
+        <w:t xml:space="preserve"> </w:t>
+      </w:r>
+      <w:proofErr w:type="gramStart"/>
+      <w:r>
+        <w:t>Cliente(</w:t>
+      </w:r>
+      <w:proofErr w:type="gramEnd"/>
+    </w:p>
+    <w:p>
+      <w:pPr>
+        <w:tabs>
+          <w:tab w:val="left" w:pos="1404"/>
+        </w:tabs>
+      </w:pPr>
+      <w:r>
+        <w:tab/>
+      </w:r>
+      <w:proofErr w:type="spellStart"/>
+      <w:r>
+        <w:t>Codice_fiscale</w:t>
+      </w:r>
+      <w:proofErr w:type="spellEnd"/>
+      <w:r>
+        <w:t xml:space="preserve"> </w:t>
+      </w:r>
+      <w:proofErr w:type="spellStart"/>
+      <w:proofErr w:type="gramStart"/>
+      <w:r>
+        <w:t>varchar</w:t>
+      </w:r>
+      <w:proofErr w:type="spellEnd"/>
+      <w:r>
+        <w:t>(</w:t>
+      </w:r>
+      <w:proofErr w:type="gramEnd"/>
+      <w:r>
+        <w:t>20),</w:t>
+      </w:r>
+    </w:p>
+    <w:p>
+      <w:pPr>
+        <w:tabs>
+          <w:tab w:val="left" w:pos="1404"/>
+        </w:tabs>
+      </w:pPr>
+      <w:r>
+        <w:t xml:space="preserve">    nome </w:t>
+      </w:r>
+      <w:proofErr w:type="spellStart"/>
+      <w:proofErr w:type="gramStart"/>
+      <w:r>
+        <w:t>varchar</w:t>
+      </w:r>
+      <w:proofErr w:type="spellEnd"/>
+      <w:r>
+        <w:t>(</w:t>
+      </w:r>
+      <w:proofErr w:type="gramEnd"/>
+      <w:r>
+        <w:t>30),</w:t>
+      </w:r>
+    </w:p>
+    <w:p>
+      <w:pPr>
+        <w:tabs>
+          <w:tab w:val="left" w:pos="1404"/>
+        </w:tabs>
+      </w:pPr>
+      <w:r>
+        <w:t xml:space="preserve">    cognome </w:t>
+      </w:r>
+      <w:proofErr w:type="spellStart"/>
+      <w:proofErr w:type="gramStart"/>
+      <w:r>
+        <w:t>varchar</w:t>
+      </w:r>
+      <w:proofErr w:type="spellEnd"/>
+      <w:r>
+        <w:t>(</w:t>
+      </w:r>
+      <w:proofErr w:type="gramEnd"/>
+      <w:r>
+        <w:t>30),</w:t>
+      </w:r>
+    </w:p>
+    <w:p>
+      <w:pPr>
+        <w:tabs>
+          <w:tab w:val="left" w:pos="1404"/>
+        </w:tabs>
+      </w:pPr>
+      <w:r>
+        <w:t xml:space="preserve">    telefono </w:t>
+      </w:r>
+      <w:proofErr w:type="spellStart"/>
+      <w:proofErr w:type="gramStart"/>
+      <w:r>
+        <w:t>varchar</w:t>
+      </w:r>
+      <w:proofErr w:type="spellEnd"/>
+      <w:r>
+        <w:t>(</w:t>
+      </w:r>
+      <w:proofErr w:type="gramEnd"/>
+      <w:r>
+        <w:t>15),</w:t>
+      </w:r>
+    </w:p>
+    <w:p>
+      <w:pPr>
+        <w:tabs>
+          <w:tab w:val="left" w:pos="1404"/>
+        </w:tabs>
+      </w:pPr>
+      <w:r>
+        <w:t xml:space="preserve">    </w:t>
+      </w:r>
+      <w:proofErr w:type="spellStart"/>
+      <w:r>
+        <w:t>Data_nascita</w:t>
+      </w:r>
+      <w:proofErr w:type="spellEnd"/>
+      <w:r>
+        <w:t xml:space="preserve"> date,</w:t>
+      </w:r>
+    </w:p>
+    <w:p>
+      <w:pPr>
+        <w:tabs>
+          <w:tab w:val="left" w:pos="1404"/>
+        </w:tabs>
+      </w:pPr>
+      <w:r>
+        <w:t xml:space="preserve">    via </w:t>
+      </w:r>
+      <w:proofErr w:type="spellStart"/>
+      <w:proofErr w:type="gramStart"/>
+      <w:r>
+        <w:t>varchar</w:t>
+      </w:r>
+      <w:proofErr w:type="spellEnd"/>
+      <w:r>
+        <w:t>(</w:t>
+      </w:r>
+      <w:proofErr w:type="gramEnd"/>
+      <w:r>
+        <w:t>30),</w:t>
+      </w:r>
+    </w:p>
+    <w:p>
+      <w:pPr>
+        <w:tabs>
+          <w:tab w:val="left" w:pos="1404"/>
+        </w:tabs>
+      </w:pPr>
+      <w:r>
+        <w:t xml:space="preserve">    civico </w:t>
+      </w:r>
+      <w:proofErr w:type="spellStart"/>
+      <w:r>
+        <w:t>int</w:t>
+      </w:r>
+      <w:proofErr w:type="spellEnd"/>
+      <w:r>
+        <w:t>,</w:t>
+      </w:r>
+    </w:p>
+    <w:p>
+      <w:pPr>
+        <w:tabs>
+          <w:tab w:val="left" w:pos="1404"/>
+        </w:tabs>
+      </w:pPr>
+      <w:r>
+        <w:t xml:space="preserve">    </w:t>
+      </w:r>
+      <w:proofErr w:type="spellStart"/>
+      <w:r>
+        <w:t>cap</w:t>
+      </w:r>
+      <w:proofErr w:type="spellEnd"/>
+      <w:r>
+        <w:t xml:space="preserve"> </w:t>
+      </w:r>
+      <w:proofErr w:type="spellStart"/>
+      <w:r>
+        <w:t>int</w:t>
+      </w:r>
+      <w:proofErr w:type="spellEnd"/>
+      <w:r>
+        <w:t>,</w:t>
+      </w:r>
+    </w:p>
+    <w:p>
+      <w:pPr>
+        <w:tabs>
+          <w:tab w:val="left" w:pos="1404"/>
+        </w:tabs>
+      </w:pPr>
+      <w:r>
+        <w:t xml:space="preserve">    città </w:t>
+      </w:r>
+      <w:proofErr w:type="spellStart"/>
+      <w:proofErr w:type="gramStart"/>
+      <w:r>
+        <w:t>varchar</w:t>
+      </w:r>
+      <w:proofErr w:type="spellEnd"/>
+      <w:r>
+        <w:t>(</w:t>
+      </w:r>
+      <w:proofErr w:type="gramEnd"/>
+      <w:r>
+        <w:t>30),</w:t>
+      </w:r>
+    </w:p>
+    <w:p>
+      <w:pPr>
+        <w:tabs>
+          <w:tab w:val="left" w:pos="1404"/>
+        </w:tabs>
+      </w:pPr>
+      <w:r>
+        <w:t xml:space="preserve">    stato </w:t>
+      </w:r>
+      <w:proofErr w:type="spellStart"/>
+      <w:proofErr w:type="gramStart"/>
+      <w:r>
+        <w:t>varchar</w:t>
+      </w:r>
+      <w:proofErr w:type="spellEnd"/>
+      <w:r>
+        <w:t>(</w:t>
+      </w:r>
+      <w:proofErr w:type="gramEnd"/>
+      <w:r>
+        <w:t>30),</w:t>
+      </w:r>
+    </w:p>
+    <w:p>
+      <w:pPr>
+        <w:tabs>
+          <w:tab w:val="left" w:pos="1404"/>
+        </w:tabs>
+      </w:pPr>
+      <w:r>
+        <w:t xml:space="preserve">    </w:t>
+      </w:r>
+      <w:proofErr w:type="spellStart"/>
+      <w:r>
+        <w:t>primary</w:t>
+      </w:r>
+      <w:proofErr w:type="spellEnd"/>
+      <w:r>
+        <w:t xml:space="preserve"> </w:t>
+      </w:r>
+      <w:proofErr w:type="gramStart"/>
+      <w:r>
+        <w:t>key(</w:t>
+      </w:r>
+      <w:proofErr w:type="spellStart"/>
+      <w:proofErr w:type="gramEnd"/>
+      <w:r>
+        <w:t>Codice_fiscale</w:t>
+      </w:r>
+      <w:proofErr w:type="spellEnd"/>
+      <w:r>
+        <w:t>)</w:t>
+      </w:r>
+    </w:p>
+    <w:p>
+      <w:pPr>
+        <w:tabs>
+          <w:tab w:val="left" w:pos="1404"/>
+        </w:tabs>
+      </w:pPr>
+      <w:r>
+        <w:t xml:space="preserve">    )</w:t>
+      </w:r>
+    </w:p>
+    <w:p>
+      <w:pPr>
+        <w:tabs>
+          <w:tab w:val="left" w:pos="1404"/>
+        </w:tabs>
+      </w:pPr>
+    </w:p>
+    <w:p>
+      <w:pPr>
+        <w:tabs>
+          <w:tab w:val="left" w:pos="1404"/>
+        </w:tabs>
+      </w:pPr>
+      <w:r>
+        <w:t xml:space="preserve">create </w:t>
+      </w:r>
+      <w:proofErr w:type="spellStart"/>
+      <w:r>
+        <w:t>table</w:t>
+      </w:r>
+      <w:proofErr w:type="spellEnd"/>
+      <w:r>
+        <w:t xml:space="preserve"> </w:t>
+      </w:r>
+      <w:proofErr w:type="spellStart"/>
+      <w:r>
+        <w:t>if</w:t>
+      </w:r>
+      <w:proofErr w:type="spellEnd"/>
+      <w:r>
+        <w:t xml:space="preserve"> </w:t>
+      </w:r>
+      <w:proofErr w:type="spellStart"/>
+      <w:r>
+        <w:t>not</w:t>
+      </w:r>
+      <w:proofErr w:type="spellEnd"/>
+      <w:r>
+        <w:t xml:space="preserve"> </w:t>
+      </w:r>
+      <w:proofErr w:type="spellStart"/>
+      <w:r>
+        <w:t>exists</w:t>
+      </w:r>
+      <w:proofErr w:type="spellEnd"/>
+      <w:r>
+        <w:t xml:space="preserve"> </w:t>
+      </w:r>
+      <w:proofErr w:type="gramStart"/>
+      <w:r>
+        <w:t>Recensione(</w:t>
+      </w:r>
+      <w:proofErr w:type="gramEnd"/>
+    </w:p>
+    <w:p>
+      <w:pPr>
+        <w:tabs>
+          <w:tab w:val="left" w:pos="1404"/>
+        </w:tabs>
+      </w:pPr>
+      <w:r>
+        <w:tab/>
+      </w:r>
+      <w:proofErr w:type="spellStart"/>
+      <w:r>
+        <w:t>ID_Recensione</w:t>
+      </w:r>
+      <w:proofErr w:type="spellEnd"/>
+      <w:r>
+        <w:t xml:space="preserve"> </w:t>
+      </w:r>
+      <w:proofErr w:type="spellStart"/>
+      <w:r>
+        <w:t>int</w:t>
+      </w:r>
+      <w:proofErr w:type="spellEnd"/>
+      <w:r>
+        <w:t>,</w:t>
+      </w:r>
+    </w:p>
+    <w:p>
+      <w:pPr>
+        <w:tabs>
+          <w:tab w:val="left" w:pos="1404"/>
+        </w:tabs>
+      </w:pPr>
+      <w:r>
+        <w:t xml:space="preserve">    Cliente </w:t>
+      </w:r>
+      <w:proofErr w:type="spellStart"/>
+      <w:proofErr w:type="gramStart"/>
+      <w:r>
+        <w:t>varchar</w:t>
+      </w:r>
+      <w:proofErr w:type="spellEnd"/>
+      <w:r>
+        <w:t>(</w:t>
+      </w:r>
+      <w:proofErr w:type="gramEnd"/>
+      <w:r>
+        <w:t>20),</w:t>
+      </w:r>
+    </w:p>
+    <w:p>
+      <w:pPr>
+        <w:tabs>
+          <w:tab w:val="left" w:pos="1404"/>
+        </w:tabs>
+      </w:pPr>
+      <w:r>
+        <w:t xml:space="preserve">    voto </w:t>
+      </w:r>
+      <w:proofErr w:type="spellStart"/>
+      <w:proofErr w:type="gramStart"/>
+      <w:r>
+        <w:t>decimal</w:t>
+      </w:r>
+      <w:proofErr w:type="spellEnd"/>
+      <w:r>
+        <w:t>(</w:t>
+      </w:r>
+      <w:proofErr w:type="gramEnd"/>
+      <w:r>
+        <w:t>3,2),</w:t>
+      </w:r>
+    </w:p>
+    <w:p>
+      <w:pPr>
+        <w:tabs>
+          <w:tab w:val="left" w:pos="1404"/>
+        </w:tabs>
+      </w:pPr>
+      <w:r>
+        <w:t xml:space="preserve">    Descrizione </w:t>
+      </w:r>
+      <w:proofErr w:type="spellStart"/>
+      <w:proofErr w:type="gramStart"/>
+      <w:r>
+        <w:t>varchar</w:t>
+      </w:r>
+      <w:proofErr w:type="spellEnd"/>
+      <w:r>
+        <w:t>(</w:t>
+      </w:r>
+      <w:proofErr w:type="gramEnd"/>
+      <w:r>
+        <w:t>200),</w:t>
+      </w:r>
+    </w:p>
+    <w:p>
+      <w:pPr>
+        <w:tabs>
+          <w:tab w:val="left" w:pos="1404"/>
+        </w:tabs>
+      </w:pPr>
+      <w:r>
+        <w:t xml:space="preserve">    </w:t>
+      </w:r>
+      <w:proofErr w:type="spellStart"/>
+      <w:r>
+        <w:t>Primary</w:t>
+      </w:r>
+      <w:proofErr w:type="spellEnd"/>
+      <w:r>
+        <w:t xml:space="preserve"> </w:t>
+      </w:r>
+      <w:proofErr w:type="gramStart"/>
+      <w:r>
+        <w:t>key(</w:t>
+      </w:r>
+      <w:proofErr w:type="spellStart"/>
+      <w:proofErr w:type="gramEnd"/>
+      <w:r>
+        <w:t>ID_Recensione</w:t>
+      </w:r>
+      <w:proofErr w:type="spellEnd"/>
+      <w:r>
+        <w:t>),</w:t>
+      </w:r>
+    </w:p>
+    <w:p>
+      <w:pPr>
+        <w:tabs>
+          <w:tab w:val="left" w:pos="1404"/>
+        </w:tabs>
+      </w:pPr>
+      <w:r>
+        <w:t xml:space="preserve">    </w:t>
+      </w:r>
+      <w:proofErr w:type="spellStart"/>
+      <w:r>
+        <w:t>foreign</w:t>
+      </w:r>
+      <w:proofErr w:type="spellEnd"/>
+      <w:r>
+        <w:t xml:space="preserve"> key </w:t>
+      </w:r>
+      <w:proofErr w:type="gramStart"/>
+      <w:r>
+        <w:t>Recensione(</w:t>
+      </w:r>
+      <w:proofErr w:type="spellStart"/>
+      <w:proofErr w:type="gramEnd"/>
+      <w:r>
+        <w:t>CLiente</w:t>
+      </w:r>
+      <w:proofErr w:type="spellEnd"/>
+      <w:r>
+        <w:t xml:space="preserve">) </w:t>
+      </w:r>
+      <w:proofErr w:type="spellStart"/>
+      <w:r>
+        <w:t>references</w:t>
+      </w:r>
+      <w:proofErr w:type="spellEnd"/>
+      <w:r>
+        <w:t xml:space="preserve"> Cliente(</w:t>
+      </w:r>
+      <w:proofErr w:type="spellStart"/>
+      <w:r>
+        <w:t>Codice_fiscale</w:t>
+      </w:r>
+      <w:proofErr w:type="spellEnd"/>
+      <w:r>
+        <w:t>)</w:t>
+      </w:r>
+    </w:p>
+    <w:p>
+      <w:pPr>
+        <w:tabs>
+          <w:tab w:val="left" w:pos="1404"/>
+        </w:tabs>
+      </w:pPr>
+      <w:r>
+        <w:t xml:space="preserve">    )</w:t>
+      </w:r>
+    </w:p>
+    <w:p>
+      <w:pPr>
+        <w:tabs>
+          <w:tab w:val="left" w:pos="1404"/>
+        </w:tabs>
+      </w:pPr>
+    </w:p>
+    <w:p>
+      <w:pPr>
+        <w:tabs>
+          <w:tab w:val="left" w:pos="1404"/>
+        </w:tabs>
+      </w:pPr>
+      <w:r>
+        <w:t xml:space="preserve">create </w:t>
+      </w:r>
+      <w:proofErr w:type="spellStart"/>
+      <w:r>
+        <w:t>table</w:t>
+      </w:r>
+      <w:proofErr w:type="spellEnd"/>
+      <w:r>
+        <w:t xml:space="preserve"> </w:t>
+      </w:r>
+      <w:proofErr w:type="spellStart"/>
+      <w:r>
+        <w:t>if</w:t>
+      </w:r>
+      <w:proofErr w:type="spellEnd"/>
+      <w:r>
+        <w:t xml:space="preserve"> </w:t>
+      </w:r>
+      <w:proofErr w:type="spellStart"/>
+      <w:r>
+        <w:t>not</w:t>
+      </w:r>
+      <w:proofErr w:type="spellEnd"/>
+      <w:r>
+        <w:t xml:space="preserve"> </w:t>
+      </w:r>
+      <w:proofErr w:type="spellStart"/>
+      <w:r>
+        <w:t>exists</w:t>
+      </w:r>
+      <w:proofErr w:type="spellEnd"/>
+      <w:r>
+        <w:t xml:space="preserve"> </w:t>
+      </w:r>
+      <w:proofErr w:type="gramStart"/>
+      <w:r>
+        <w:t>Merchandise(</w:t>
+      </w:r>
+      <w:proofErr w:type="gramEnd"/>
+    </w:p>
+    <w:p>
+      <w:pPr>
+        <w:tabs>
+          <w:tab w:val="left" w:pos="1404"/>
+        </w:tabs>
+      </w:pPr>
+      <w:r>
+        <w:tab/>
+      </w:r>
+      <w:proofErr w:type="spellStart"/>
+      <w:r>
+        <w:t>ID_Prodotto</w:t>
+      </w:r>
+      <w:proofErr w:type="spellEnd"/>
+      <w:r>
+        <w:t xml:space="preserve"> </w:t>
+      </w:r>
+      <w:proofErr w:type="spellStart"/>
+      <w:r>
+        <w:t>int</w:t>
+      </w:r>
+      <w:proofErr w:type="spellEnd"/>
+      <w:r>
+        <w:t>,</w:t>
+      </w:r>
+    </w:p>
+    <w:p>
+      <w:pPr>
+        <w:tabs>
+          <w:tab w:val="left" w:pos="1404"/>
+        </w:tabs>
+      </w:pPr>
+      <w:r>
+        <w:t xml:space="preserve">    nome </w:t>
+      </w:r>
+      <w:proofErr w:type="spellStart"/>
+      <w:proofErr w:type="gramStart"/>
+      <w:r>
+        <w:t>varchar</w:t>
+      </w:r>
+      <w:proofErr w:type="spellEnd"/>
+      <w:r>
+        <w:t>(</w:t>
+      </w:r>
+      <w:proofErr w:type="gramEnd"/>
+      <w:r>
+        <w:t>30),</w:t>
+      </w:r>
+    </w:p>
+    <w:p>
+      <w:pPr>
+        <w:tabs>
+          <w:tab w:val="left" w:pos="1404"/>
+        </w:tabs>
+      </w:pPr>
+      <w:r>
+        <w:t xml:space="preserve">    dimensione </w:t>
+      </w:r>
+      <w:proofErr w:type="spellStart"/>
+      <w:proofErr w:type="gramStart"/>
+      <w:r>
+        <w:t>decimal</w:t>
+      </w:r>
+      <w:proofErr w:type="spellEnd"/>
+      <w:r>
+        <w:t>(</w:t>
+      </w:r>
+      <w:proofErr w:type="gramEnd"/>
+      <w:r>
+        <w:t>5,2),</w:t>
+      </w:r>
+    </w:p>
+    <w:p>
+      <w:pPr>
+        <w:tabs>
+          <w:tab w:val="left" w:pos="1404"/>
+        </w:tabs>
+      </w:pPr>
+      <w:r>
+        <w:t xml:space="preserve">    tipo </w:t>
+      </w:r>
+      <w:proofErr w:type="spellStart"/>
+      <w:proofErr w:type="gramStart"/>
+      <w:r>
+        <w:t>varchar</w:t>
+      </w:r>
+      <w:proofErr w:type="spellEnd"/>
+      <w:r>
+        <w:t>(</w:t>
+      </w:r>
+      <w:proofErr w:type="gramEnd"/>
+      <w:r>
+        <w:t>20),</w:t>
+      </w:r>
+    </w:p>
+    <w:p>
+      <w:pPr>
+        <w:tabs>
+          <w:tab w:val="left" w:pos="1404"/>
+        </w:tabs>
+      </w:pPr>
+      <w:r>
+        <w:t xml:space="preserve">    prezzo </w:t>
+      </w:r>
+      <w:proofErr w:type="spellStart"/>
+      <w:proofErr w:type="gramStart"/>
+      <w:r>
+        <w:t>decimal</w:t>
+      </w:r>
+      <w:proofErr w:type="spellEnd"/>
+      <w:r>
+        <w:t>(</w:t>
+      </w:r>
+      <w:proofErr w:type="gramEnd"/>
+      <w:r>
+        <w:t>4,2),</w:t>
+      </w:r>
+    </w:p>
+    <w:p>
+      <w:pPr>
+        <w:tabs>
+          <w:tab w:val="left" w:pos="1404"/>
+        </w:tabs>
+      </w:pPr>
+      <w:r>
+        <w:t xml:space="preserve">    peso </w:t>
+      </w:r>
+      <w:proofErr w:type="spellStart"/>
+      <w:proofErr w:type="gramStart"/>
+      <w:r>
+        <w:t>decimal</w:t>
+      </w:r>
+      <w:proofErr w:type="spellEnd"/>
+      <w:r>
+        <w:t>(</w:t>
+      </w:r>
+      <w:proofErr w:type="gramEnd"/>
+      <w:r>
+        <w:t>3,2),</w:t>
+      </w:r>
+    </w:p>
+    <w:p>
+      <w:pPr>
+        <w:tabs>
+          <w:tab w:val="left" w:pos="1404"/>
+        </w:tabs>
+      </w:pPr>
+      <w:r>
+        <w:t xml:space="preserve">    </w:t>
+      </w:r>
+      <w:proofErr w:type="spellStart"/>
+      <w:r>
+        <w:t>Primary</w:t>
+      </w:r>
+      <w:proofErr w:type="spellEnd"/>
+      <w:r>
+        <w:t xml:space="preserve"> </w:t>
+      </w:r>
+      <w:proofErr w:type="gramStart"/>
+      <w:r>
+        <w:t>key(</w:t>
+      </w:r>
+      <w:proofErr w:type="spellStart"/>
+      <w:proofErr w:type="gramEnd"/>
+      <w:r>
+        <w:t>ID_Prodotto</w:t>
+      </w:r>
+      <w:proofErr w:type="spellEnd"/>
+      <w:r>
+        <w:t>)</w:t>
+      </w:r>
+    </w:p>
+    <w:p>
+      <w:pPr>
+        <w:tabs>
+          <w:tab w:val="left" w:pos="1404"/>
+        </w:tabs>
+      </w:pPr>
+      <w:r>
+        <w:t xml:space="preserve">    )</w:t>
+      </w:r>
+    </w:p>
+    <w:p>
+      <w:pPr>
+        <w:tabs>
+          <w:tab w:val="left" w:pos="1404"/>
+        </w:tabs>
+      </w:pPr>
+      <w:r>
+        <w:lastRenderedPageBreak/>
+        <w:t xml:space="preserve">create </w:t>
+      </w:r>
+      <w:proofErr w:type="spellStart"/>
+      <w:r>
+        <w:t>table</w:t>
+      </w:r>
+      <w:proofErr w:type="spellEnd"/>
+      <w:r>
+        <w:t xml:space="preserve"> </w:t>
+      </w:r>
+      <w:proofErr w:type="spellStart"/>
+      <w:r>
+        <w:t>if</w:t>
+      </w:r>
+      <w:proofErr w:type="spellEnd"/>
+      <w:r>
+        <w:t xml:space="preserve"> </w:t>
+      </w:r>
+      <w:proofErr w:type="spellStart"/>
+      <w:r>
+        <w:t>not</w:t>
+      </w:r>
+      <w:proofErr w:type="spellEnd"/>
+      <w:r>
+        <w:t xml:space="preserve"> </w:t>
+      </w:r>
+      <w:proofErr w:type="spellStart"/>
+      <w:r>
+        <w:t>exists</w:t>
+      </w:r>
+      <w:proofErr w:type="spellEnd"/>
+      <w:r>
+        <w:t xml:space="preserve"> </w:t>
+      </w:r>
+      <w:proofErr w:type="spellStart"/>
+      <w:r>
+        <w:t>Valutare_</w:t>
+      </w:r>
+      <w:proofErr w:type="gramStart"/>
+      <w:r>
+        <w:t>Videogioco</w:t>
+      </w:r>
+      <w:proofErr w:type="spellEnd"/>
+      <w:r>
+        <w:t>(</w:t>
+      </w:r>
+      <w:proofErr w:type="gramEnd"/>
+    </w:p>
+    <w:p>
+      <w:pPr>
+        <w:tabs>
+          <w:tab w:val="left" w:pos="1404"/>
+        </w:tabs>
+      </w:pPr>
+      <w:r>
+        <w:tab/>
+        <w:t xml:space="preserve">videogioco </w:t>
+      </w:r>
+      <w:proofErr w:type="spellStart"/>
+      <w:r>
+        <w:t>int</w:t>
+      </w:r>
+      <w:proofErr w:type="spellEnd"/>
+      <w:r>
+        <w:t xml:space="preserve"> </w:t>
+      </w:r>
+      <w:proofErr w:type="spellStart"/>
+      <w:r>
+        <w:t>references</w:t>
+      </w:r>
+      <w:proofErr w:type="spellEnd"/>
+      <w:r>
+        <w:t xml:space="preserve"> </w:t>
+      </w:r>
+      <w:proofErr w:type="gramStart"/>
+      <w:r>
+        <w:t>videogioco(</w:t>
+      </w:r>
+      <w:proofErr w:type="spellStart"/>
+      <w:proofErr w:type="gramEnd"/>
+      <w:r>
+        <w:t>ID_Prodotto</w:t>
+      </w:r>
+      <w:proofErr w:type="spellEnd"/>
+      <w:r>
+        <w:t>),</w:t>
+      </w:r>
+    </w:p>
+    <w:p>
+      <w:pPr>
+        <w:tabs>
+          <w:tab w:val="left" w:pos="1404"/>
+        </w:tabs>
+      </w:pPr>
+      <w:r>
+        <w:t xml:space="preserve">    recensione </w:t>
+      </w:r>
+      <w:proofErr w:type="spellStart"/>
+      <w:r>
+        <w:t>int</w:t>
+      </w:r>
+      <w:proofErr w:type="spellEnd"/>
+      <w:r>
+        <w:t xml:space="preserve"> </w:t>
+      </w:r>
+      <w:proofErr w:type="spellStart"/>
+      <w:r>
+        <w:t>references</w:t>
+      </w:r>
+      <w:proofErr w:type="spellEnd"/>
+      <w:r>
+        <w:t xml:space="preserve"> </w:t>
+      </w:r>
+      <w:proofErr w:type="gramStart"/>
+      <w:r>
+        <w:t>recensione(</w:t>
+      </w:r>
+      <w:proofErr w:type="spellStart"/>
+      <w:proofErr w:type="gramEnd"/>
+      <w:r>
+        <w:t>ID_Recensione</w:t>
+      </w:r>
+      <w:proofErr w:type="spellEnd"/>
+      <w:r>
+        <w:t>),</w:t>
+      </w:r>
+    </w:p>
+    <w:p>
+      <w:pPr>
+        <w:tabs>
+          <w:tab w:val="left" w:pos="1404"/>
+        </w:tabs>
+      </w:pPr>
+      <w:r>
+        <w:t xml:space="preserve">    cliente </w:t>
+      </w:r>
+      <w:proofErr w:type="spellStart"/>
+      <w:proofErr w:type="gramStart"/>
+      <w:r>
+        <w:t>varchar</w:t>
+      </w:r>
+      <w:proofErr w:type="spellEnd"/>
+      <w:r>
+        <w:t>(</w:t>
+      </w:r>
+      <w:proofErr w:type="gramEnd"/>
+      <w:r>
+        <w:t xml:space="preserve">20) </w:t>
+      </w:r>
+      <w:proofErr w:type="spellStart"/>
+      <w:r>
+        <w:t>references</w:t>
+      </w:r>
+      <w:proofErr w:type="spellEnd"/>
+      <w:r>
+        <w:t xml:space="preserve"> cliente(</w:t>
+      </w:r>
+      <w:proofErr w:type="spellStart"/>
+      <w:r>
+        <w:t>Codice_fiscale</w:t>
+      </w:r>
+      <w:proofErr w:type="spellEnd"/>
+      <w:r>
+        <w:t>),</w:t>
+      </w:r>
+    </w:p>
+    <w:p>
+      <w:pPr>
+        <w:tabs>
+          <w:tab w:val="left" w:pos="1404"/>
+        </w:tabs>
+      </w:pPr>
+      <w:r>
+        <w:t xml:space="preserve">    </w:t>
+      </w:r>
+      <w:proofErr w:type="spellStart"/>
+      <w:r>
+        <w:t>primary</w:t>
+      </w:r>
+      <w:proofErr w:type="spellEnd"/>
+      <w:r>
+        <w:t xml:space="preserve"> key(</w:t>
+      </w:r>
+      <w:proofErr w:type="spellStart"/>
+      <w:proofErr w:type="gramStart"/>
+      <w:r>
+        <w:t>videogioco,recensione</w:t>
+      </w:r>
+      <w:proofErr w:type="gramEnd"/>
+      <w:r>
+        <w:t>,cliente</w:t>
+      </w:r>
+      <w:proofErr w:type="spellEnd"/>
+      <w:r>
+        <w:t>)</w:t>
+      </w:r>
+    </w:p>
+    <w:p>
+      <w:pPr>
+        <w:tabs>
+          <w:tab w:val="left" w:pos="1404"/>
+        </w:tabs>
+      </w:pPr>
+      <w:r>
+        <w:t>)</w:t>
+      </w:r>
+    </w:p>
+    <w:p>
+      <w:pPr>
+        <w:tabs>
+          <w:tab w:val="left" w:pos="1404"/>
+        </w:tabs>
+      </w:pPr>
+    </w:p>
+    <w:p>
+      <w:pPr>
+        <w:tabs>
+          <w:tab w:val="left" w:pos="1404"/>
+        </w:tabs>
+      </w:pPr>
+      <w:r>
+        <w:t xml:space="preserve">create </w:t>
+      </w:r>
+      <w:proofErr w:type="spellStart"/>
+      <w:r>
+        <w:t>table</w:t>
+      </w:r>
+      <w:proofErr w:type="spellEnd"/>
+      <w:r>
+        <w:t xml:space="preserve"> </w:t>
+      </w:r>
+      <w:proofErr w:type="spellStart"/>
+      <w:r>
+        <w:t>if</w:t>
+      </w:r>
+      <w:proofErr w:type="spellEnd"/>
+      <w:r>
+        <w:t xml:space="preserve"> </w:t>
+      </w:r>
+      <w:proofErr w:type="spellStart"/>
+      <w:r>
+        <w:t>not</w:t>
+      </w:r>
+      <w:proofErr w:type="spellEnd"/>
+      <w:r>
+        <w:t xml:space="preserve"> </w:t>
+      </w:r>
+      <w:proofErr w:type="spellStart"/>
+      <w:r>
+        <w:t>exists</w:t>
+      </w:r>
+      <w:proofErr w:type="spellEnd"/>
+      <w:r>
+        <w:t xml:space="preserve"> </w:t>
+      </w:r>
+      <w:proofErr w:type="spellStart"/>
+      <w:r>
+        <w:t>Valutare_</w:t>
+      </w:r>
+      <w:proofErr w:type="gramStart"/>
+      <w:r>
+        <w:t>Merchandise</w:t>
+      </w:r>
+      <w:proofErr w:type="spellEnd"/>
+      <w:r>
+        <w:t>(</w:t>
+      </w:r>
+      <w:proofErr w:type="gramEnd"/>
+    </w:p>
+    <w:p>
+      <w:pPr>
+        <w:tabs>
+          <w:tab w:val="left" w:pos="1404"/>
+        </w:tabs>
+      </w:pPr>
+      <w:r>
+        <w:tab/>
+        <w:t xml:space="preserve">Merchandise </w:t>
+      </w:r>
+      <w:proofErr w:type="spellStart"/>
+      <w:r>
+        <w:t>int</w:t>
+      </w:r>
+      <w:proofErr w:type="spellEnd"/>
+      <w:r>
+        <w:t xml:space="preserve"> </w:t>
+      </w:r>
+      <w:proofErr w:type="spellStart"/>
+      <w:r>
+        <w:t>references</w:t>
+      </w:r>
+      <w:proofErr w:type="spellEnd"/>
+      <w:r>
+        <w:t xml:space="preserve"> </w:t>
+      </w:r>
+      <w:proofErr w:type="gramStart"/>
+      <w:r>
+        <w:t>Merchandise(</w:t>
+      </w:r>
+      <w:proofErr w:type="spellStart"/>
+      <w:proofErr w:type="gramEnd"/>
+      <w:r>
+        <w:t>ID_Prodotto</w:t>
+      </w:r>
+      <w:proofErr w:type="spellEnd"/>
+      <w:r>
+        <w:t>),</w:t>
+      </w:r>
+    </w:p>
+    <w:p>
+      <w:pPr>
+        <w:tabs>
+          <w:tab w:val="left" w:pos="1404"/>
+        </w:tabs>
+      </w:pPr>
+      <w:r>
+        <w:t xml:space="preserve">    Recensione </w:t>
+      </w:r>
+      <w:proofErr w:type="spellStart"/>
+      <w:r>
+        <w:t>int</w:t>
+      </w:r>
+      <w:proofErr w:type="spellEnd"/>
+      <w:r>
+        <w:t xml:space="preserve"> </w:t>
+      </w:r>
+      <w:proofErr w:type="spellStart"/>
+      <w:r>
+        <w:t>references</w:t>
+      </w:r>
+      <w:proofErr w:type="spellEnd"/>
+      <w:r>
+        <w:t xml:space="preserve"> </w:t>
+      </w:r>
+      <w:proofErr w:type="gramStart"/>
+      <w:r>
+        <w:t>Recensione(</w:t>
+      </w:r>
+      <w:proofErr w:type="spellStart"/>
+      <w:proofErr w:type="gramEnd"/>
+      <w:r>
+        <w:t>ID_Recensione</w:t>
+      </w:r>
+      <w:proofErr w:type="spellEnd"/>
+      <w:r>
+        <w:t>),</w:t>
+      </w:r>
+    </w:p>
+    <w:p>
+      <w:pPr>
+        <w:tabs>
+          <w:tab w:val="left" w:pos="1404"/>
+        </w:tabs>
+      </w:pPr>
+      <w:r>
+        <w:t xml:space="preserve">    Cliente </w:t>
+      </w:r>
+      <w:proofErr w:type="spellStart"/>
+      <w:proofErr w:type="gramStart"/>
+      <w:r>
+        <w:t>varchar</w:t>
+      </w:r>
+      <w:proofErr w:type="spellEnd"/>
+      <w:r>
+        <w:t>(</w:t>
+      </w:r>
+      <w:proofErr w:type="gramEnd"/>
+      <w:r>
+        <w:t xml:space="preserve">20) </w:t>
+      </w:r>
+      <w:proofErr w:type="spellStart"/>
+      <w:r>
+        <w:t>references</w:t>
+      </w:r>
+      <w:proofErr w:type="spellEnd"/>
+      <w:r>
+        <w:t xml:space="preserve"> Cliente(</w:t>
+      </w:r>
+      <w:proofErr w:type="spellStart"/>
+      <w:r>
+        <w:t>Codice_fiscale</w:t>
+      </w:r>
+      <w:proofErr w:type="spellEnd"/>
+      <w:r>
+        <w:t>),</w:t>
+      </w:r>
+    </w:p>
+    <w:p>
+      <w:pPr>
+        <w:tabs>
+          <w:tab w:val="left" w:pos="1404"/>
+        </w:tabs>
+      </w:pPr>
+      <w:r>
+        <w:t xml:space="preserve">    </w:t>
+      </w:r>
+      <w:proofErr w:type="spellStart"/>
+      <w:r>
+        <w:t>primary</w:t>
+      </w:r>
+      <w:proofErr w:type="spellEnd"/>
+      <w:r>
+        <w:t xml:space="preserve"> </w:t>
+      </w:r>
+      <w:proofErr w:type="gramStart"/>
+      <w:r>
+        <w:t>key(</w:t>
+      </w:r>
+      <w:proofErr w:type="spellStart"/>
+      <w:proofErr w:type="gramEnd"/>
+      <w:r>
+        <w:t>Merchandise,Recensione,Cliente</w:t>
+      </w:r>
+      <w:proofErr w:type="spellEnd"/>
+      <w:r>
+        <w:t>)</w:t>
+      </w:r>
+    </w:p>
+    <w:p>
+      <w:pPr>
+        <w:tabs>
+          <w:tab w:val="left" w:pos="1404"/>
+        </w:tabs>
+      </w:pPr>
+      <w:r>
+        <w:t>)</w:t>
+      </w:r>
+    </w:p>
+    <w:p>
+      <w:pPr>
+        <w:tabs>
+          <w:tab w:val="left" w:pos="1404"/>
+        </w:tabs>
+      </w:pPr>
+    </w:p>
+    <w:p>
+      <w:pPr>
+        <w:tabs>
+          <w:tab w:val="left" w:pos="1404"/>
+        </w:tabs>
+      </w:pPr>
+      <w:r>
+        <w:t xml:space="preserve">create </w:t>
+      </w:r>
+      <w:proofErr w:type="spellStart"/>
+      <w:r>
+        <w:t>table</w:t>
+      </w:r>
+      <w:proofErr w:type="spellEnd"/>
+      <w:r>
+        <w:t xml:space="preserve"> </w:t>
+      </w:r>
+      <w:proofErr w:type="spellStart"/>
+      <w:r>
+        <w:t>if</w:t>
+      </w:r>
+      <w:proofErr w:type="spellEnd"/>
+      <w:r>
+        <w:t xml:space="preserve"> </w:t>
+      </w:r>
+      <w:proofErr w:type="spellStart"/>
+      <w:r>
+        <w:t>not</w:t>
+      </w:r>
+      <w:proofErr w:type="spellEnd"/>
+      <w:r>
+        <w:t xml:space="preserve"> </w:t>
+      </w:r>
+      <w:proofErr w:type="spellStart"/>
+      <w:r>
+        <w:t>exists</w:t>
+      </w:r>
+      <w:proofErr w:type="spellEnd"/>
+      <w:r>
+        <w:t xml:space="preserve"> </w:t>
+      </w:r>
+      <w:proofErr w:type="spellStart"/>
+      <w:r>
+        <w:t>Casella_</w:t>
+      </w:r>
+      <w:proofErr w:type="gramStart"/>
+      <w:r>
+        <w:t>postale</w:t>
+      </w:r>
+      <w:proofErr w:type="spellEnd"/>
+      <w:r>
+        <w:t>(</w:t>
+      </w:r>
+      <w:proofErr w:type="gramEnd"/>
+    </w:p>
+    <w:p>
+      <w:pPr>
+        <w:tabs>
+          <w:tab w:val="left" w:pos="1404"/>
+        </w:tabs>
+      </w:pPr>
+      <w:proofErr w:type="spellStart"/>
+      <w:r>
+        <w:t>e_mail</w:t>
+      </w:r>
+      <w:proofErr w:type="spellEnd"/>
+      <w:r>
+        <w:t xml:space="preserve"> </w:t>
+      </w:r>
+      <w:proofErr w:type="spellStart"/>
+      <w:proofErr w:type="gramStart"/>
+      <w:r>
+        <w:t>varchar</w:t>
+      </w:r>
+      <w:proofErr w:type="spellEnd"/>
+      <w:r>
+        <w:t>(</w:t>
+      </w:r>
+      <w:proofErr w:type="gramEnd"/>
+      <w:r>
+        <w:t>40),</w:t>
+      </w:r>
+    </w:p>
+    <w:p>
+      <w:pPr>
+        <w:tabs>
+          <w:tab w:val="left" w:pos="1404"/>
+        </w:tabs>
+      </w:pPr>
+      <w:r>
+        <w:t xml:space="preserve">cliente </w:t>
+      </w:r>
+      <w:proofErr w:type="spellStart"/>
+      <w:proofErr w:type="gramStart"/>
+      <w:r>
+        <w:t>varchar</w:t>
+      </w:r>
+      <w:proofErr w:type="spellEnd"/>
+      <w:r>
+        <w:t>(</w:t>
+      </w:r>
+      <w:proofErr w:type="gramEnd"/>
+      <w:r>
+        <w:t xml:space="preserve">20) </w:t>
+      </w:r>
+      <w:proofErr w:type="spellStart"/>
+      <w:r>
+        <w:t>references</w:t>
+      </w:r>
+      <w:proofErr w:type="spellEnd"/>
+      <w:r>
+        <w:t xml:space="preserve"> cliente(</w:t>
+      </w:r>
+      <w:proofErr w:type="spellStart"/>
+      <w:r>
+        <w:t>Codice_fiscale</w:t>
+      </w:r>
+      <w:proofErr w:type="spellEnd"/>
+      <w:r>
+        <w:t>),</w:t>
+      </w:r>
+    </w:p>
+    <w:p>
+      <w:pPr>
+        <w:tabs>
+          <w:tab w:val="left" w:pos="1404"/>
+        </w:tabs>
+      </w:pPr>
+      <w:proofErr w:type="spellStart"/>
+      <w:r>
+        <w:t>primary</w:t>
+      </w:r>
+      <w:proofErr w:type="spellEnd"/>
+      <w:r>
+        <w:t xml:space="preserve"> key(</w:t>
+      </w:r>
+      <w:proofErr w:type="spellStart"/>
+      <w:r>
+        <w:t>e_mail</w:t>
+      </w:r>
+      <w:proofErr w:type="spellEnd"/>
+      <w:r>
+        <w:t>)</w:t>
+      </w:r>
+    </w:p>
+    <w:p>
+      <w:pPr>
+        <w:tabs>
+          <w:tab w:val="left" w:pos="1404"/>
+        </w:tabs>
+      </w:pPr>
+      <w:r>
+        <w:t>)</w:t>
+      </w:r>
+    </w:p>
+    <w:p>
+      <w:pPr>
+        <w:tabs>
+          <w:tab w:val="left" w:pos="1404"/>
+        </w:tabs>
       </w:pPr>
     </w:p>
     <w:p>
@@ -5717,7 +7479,7 @@
 </file>
 
 <file path=word/styles.xml><?xml version="1.0" encoding="utf-8"?>
-<w:styles xmlns:mc="http://schemas.openxmlformats.org/markup-compatibility/2006" xmlns:r="http://schemas.openxmlformats.org/officeDocument/2006/relationships" xmlns:w="http://schemas.openxmlformats.org/wordprocessingml/2006/main" xmlns:w14="http://schemas.microsoft.com/office/word/2010/wordml" xmlns:w15="http://schemas.microsoft.com/office/word/2012/wordml" xmlns:w16cex="http://schemas.microsoft.com/office/word/2018/wordml/cex" xmlns:w16cid="http://schemas.microsoft.com/office/word/2016/wordml/cid" xmlns:w16="http://schemas.microsoft.com/office/word/2018/wordml" xmlns:w16sdtdh="http://schemas.microsoft.com/office/word/2020/wordml/sdtdatahash" xmlns:w16se="http://schemas.microsoft.com/office/word/2015/wordml/symex" mc:Ignorable="w14 w15 w16se w16cid w16 w16cex w16sdtdh">
+<w:styles xmlns:mc="http://schemas.openxmlformats.org/markup-compatibility/2006" xmlns:r="http://schemas.openxmlformats.org/officeDocument/2006/relationships" xmlns:w="http://schemas.openxmlformats.org/wordprocessingml/2006/main" xmlns:w14="http://schemas.microsoft.com/office/word/2010/wordml" xmlns:w15="http://schemas.microsoft.com/office/word/2012/wordml" xmlns:w16cex="http://schemas.microsoft.com/office/word/2018/wordml/cex" xmlns:w16cid="http://schemas.microsoft.com/office/word/2016/wordml/cid" xmlns:w16="http://schemas.microsoft.com/office/word/2018/wordml" xmlns:w16du="http://schemas.microsoft.com/office/word/2023/wordml/word16du" xmlns:w16sdtdh="http://schemas.microsoft.com/office/word/2020/wordml/sdtdatahash" xmlns:w16sdtfl="http://schemas.microsoft.com/office/word/2024/wordml/sdtformatlock" xmlns:w16se="http://schemas.microsoft.com/office/word/2015/wordml/symex" mc:Ignorable="w14 w15 w16se w16cid w16 w16cex w16sdtdh w16sdtfl w16du">
   <w:docDefaults>
     <w:rPrDefault>
       <w:rPr>
@@ -6320,6 +8082,7 @@
   <w:style w:type="character" w:default="1" w:styleId="Carpredefinitoparagrafo">
     <w:name w:val="Default Paragraph Font"/>
     <w:uiPriority w:val="1"/>
+    <w:semiHidden/>
     <w:unhideWhenUsed/>
   </w:style>
   <w:style w:type="table" w:default="1" w:styleId="Tabellanormale">

</xml_diff>